<commit_message>
Updates to Status Report and Time Sheet * time sheet updated * status report written and uploaded for weeek 02/16 - 02/20
</commit_message>
<xml_diff>
--- a/Documentation/Records and Status Reports/Time Sheet.docx
+++ b/Documentation/Records and Status Reports/Time Sheet.docx
@@ -432,13 +432,7 @@
               <w:rPr>
                 <w:rFonts w:ascii="Times New Roman" w:hAnsi="Times New Roman" w:cs="Times New Roman"/>
               </w:rPr>
-              <w:t xml:space="preserve">30 mins creating database ERD </w:t>
-            </w:r>
-            <w:r>
-              <w:rPr>
-                <w:rFonts w:ascii="Times New Roman" w:hAnsi="Times New Roman" w:cs="Times New Roman"/>
-              </w:rPr>
-              <w:t>(02/17)</w:t>
+              <w:t>30 mins creating database ERD (02/17)</w:t>
             </w:r>
           </w:p>
           <w:p>
@@ -457,13 +451,7 @@
               <w:rPr>
                 <w:rFonts w:ascii="Times New Roman" w:hAnsi="Times New Roman" w:cs="Times New Roman"/>
               </w:rPr>
-              <w:t xml:space="preserve">1.2 hour in-class, team meeting </w:t>
-            </w:r>
-            <w:r>
-              <w:rPr>
-                <w:rFonts w:ascii="Times New Roman" w:hAnsi="Times New Roman" w:cs="Times New Roman"/>
-              </w:rPr>
-              <w:t>(02/17)</w:t>
+              <w:t>1.2 hour in-class, team meeting (02/17)</w:t>
             </w:r>
           </w:p>
           <w:p>
@@ -514,11 +502,22 @@
           </w:tcPr>
           <w:p>
             <w:pPr>
-              <w:spacing w:line="360" w:lineRule="auto"/>
-              <w:rPr>
-                <w:rFonts w:ascii="Times New Roman" w:hAnsi="Times New Roman" w:cs="Times New Roman"/>
-              </w:rPr>
-            </w:pPr>
+              <w:pStyle w:val="ListParagraph"/>
+              <w:numPr>
+                <w:ilvl w:val="0"/>
+                <w:numId w:val="1"/>
+              </w:numPr>
+              <w:spacing w:line="360" w:lineRule="auto"/>
+              <w:rPr>
+                <w:rFonts w:ascii="Times New Roman" w:hAnsi="Times New Roman" w:cs="Times New Roman"/>
+              </w:rPr>
+            </w:pPr>
+            <w:r>
+              <w:rPr>
+                <w:rFonts w:ascii="Times New Roman" w:hAnsi="Times New Roman" w:cs="Times New Roman"/>
+              </w:rPr>
+              <w:t>1 hour completing status report for week 02/16 to 02/20 (02/26)</w:t>
+            </w:r>
           </w:p>
         </w:tc>
       </w:tr>
@@ -2449,19 +2448,7 @@
           <w:rPr>
             <w:rFonts w:ascii="Times New Roman" w:hAnsi="Times New Roman" w:cs="Times New Roman"/>
           </w:rPr>
-          <w:t xml:space="preserve">Time Sheet for Team DS </w:t>
-        </w:r>
-        <w:r>
-          <w:rPr>
-            <w:rFonts w:ascii="Times New Roman" w:hAnsi="Times New Roman" w:cs="Times New Roman"/>
-          </w:rPr>
-          <w:t xml:space="preserve">– </w:t>
-        </w:r>
-        <w:r>
-          <w:rPr>
-            <w:rFonts w:ascii="Times New Roman" w:hAnsi="Times New Roman" w:cs="Times New Roman"/>
-          </w:rPr>
-          <w:t>1</w:t>
+          <w:t>Time Sheet for Team DS – 1</w:t>
         </w:r>
       </w:p>
     </w:sdtContent>

</xml_diff>

<commit_message>
Time Sheet Update * updated to account for members' attendance of meeting on 26 Feb 2026
</commit_message>
<xml_diff>
--- a/Documentation/Records and Status Reports/Time Sheet.docx
+++ b/Documentation/Records and Status Reports/Time Sheet.docx
@@ -57,739 +57,6 @@
           <w:b/>
           <w:bCs/>
         </w:rPr>
-        <w:t>S Davis</w:t>
-      </w:r>
-    </w:p>
-    <w:tbl>
-      <w:tblPr>
-        <w:tblStyle w:val="TableGrid"/>
-        <w:tblW w:w="0" w:type="auto"/>
-        <w:tblLook w:val="04A0" w:firstRow="1" w:lastRow="0" w:firstColumn="1" w:lastColumn="0" w:noHBand="0" w:noVBand="1"/>
-      </w:tblPr>
-      <w:tblGrid>
-        <w:gridCol w:w="1975"/>
-        <w:gridCol w:w="7375"/>
-      </w:tblGrid>
-      <w:tr>
-        <w:tc>
-          <w:tcPr>
-            <w:tcW w:w="1975" w:type="dxa"/>
-            <w:shd w:val="clear" w:color="auto" w:fill="ADADAD" w:themeFill="background2" w:themeFillShade="BF"/>
-          </w:tcPr>
-          <w:p>
-            <w:pPr>
-              <w:spacing w:line="360" w:lineRule="auto"/>
-              <w:jc w:val="center"/>
-              <w:rPr>
-                <w:rFonts w:ascii="Times New Roman" w:hAnsi="Times New Roman" w:cs="Times New Roman"/>
-                <w:b/>
-                <w:bCs/>
-              </w:rPr>
-            </w:pPr>
-            <w:r>
-              <w:rPr>
-                <w:rFonts w:ascii="Times New Roman" w:hAnsi="Times New Roman" w:cs="Times New Roman"/>
-                <w:b/>
-                <w:bCs/>
-              </w:rPr>
-              <w:t>Week</w:t>
-            </w:r>
-          </w:p>
-        </w:tc>
-        <w:tc>
-          <w:tcPr>
-            <w:tcW w:w="7375" w:type="dxa"/>
-            <w:shd w:val="clear" w:color="auto" w:fill="ADADAD" w:themeFill="background2" w:themeFillShade="BF"/>
-          </w:tcPr>
-          <w:p>
-            <w:pPr>
-              <w:spacing w:line="360" w:lineRule="auto"/>
-              <w:jc w:val="center"/>
-              <w:rPr>
-                <w:rFonts w:ascii="Times New Roman" w:hAnsi="Times New Roman" w:cs="Times New Roman"/>
-                <w:b/>
-                <w:bCs/>
-              </w:rPr>
-            </w:pPr>
-            <w:r>
-              <w:rPr>
-                <w:rFonts w:ascii="Times New Roman" w:hAnsi="Times New Roman" w:cs="Times New Roman"/>
-                <w:b/>
-                <w:bCs/>
-              </w:rPr>
-              <w:t>Details</w:t>
-            </w:r>
-          </w:p>
-        </w:tc>
-      </w:tr>
-      <w:tr>
-        <w:tc>
-          <w:tcPr>
-            <w:tcW w:w="1975" w:type="dxa"/>
-          </w:tcPr>
-          <w:p>
-            <w:pPr>
-              <w:spacing w:line="360" w:lineRule="auto"/>
-              <w:jc w:val="center"/>
-              <w:rPr>
-                <w:rFonts w:ascii="Times New Roman" w:hAnsi="Times New Roman" w:cs="Times New Roman"/>
-              </w:rPr>
-            </w:pPr>
-            <w:r>
-              <w:rPr>
-                <w:rFonts w:ascii="Times New Roman" w:hAnsi="Times New Roman" w:cs="Times New Roman"/>
-              </w:rPr>
-              <w:t>02/02 – 02/07</w:t>
-            </w:r>
-          </w:p>
-        </w:tc>
-        <w:tc>
-          <w:tcPr>
-            <w:tcW w:w="7375" w:type="dxa"/>
-          </w:tcPr>
-          <w:p>
-            <w:pPr>
-              <w:pStyle w:val="ListParagraph"/>
-              <w:numPr>
-                <w:ilvl w:val="0"/>
-                <w:numId w:val="1"/>
-              </w:numPr>
-              <w:spacing w:line="360" w:lineRule="auto"/>
-              <w:rPr>
-                <w:rFonts w:ascii="Times New Roman" w:hAnsi="Times New Roman" w:cs="Times New Roman"/>
-              </w:rPr>
-            </w:pPr>
-            <w:r>
-              <w:rPr>
-                <w:rFonts w:ascii="Times New Roman" w:hAnsi="Times New Roman" w:cs="Times New Roman"/>
-              </w:rPr>
-              <w:t>1 hour revi</w:t>
-            </w:r>
-            <w:r>
-              <w:rPr>
-                <w:rFonts w:ascii="Times New Roman" w:hAnsi="Times New Roman" w:cs="Times New Roman"/>
-              </w:rPr>
-              <w:t>ewing Project Plan outline, creating and formatting documents for record keeping, creating and formatting document for Project Plan submission, and creating and organizing GitHub repository (02/02)</w:t>
-            </w:r>
-          </w:p>
-          <w:p>
-            <w:pPr>
-              <w:pStyle w:val="ListParagraph"/>
-              <w:numPr>
-                <w:ilvl w:val="0"/>
-                <w:numId w:val="1"/>
-              </w:numPr>
-              <w:spacing w:line="360" w:lineRule="auto"/>
-              <w:rPr>
-                <w:rFonts w:ascii="Times New Roman" w:hAnsi="Times New Roman" w:cs="Times New Roman"/>
-              </w:rPr>
-            </w:pPr>
-            <w:proofErr w:type="gramStart"/>
-            <w:r>
-              <w:rPr>
-                <w:rFonts w:ascii="Times New Roman" w:hAnsi="Times New Roman" w:cs="Times New Roman"/>
-              </w:rPr>
-              <w:t>2</w:t>
-            </w:r>
-            <w:r>
-              <w:rPr>
-                <w:rFonts w:ascii="Times New Roman" w:hAnsi="Times New Roman" w:cs="Times New Roman"/>
-              </w:rPr>
-              <w:t xml:space="preserve"> </w:t>
-            </w:r>
-            <w:r>
-              <w:rPr>
-                <w:rFonts w:ascii="Times New Roman" w:hAnsi="Times New Roman" w:cs="Times New Roman"/>
-              </w:rPr>
-              <w:t>hour</w:t>
-            </w:r>
-            <w:proofErr w:type="gramEnd"/>
-            <w:r>
-              <w:rPr>
-                <w:rFonts w:ascii="Times New Roman" w:hAnsi="Times New Roman" w:cs="Times New Roman"/>
-              </w:rPr>
-              <w:t xml:space="preserve"> team meeting (02/03)</w:t>
-            </w:r>
-          </w:p>
-          <w:p>
-            <w:pPr>
-              <w:pStyle w:val="ListParagraph"/>
-              <w:numPr>
-                <w:ilvl w:val="0"/>
-                <w:numId w:val="1"/>
-              </w:numPr>
-              <w:spacing w:line="360" w:lineRule="auto"/>
-              <w:rPr>
-                <w:rFonts w:ascii="Times New Roman" w:hAnsi="Times New Roman" w:cs="Times New Roman"/>
-              </w:rPr>
-            </w:pPr>
-            <w:r>
-              <w:rPr>
-                <w:rFonts w:ascii="Times New Roman" w:hAnsi="Times New Roman" w:cs="Times New Roman"/>
-              </w:rPr>
-              <w:t>2.2 hours</w:t>
-            </w:r>
-            <w:r>
-              <w:rPr>
-                <w:rFonts w:ascii="Times New Roman" w:hAnsi="Times New Roman" w:cs="Times New Roman"/>
-              </w:rPr>
-              <w:t xml:space="preserve"> updating resume, listing tasks for Project Plan’s scope, assigning and clarifying team roles, confirming and recording team resources/tools (02/04)</w:t>
-            </w:r>
-          </w:p>
-          <w:p>
-            <w:pPr>
-              <w:pStyle w:val="ListParagraph"/>
-              <w:numPr>
-                <w:ilvl w:val="0"/>
-                <w:numId w:val="1"/>
-              </w:numPr>
-              <w:spacing w:line="360" w:lineRule="auto"/>
-              <w:rPr>
-                <w:rFonts w:ascii="Times New Roman" w:hAnsi="Times New Roman" w:cs="Times New Roman"/>
-              </w:rPr>
-            </w:pPr>
-            <w:r>
-              <w:rPr>
-                <w:rFonts w:ascii="Times New Roman" w:hAnsi="Times New Roman" w:cs="Times New Roman"/>
-              </w:rPr>
-              <w:t>2 hours working on WBS (02/05)</w:t>
-            </w:r>
-          </w:p>
-        </w:tc>
-      </w:tr>
-      <w:tr>
-        <w:tc>
-          <w:tcPr>
-            <w:tcW w:w="1975" w:type="dxa"/>
-          </w:tcPr>
-          <w:p>
-            <w:pPr>
-              <w:spacing w:line="360" w:lineRule="auto"/>
-              <w:jc w:val="center"/>
-              <w:rPr>
-                <w:rFonts w:ascii="Times New Roman" w:hAnsi="Times New Roman" w:cs="Times New Roman"/>
-              </w:rPr>
-            </w:pPr>
-            <w:r>
-              <w:rPr>
-                <w:rFonts w:ascii="Times New Roman" w:hAnsi="Times New Roman" w:cs="Times New Roman"/>
-              </w:rPr>
-              <w:t>02/08 – 02/14</w:t>
-            </w:r>
-          </w:p>
-        </w:tc>
-        <w:tc>
-          <w:tcPr>
-            <w:tcW w:w="7375" w:type="dxa"/>
-          </w:tcPr>
-          <w:p>
-            <w:pPr>
-              <w:pStyle w:val="ListParagraph"/>
-              <w:numPr>
-                <w:ilvl w:val="0"/>
-                <w:numId w:val="1"/>
-              </w:numPr>
-              <w:spacing w:line="360" w:lineRule="auto"/>
-              <w:rPr>
-                <w:rFonts w:ascii="Times New Roman" w:hAnsi="Times New Roman" w:cs="Times New Roman"/>
-              </w:rPr>
-            </w:pPr>
-            <w:r>
-              <w:rPr>
-                <w:rFonts w:ascii="Times New Roman" w:hAnsi="Times New Roman" w:cs="Times New Roman"/>
-              </w:rPr>
-              <w:t>2.2 hours working on the testing section of the Project Plan, updating my resume, and updating meeting notes (02/10)</w:t>
-            </w:r>
-          </w:p>
-          <w:p>
-            <w:pPr>
-              <w:pStyle w:val="ListParagraph"/>
-              <w:numPr>
-                <w:ilvl w:val="0"/>
-                <w:numId w:val="1"/>
-              </w:numPr>
-              <w:spacing w:line="360" w:lineRule="auto"/>
-              <w:rPr>
-                <w:rFonts w:ascii="Times New Roman" w:hAnsi="Times New Roman" w:cs="Times New Roman"/>
-              </w:rPr>
-            </w:pPr>
-            <w:r>
-              <w:rPr>
-                <w:rFonts w:ascii="Times New Roman" w:hAnsi="Times New Roman" w:cs="Times New Roman"/>
-              </w:rPr>
-              <w:t>1.8 hours completing the testing section, continuing work on WBS (02/12)</w:t>
-            </w:r>
-          </w:p>
-        </w:tc>
-      </w:tr>
-      <w:tr>
-        <w:tc>
-          <w:tcPr>
-            <w:tcW w:w="1975" w:type="dxa"/>
-          </w:tcPr>
-          <w:p>
-            <w:pPr>
-              <w:spacing w:line="360" w:lineRule="auto"/>
-              <w:jc w:val="center"/>
-              <w:rPr>
-                <w:rFonts w:ascii="Times New Roman" w:hAnsi="Times New Roman" w:cs="Times New Roman"/>
-              </w:rPr>
-            </w:pPr>
-            <w:r>
-              <w:rPr>
-                <w:rFonts w:ascii="Times New Roman" w:hAnsi="Times New Roman" w:cs="Times New Roman"/>
-              </w:rPr>
-              <w:t>02/16 – 02/21</w:t>
-            </w:r>
-          </w:p>
-        </w:tc>
-        <w:tc>
-          <w:tcPr>
-            <w:tcW w:w="7375" w:type="dxa"/>
-          </w:tcPr>
-          <w:p>
-            <w:pPr>
-              <w:pStyle w:val="ListParagraph"/>
-              <w:numPr>
-                <w:ilvl w:val="0"/>
-                <w:numId w:val="1"/>
-              </w:numPr>
-              <w:spacing w:line="360" w:lineRule="auto"/>
-              <w:rPr>
-                <w:rFonts w:ascii="Times New Roman" w:hAnsi="Times New Roman" w:cs="Times New Roman"/>
-              </w:rPr>
-            </w:pPr>
-            <w:r>
-              <w:rPr>
-                <w:rFonts w:ascii="Times New Roman" w:hAnsi="Times New Roman" w:cs="Times New Roman"/>
-              </w:rPr>
-              <w:t>57 mins organizing GitHub repo and message team about upcoming schedule and others (02/16)</w:t>
-            </w:r>
-          </w:p>
-          <w:p>
-            <w:pPr>
-              <w:pStyle w:val="ListParagraph"/>
-              <w:numPr>
-                <w:ilvl w:val="0"/>
-                <w:numId w:val="1"/>
-              </w:numPr>
-              <w:spacing w:line="360" w:lineRule="auto"/>
-              <w:rPr>
-                <w:rFonts w:ascii="Times New Roman" w:hAnsi="Times New Roman" w:cs="Times New Roman"/>
-              </w:rPr>
-            </w:pPr>
-            <w:r>
-              <w:rPr>
-                <w:rFonts w:ascii="Times New Roman" w:hAnsi="Times New Roman" w:cs="Times New Roman"/>
-              </w:rPr>
-              <w:t>5.2 hours designing architecture of login/sign up module, drafting GUI, assigning staff usernames</w:t>
-            </w:r>
-            <w:r>
-              <w:rPr>
-                <w:rFonts w:ascii="Times New Roman" w:hAnsi="Times New Roman" w:cs="Times New Roman"/>
-              </w:rPr>
-              <w:t xml:space="preserve"> (02/16)</w:t>
-            </w:r>
-          </w:p>
-          <w:p>
-            <w:pPr>
-              <w:pStyle w:val="ListParagraph"/>
-              <w:numPr>
-                <w:ilvl w:val="0"/>
-                <w:numId w:val="1"/>
-              </w:numPr>
-              <w:spacing w:line="360" w:lineRule="auto"/>
-              <w:rPr>
-                <w:rFonts w:ascii="Times New Roman" w:hAnsi="Times New Roman" w:cs="Times New Roman"/>
-              </w:rPr>
-            </w:pPr>
-            <w:r>
-              <w:rPr>
-                <w:rFonts w:ascii="Times New Roman" w:hAnsi="Times New Roman" w:cs="Times New Roman"/>
-              </w:rPr>
-              <w:t>40 mins designing initial schema for database</w:t>
-            </w:r>
-            <w:r>
-              <w:rPr>
-                <w:rFonts w:ascii="Times New Roman" w:hAnsi="Times New Roman" w:cs="Times New Roman"/>
-              </w:rPr>
-              <w:t xml:space="preserve"> (02/17)</w:t>
-            </w:r>
-          </w:p>
-          <w:p>
-            <w:pPr>
-              <w:pStyle w:val="ListParagraph"/>
-              <w:numPr>
-                <w:ilvl w:val="0"/>
-                <w:numId w:val="1"/>
-              </w:numPr>
-              <w:spacing w:line="360" w:lineRule="auto"/>
-              <w:rPr>
-                <w:rFonts w:ascii="Times New Roman" w:hAnsi="Times New Roman" w:cs="Times New Roman"/>
-              </w:rPr>
-            </w:pPr>
-            <w:r>
-              <w:rPr>
-                <w:rFonts w:ascii="Times New Roman" w:hAnsi="Times New Roman" w:cs="Times New Roman"/>
-              </w:rPr>
-              <w:t>30 mins creating database ERD (02/17)</w:t>
-            </w:r>
-          </w:p>
-          <w:p>
-            <w:pPr>
-              <w:pStyle w:val="ListParagraph"/>
-              <w:numPr>
-                <w:ilvl w:val="0"/>
-                <w:numId w:val="1"/>
-              </w:numPr>
-              <w:spacing w:line="360" w:lineRule="auto"/>
-              <w:rPr>
-                <w:rFonts w:ascii="Times New Roman" w:hAnsi="Times New Roman" w:cs="Times New Roman"/>
-              </w:rPr>
-            </w:pPr>
-            <w:r>
-              <w:rPr>
-                <w:rFonts w:ascii="Times New Roman" w:hAnsi="Times New Roman" w:cs="Times New Roman"/>
-              </w:rPr>
-              <w:t>1.2 hour in-class, team meeting (02/17)</w:t>
-            </w:r>
-          </w:p>
-          <w:p>
-            <w:pPr>
-              <w:pStyle w:val="ListParagraph"/>
-              <w:numPr>
-                <w:ilvl w:val="0"/>
-                <w:numId w:val="1"/>
-              </w:numPr>
-              <w:spacing w:line="360" w:lineRule="auto"/>
-              <w:rPr>
-                <w:rFonts w:ascii="Times New Roman" w:hAnsi="Times New Roman" w:cs="Times New Roman"/>
-              </w:rPr>
-            </w:pPr>
-            <w:r>
-              <w:rPr>
-                <w:rFonts w:ascii="Times New Roman" w:hAnsi="Times New Roman" w:cs="Times New Roman"/>
-              </w:rPr>
-              <w:t>1.17 hours making use case diagrams</w:t>
-            </w:r>
-          </w:p>
-        </w:tc>
-      </w:tr>
-      <w:tr>
-        <w:tc>
-          <w:tcPr>
-            <w:tcW w:w="1975" w:type="dxa"/>
-          </w:tcPr>
-          <w:p>
-            <w:pPr>
-              <w:spacing w:line="360" w:lineRule="auto"/>
-              <w:jc w:val="center"/>
-              <w:rPr>
-                <w:rFonts w:ascii="Times New Roman" w:hAnsi="Times New Roman" w:cs="Times New Roman"/>
-              </w:rPr>
-            </w:pPr>
-            <w:r>
-              <w:rPr>
-                <w:rFonts w:ascii="Times New Roman" w:hAnsi="Times New Roman" w:cs="Times New Roman"/>
-              </w:rPr>
-              <w:t>02/23 – 02/28</w:t>
-            </w:r>
-          </w:p>
-        </w:tc>
-        <w:tc>
-          <w:tcPr>
-            <w:tcW w:w="7375" w:type="dxa"/>
-          </w:tcPr>
-          <w:p>
-            <w:pPr>
-              <w:pStyle w:val="ListParagraph"/>
-              <w:numPr>
-                <w:ilvl w:val="0"/>
-                <w:numId w:val="1"/>
-              </w:numPr>
-              <w:spacing w:line="360" w:lineRule="auto"/>
-              <w:rPr>
-                <w:rFonts w:ascii="Times New Roman" w:hAnsi="Times New Roman" w:cs="Times New Roman"/>
-              </w:rPr>
-            </w:pPr>
-            <w:r>
-              <w:rPr>
-                <w:rFonts w:ascii="Times New Roman" w:hAnsi="Times New Roman" w:cs="Times New Roman"/>
-              </w:rPr>
-              <w:t>1 hour completing status report for week 02/16 to 02/20 (02/26)</w:t>
-            </w:r>
-          </w:p>
-        </w:tc>
-      </w:tr>
-      <w:tr>
-        <w:tc>
-          <w:tcPr>
-            <w:tcW w:w="1975" w:type="dxa"/>
-          </w:tcPr>
-          <w:p>
-            <w:pPr>
-              <w:spacing w:line="360" w:lineRule="auto"/>
-              <w:jc w:val="center"/>
-              <w:rPr>
-                <w:rFonts w:ascii="Times New Roman" w:hAnsi="Times New Roman" w:cs="Times New Roman"/>
-              </w:rPr>
-            </w:pPr>
-            <w:r>
-              <w:rPr>
-                <w:rFonts w:ascii="Times New Roman" w:hAnsi="Times New Roman" w:cs="Times New Roman"/>
-              </w:rPr>
-              <w:t>03/02 – 03/07</w:t>
-            </w:r>
-          </w:p>
-        </w:tc>
-        <w:tc>
-          <w:tcPr>
-            <w:tcW w:w="7375" w:type="dxa"/>
-          </w:tcPr>
-          <w:p>
-            <w:pPr>
-              <w:spacing w:line="360" w:lineRule="auto"/>
-              <w:rPr>
-                <w:rFonts w:ascii="Times New Roman" w:hAnsi="Times New Roman" w:cs="Times New Roman"/>
-              </w:rPr>
-            </w:pPr>
-          </w:p>
-        </w:tc>
-      </w:tr>
-      <w:tr>
-        <w:tc>
-          <w:tcPr>
-            <w:tcW w:w="1975" w:type="dxa"/>
-          </w:tcPr>
-          <w:p>
-            <w:pPr>
-              <w:spacing w:line="360" w:lineRule="auto"/>
-              <w:jc w:val="center"/>
-              <w:rPr>
-                <w:rFonts w:ascii="Times New Roman" w:hAnsi="Times New Roman" w:cs="Times New Roman"/>
-              </w:rPr>
-            </w:pPr>
-            <w:r>
-              <w:rPr>
-                <w:rFonts w:ascii="Times New Roman" w:hAnsi="Times New Roman" w:cs="Times New Roman"/>
-              </w:rPr>
-              <w:t>03/09 – 03/14</w:t>
-            </w:r>
-          </w:p>
-        </w:tc>
-        <w:tc>
-          <w:tcPr>
-            <w:tcW w:w="7375" w:type="dxa"/>
-          </w:tcPr>
-          <w:p>
-            <w:pPr>
-              <w:spacing w:line="360" w:lineRule="auto"/>
-              <w:rPr>
-                <w:rFonts w:ascii="Times New Roman" w:hAnsi="Times New Roman" w:cs="Times New Roman"/>
-              </w:rPr>
-            </w:pPr>
-          </w:p>
-        </w:tc>
-      </w:tr>
-      <w:tr>
-        <w:tc>
-          <w:tcPr>
-            <w:tcW w:w="1975" w:type="dxa"/>
-          </w:tcPr>
-          <w:p>
-            <w:pPr>
-              <w:spacing w:line="360" w:lineRule="auto"/>
-              <w:jc w:val="center"/>
-              <w:rPr>
-                <w:rFonts w:ascii="Times New Roman" w:hAnsi="Times New Roman" w:cs="Times New Roman"/>
-              </w:rPr>
-            </w:pPr>
-            <w:r>
-              <w:rPr>
-                <w:rFonts w:ascii="Times New Roman" w:hAnsi="Times New Roman" w:cs="Times New Roman"/>
-              </w:rPr>
-              <w:t>03/16 – 03/20</w:t>
-            </w:r>
-          </w:p>
-        </w:tc>
-        <w:tc>
-          <w:tcPr>
-            <w:tcW w:w="7375" w:type="dxa"/>
-          </w:tcPr>
-          <w:p>
-            <w:pPr>
-              <w:spacing w:line="360" w:lineRule="auto"/>
-              <w:rPr>
-                <w:rFonts w:ascii="Times New Roman" w:hAnsi="Times New Roman" w:cs="Times New Roman"/>
-              </w:rPr>
-            </w:pPr>
-          </w:p>
-        </w:tc>
-      </w:tr>
-      <w:tr>
-        <w:tc>
-          <w:tcPr>
-            <w:tcW w:w="1975" w:type="dxa"/>
-          </w:tcPr>
-          <w:p>
-            <w:pPr>
-              <w:spacing w:line="360" w:lineRule="auto"/>
-              <w:jc w:val="center"/>
-              <w:rPr>
-                <w:rFonts w:ascii="Times New Roman" w:hAnsi="Times New Roman" w:cs="Times New Roman"/>
-              </w:rPr>
-            </w:pPr>
-            <w:r>
-              <w:rPr>
-                <w:rFonts w:ascii="Times New Roman" w:hAnsi="Times New Roman" w:cs="Times New Roman"/>
-              </w:rPr>
-              <w:t>03/23 – 03/28</w:t>
-            </w:r>
-          </w:p>
-        </w:tc>
-        <w:tc>
-          <w:tcPr>
-            <w:tcW w:w="7375" w:type="dxa"/>
-          </w:tcPr>
-          <w:p>
-            <w:pPr>
-              <w:spacing w:line="360" w:lineRule="auto"/>
-              <w:rPr>
-                <w:rFonts w:ascii="Times New Roman" w:hAnsi="Times New Roman" w:cs="Times New Roman"/>
-              </w:rPr>
-            </w:pPr>
-          </w:p>
-        </w:tc>
-      </w:tr>
-      <w:tr>
-        <w:tc>
-          <w:tcPr>
-            <w:tcW w:w="1975" w:type="dxa"/>
-          </w:tcPr>
-          <w:p>
-            <w:pPr>
-              <w:spacing w:line="360" w:lineRule="auto"/>
-              <w:jc w:val="center"/>
-              <w:rPr>
-                <w:rFonts w:ascii="Times New Roman" w:hAnsi="Times New Roman" w:cs="Times New Roman"/>
-              </w:rPr>
-            </w:pPr>
-            <w:r>
-              <w:rPr>
-                <w:rFonts w:ascii="Times New Roman" w:hAnsi="Times New Roman" w:cs="Times New Roman"/>
-              </w:rPr>
-              <w:lastRenderedPageBreak/>
-              <w:t>03/30 – 04/04</w:t>
-            </w:r>
-          </w:p>
-        </w:tc>
-        <w:tc>
-          <w:tcPr>
-            <w:tcW w:w="7375" w:type="dxa"/>
-          </w:tcPr>
-          <w:p>
-            <w:pPr>
-              <w:spacing w:line="360" w:lineRule="auto"/>
-              <w:rPr>
-                <w:rFonts w:ascii="Times New Roman" w:hAnsi="Times New Roman" w:cs="Times New Roman"/>
-              </w:rPr>
-            </w:pPr>
-          </w:p>
-        </w:tc>
-      </w:tr>
-      <w:tr>
-        <w:tc>
-          <w:tcPr>
-            <w:tcW w:w="1975" w:type="dxa"/>
-          </w:tcPr>
-          <w:p>
-            <w:pPr>
-              <w:spacing w:line="360" w:lineRule="auto"/>
-              <w:jc w:val="center"/>
-              <w:rPr>
-                <w:rFonts w:ascii="Times New Roman" w:hAnsi="Times New Roman" w:cs="Times New Roman"/>
-              </w:rPr>
-            </w:pPr>
-            <w:r>
-              <w:rPr>
-                <w:rFonts w:ascii="Times New Roman" w:hAnsi="Times New Roman" w:cs="Times New Roman"/>
-              </w:rPr>
-              <w:t>04/06 – 04/11</w:t>
-            </w:r>
-          </w:p>
-        </w:tc>
-        <w:tc>
-          <w:tcPr>
-            <w:tcW w:w="7375" w:type="dxa"/>
-          </w:tcPr>
-          <w:p>
-            <w:pPr>
-              <w:spacing w:line="360" w:lineRule="auto"/>
-              <w:rPr>
-                <w:rFonts w:ascii="Times New Roman" w:hAnsi="Times New Roman" w:cs="Times New Roman"/>
-              </w:rPr>
-            </w:pPr>
-          </w:p>
-        </w:tc>
-      </w:tr>
-      <w:tr>
-        <w:tc>
-          <w:tcPr>
-            <w:tcW w:w="1975" w:type="dxa"/>
-          </w:tcPr>
-          <w:p>
-            <w:pPr>
-              <w:spacing w:line="360" w:lineRule="auto"/>
-              <w:jc w:val="center"/>
-              <w:rPr>
-                <w:rFonts w:ascii="Times New Roman" w:hAnsi="Times New Roman" w:cs="Times New Roman"/>
-              </w:rPr>
-            </w:pPr>
-            <w:r>
-              <w:rPr>
-                <w:rFonts w:ascii="Times New Roman" w:hAnsi="Times New Roman" w:cs="Times New Roman"/>
-              </w:rPr>
-              <w:t>04/13 – 04/16</w:t>
-            </w:r>
-          </w:p>
-        </w:tc>
-        <w:tc>
-          <w:tcPr>
-            <w:tcW w:w="7375" w:type="dxa"/>
-          </w:tcPr>
-          <w:p>
-            <w:pPr>
-              <w:spacing w:line="360" w:lineRule="auto"/>
-              <w:rPr>
-                <w:rFonts w:ascii="Times New Roman" w:hAnsi="Times New Roman" w:cs="Times New Roman"/>
-              </w:rPr>
-            </w:pPr>
-          </w:p>
-        </w:tc>
-      </w:tr>
-    </w:tbl>
-    <w:p>
-      <w:pPr>
-        <w:spacing w:line="360" w:lineRule="auto"/>
-        <w:rPr>
-          <w:rFonts w:ascii="Times New Roman" w:hAnsi="Times New Roman" w:cs="Times New Roman"/>
-        </w:rPr>
-      </w:pPr>
-    </w:p>
-    <w:p>
-      <w:pPr>
-        <w:rPr>
-          <w:rFonts w:ascii="Times New Roman" w:hAnsi="Times New Roman" w:cs="Times New Roman"/>
-          <w:b/>
-          <w:bCs/>
-        </w:rPr>
-      </w:pPr>
-      <w:r>
-        <w:rPr>
-          <w:rFonts w:ascii="Times New Roman" w:hAnsi="Times New Roman" w:cs="Times New Roman"/>
-          <w:b/>
-          <w:bCs/>
-        </w:rPr>
         <w:t>S Ravikumar</w:t>
       </w:r>
     </w:p>
@@ -1559,112 +826,123 @@
               <w:rPr>
                 <w:rFonts w:ascii="Times New Roman" w:hAnsi="Times New Roman" w:cs="Times New Roman"/>
               </w:rPr>
+              <w:t>02/23 – 02/28</w:t>
+            </w:r>
+          </w:p>
+        </w:tc>
+        <w:tc>
+          <w:tcPr>
+            <w:tcW w:w="7375" w:type="dxa"/>
+          </w:tcPr>
+          <w:p>
+            <w:pPr>
+              <w:pStyle w:val="ListParagraph"/>
+              <w:numPr>
+                <w:ilvl w:val="0"/>
+                <w:numId w:val="1"/>
+              </w:numPr>
+              <w:spacing w:line="360" w:lineRule="auto"/>
+              <w:rPr>
+                <w:rFonts w:ascii="Times New Roman" w:hAnsi="Times New Roman" w:cs="Times New Roman"/>
+              </w:rPr>
+            </w:pPr>
+            <w:r>
+              <w:rPr>
+                <w:rFonts w:ascii="Times New Roman" w:hAnsi="Times New Roman" w:cs="Times New Roman"/>
+              </w:rPr>
+              <w:t>1 hour team meeting (02/26)</w:t>
+            </w:r>
+          </w:p>
+        </w:tc>
+      </w:tr>
+      <w:tr>
+        <w:tc>
+          <w:tcPr>
+            <w:tcW w:w="1975" w:type="dxa"/>
+          </w:tcPr>
+          <w:p>
+            <w:pPr>
+              <w:spacing w:line="360" w:lineRule="auto"/>
+              <w:jc w:val="center"/>
+              <w:rPr>
+                <w:rFonts w:ascii="Times New Roman" w:hAnsi="Times New Roman" w:cs="Times New Roman"/>
+              </w:rPr>
+            </w:pPr>
+            <w:r>
+              <w:rPr>
+                <w:rFonts w:ascii="Times New Roman" w:hAnsi="Times New Roman" w:cs="Times New Roman"/>
+              </w:rPr>
+              <w:t>03/02 – 03/07</w:t>
+            </w:r>
+          </w:p>
+        </w:tc>
+        <w:tc>
+          <w:tcPr>
+            <w:tcW w:w="7375" w:type="dxa"/>
+          </w:tcPr>
+          <w:p>
+            <w:pPr>
+              <w:spacing w:line="360" w:lineRule="auto"/>
+              <w:rPr>
+                <w:rFonts w:ascii="Times New Roman" w:hAnsi="Times New Roman" w:cs="Times New Roman"/>
+              </w:rPr>
+            </w:pPr>
+          </w:p>
+        </w:tc>
+      </w:tr>
+      <w:tr>
+        <w:tc>
+          <w:tcPr>
+            <w:tcW w:w="1975" w:type="dxa"/>
+          </w:tcPr>
+          <w:p>
+            <w:pPr>
+              <w:spacing w:line="360" w:lineRule="auto"/>
+              <w:jc w:val="center"/>
+              <w:rPr>
+                <w:rFonts w:ascii="Times New Roman" w:hAnsi="Times New Roman" w:cs="Times New Roman"/>
+              </w:rPr>
+            </w:pPr>
+            <w:r>
+              <w:rPr>
+                <w:rFonts w:ascii="Times New Roman" w:hAnsi="Times New Roman" w:cs="Times New Roman"/>
+              </w:rPr>
+              <w:t>03/09 – 03/14</w:t>
+            </w:r>
+          </w:p>
+        </w:tc>
+        <w:tc>
+          <w:tcPr>
+            <w:tcW w:w="7375" w:type="dxa"/>
+          </w:tcPr>
+          <w:p>
+            <w:pPr>
+              <w:spacing w:line="360" w:lineRule="auto"/>
+              <w:rPr>
+                <w:rFonts w:ascii="Times New Roman" w:hAnsi="Times New Roman" w:cs="Times New Roman"/>
+              </w:rPr>
+            </w:pPr>
+          </w:p>
+        </w:tc>
+      </w:tr>
+      <w:tr>
+        <w:tc>
+          <w:tcPr>
+            <w:tcW w:w="1975" w:type="dxa"/>
+          </w:tcPr>
+          <w:p>
+            <w:pPr>
+              <w:spacing w:line="360" w:lineRule="auto"/>
+              <w:jc w:val="center"/>
+              <w:rPr>
+                <w:rFonts w:ascii="Times New Roman" w:hAnsi="Times New Roman" w:cs="Times New Roman"/>
+              </w:rPr>
+            </w:pPr>
+            <w:r>
+              <w:rPr>
+                <w:rFonts w:ascii="Times New Roman" w:hAnsi="Times New Roman" w:cs="Times New Roman"/>
+              </w:rPr>
               <w:lastRenderedPageBreak/>
-              <w:t>02/23 – 02/28</w:t>
-            </w:r>
-          </w:p>
-        </w:tc>
-        <w:tc>
-          <w:tcPr>
-            <w:tcW w:w="7375" w:type="dxa"/>
-          </w:tcPr>
-          <w:p>
-            <w:pPr>
-              <w:spacing w:line="360" w:lineRule="auto"/>
-              <w:rPr>
-                <w:rFonts w:ascii="Times New Roman" w:hAnsi="Times New Roman" w:cs="Times New Roman"/>
-              </w:rPr>
-            </w:pPr>
-          </w:p>
-        </w:tc>
-      </w:tr>
-      <w:tr>
-        <w:tc>
-          <w:tcPr>
-            <w:tcW w:w="1975" w:type="dxa"/>
-          </w:tcPr>
-          <w:p>
-            <w:pPr>
-              <w:spacing w:line="360" w:lineRule="auto"/>
-              <w:jc w:val="center"/>
-              <w:rPr>
-                <w:rFonts w:ascii="Times New Roman" w:hAnsi="Times New Roman" w:cs="Times New Roman"/>
-              </w:rPr>
-            </w:pPr>
-            <w:r>
-              <w:rPr>
-                <w:rFonts w:ascii="Times New Roman" w:hAnsi="Times New Roman" w:cs="Times New Roman"/>
-              </w:rPr>
-              <w:t>03/02 – 03/07</w:t>
-            </w:r>
-          </w:p>
-        </w:tc>
-        <w:tc>
-          <w:tcPr>
-            <w:tcW w:w="7375" w:type="dxa"/>
-          </w:tcPr>
-          <w:p>
-            <w:pPr>
-              <w:spacing w:line="360" w:lineRule="auto"/>
-              <w:rPr>
-                <w:rFonts w:ascii="Times New Roman" w:hAnsi="Times New Roman" w:cs="Times New Roman"/>
-              </w:rPr>
-            </w:pPr>
-          </w:p>
-        </w:tc>
-      </w:tr>
-      <w:tr>
-        <w:tc>
-          <w:tcPr>
-            <w:tcW w:w="1975" w:type="dxa"/>
-          </w:tcPr>
-          <w:p>
-            <w:pPr>
-              <w:spacing w:line="360" w:lineRule="auto"/>
-              <w:jc w:val="center"/>
-              <w:rPr>
-                <w:rFonts w:ascii="Times New Roman" w:hAnsi="Times New Roman" w:cs="Times New Roman"/>
-              </w:rPr>
-            </w:pPr>
-            <w:r>
-              <w:rPr>
-                <w:rFonts w:ascii="Times New Roman" w:hAnsi="Times New Roman" w:cs="Times New Roman"/>
-              </w:rPr>
-              <w:t>03/09 – 03/14</w:t>
-            </w:r>
-          </w:p>
-        </w:tc>
-        <w:tc>
-          <w:tcPr>
-            <w:tcW w:w="7375" w:type="dxa"/>
-          </w:tcPr>
-          <w:p>
-            <w:pPr>
-              <w:spacing w:line="360" w:lineRule="auto"/>
-              <w:rPr>
-                <w:rFonts w:ascii="Times New Roman" w:hAnsi="Times New Roman" w:cs="Times New Roman"/>
-              </w:rPr>
-            </w:pPr>
-          </w:p>
-        </w:tc>
-      </w:tr>
-      <w:tr>
-        <w:tc>
-          <w:tcPr>
-            <w:tcW w:w="1975" w:type="dxa"/>
-          </w:tcPr>
-          <w:p>
-            <w:pPr>
-              <w:spacing w:line="360" w:lineRule="auto"/>
-              <w:jc w:val="center"/>
-              <w:rPr>
-                <w:rFonts w:ascii="Times New Roman" w:hAnsi="Times New Roman" w:cs="Times New Roman"/>
-              </w:rPr>
-            </w:pPr>
-            <w:r>
-              <w:rPr>
-                <w:rFonts w:ascii="Times New Roman" w:hAnsi="Times New Roman" w:cs="Times New Roman"/>
-              </w:rPr>
               <w:t>03/16 – 03/20</w:t>
             </w:r>
           </w:p>
@@ -2092,11 +1370,22 @@
           </w:tcPr>
           <w:p>
             <w:pPr>
-              <w:spacing w:line="360" w:lineRule="auto"/>
-              <w:rPr>
-                <w:rFonts w:ascii="Times New Roman" w:hAnsi="Times New Roman" w:cs="Times New Roman"/>
-              </w:rPr>
-            </w:pPr>
+              <w:pStyle w:val="ListParagraph"/>
+              <w:numPr>
+                <w:ilvl w:val="0"/>
+                <w:numId w:val="1"/>
+              </w:numPr>
+              <w:spacing w:line="360" w:lineRule="auto"/>
+              <w:rPr>
+                <w:rFonts w:ascii="Times New Roman" w:hAnsi="Times New Roman" w:cs="Times New Roman"/>
+              </w:rPr>
+            </w:pPr>
+            <w:r>
+              <w:rPr>
+                <w:rFonts w:ascii="Times New Roman" w:hAnsi="Times New Roman" w:cs="Times New Roman"/>
+              </w:rPr>
+              <w:t>1 hour team meeting (02/26)</w:t>
+            </w:r>
           </w:p>
         </w:tc>
       </w:tr>
@@ -2354,6 +1643,721 @@
         </w:rPr>
       </w:pPr>
     </w:p>
+    <w:p>
+      <w:pPr>
+        <w:rPr>
+          <w:rFonts w:ascii="Times New Roman" w:hAnsi="Times New Roman" w:cs="Times New Roman"/>
+          <w:b/>
+          <w:bCs/>
+        </w:rPr>
+      </w:pPr>
+      <w:r>
+        <w:rPr>
+          <w:rFonts w:ascii="Times New Roman" w:hAnsi="Times New Roman" w:cs="Times New Roman"/>
+          <w:b/>
+          <w:bCs/>
+        </w:rPr>
+        <w:t>S Davis</w:t>
+      </w:r>
+    </w:p>
+    <w:tbl>
+      <w:tblPr>
+        <w:tblStyle w:val="TableGrid"/>
+        <w:tblW w:w="0" w:type="auto"/>
+        <w:tblLook w:val="04A0" w:firstRow="1" w:lastRow="0" w:firstColumn="1" w:lastColumn="0" w:noHBand="0" w:noVBand="1"/>
+      </w:tblPr>
+      <w:tblGrid>
+        <w:gridCol w:w="1975"/>
+        <w:gridCol w:w="7375"/>
+      </w:tblGrid>
+      <w:tr>
+        <w:tc>
+          <w:tcPr>
+            <w:tcW w:w="1975" w:type="dxa"/>
+            <w:shd w:val="clear" w:color="auto" w:fill="ADADAD" w:themeFill="background2" w:themeFillShade="BF"/>
+          </w:tcPr>
+          <w:p>
+            <w:pPr>
+              <w:spacing w:line="360" w:lineRule="auto"/>
+              <w:jc w:val="center"/>
+              <w:rPr>
+                <w:rFonts w:ascii="Times New Roman" w:hAnsi="Times New Roman" w:cs="Times New Roman"/>
+                <w:b/>
+                <w:bCs/>
+              </w:rPr>
+            </w:pPr>
+            <w:r>
+              <w:rPr>
+                <w:rFonts w:ascii="Times New Roman" w:hAnsi="Times New Roman" w:cs="Times New Roman"/>
+                <w:b/>
+                <w:bCs/>
+              </w:rPr>
+              <w:t>Week</w:t>
+            </w:r>
+          </w:p>
+        </w:tc>
+        <w:tc>
+          <w:tcPr>
+            <w:tcW w:w="7375" w:type="dxa"/>
+            <w:shd w:val="clear" w:color="auto" w:fill="ADADAD" w:themeFill="background2" w:themeFillShade="BF"/>
+          </w:tcPr>
+          <w:p>
+            <w:pPr>
+              <w:spacing w:line="360" w:lineRule="auto"/>
+              <w:jc w:val="center"/>
+              <w:rPr>
+                <w:rFonts w:ascii="Times New Roman" w:hAnsi="Times New Roman" w:cs="Times New Roman"/>
+                <w:b/>
+                <w:bCs/>
+              </w:rPr>
+            </w:pPr>
+            <w:r>
+              <w:rPr>
+                <w:rFonts w:ascii="Times New Roman" w:hAnsi="Times New Roman" w:cs="Times New Roman"/>
+                <w:b/>
+                <w:bCs/>
+              </w:rPr>
+              <w:t>Details</w:t>
+            </w:r>
+          </w:p>
+        </w:tc>
+      </w:tr>
+      <w:tr>
+        <w:tc>
+          <w:tcPr>
+            <w:tcW w:w="1975" w:type="dxa"/>
+          </w:tcPr>
+          <w:p>
+            <w:pPr>
+              <w:spacing w:line="360" w:lineRule="auto"/>
+              <w:jc w:val="center"/>
+              <w:rPr>
+                <w:rFonts w:ascii="Times New Roman" w:hAnsi="Times New Roman" w:cs="Times New Roman"/>
+              </w:rPr>
+            </w:pPr>
+            <w:r>
+              <w:rPr>
+                <w:rFonts w:ascii="Times New Roman" w:hAnsi="Times New Roman" w:cs="Times New Roman"/>
+              </w:rPr>
+              <w:t>02/02 – 02/07</w:t>
+            </w:r>
+          </w:p>
+        </w:tc>
+        <w:tc>
+          <w:tcPr>
+            <w:tcW w:w="7375" w:type="dxa"/>
+          </w:tcPr>
+          <w:p>
+            <w:pPr>
+              <w:pStyle w:val="ListParagraph"/>
+              <w:numPr>
+                <w:ilvl w:val="0"/>
+                <w:numId w:val="1"/>
+              </w:numPr>
+              <w:spacing w:line="360" w:lineRule="auto"/>
+              <w:rPr>
+                <w:rFonts w:ascii="Times New Roman" w:hAnsi="Times New Roman" w:cs="Times New Roman"/>
+              </w:rPr>
+            </w:pPr>
+            <w:r>
+              <w:rPr>
+                <w:rFonts w:ascii="Times New Roman" w:hAnsi="Times New Roman" w:cs="Times New Roman"/>
+              </w:rPr>
+              <w:t>1 hour revi</w:t>
+            </w:r>
+            <w:r>
+              <w:rPr>
+                <w:rFonts w:ascii="Times New Roman" w:hAnsi="Times New Roman" w:cs="Times New Roman"/>
+              </w:rPr>
+              <w:t>ewing Project Plan outline, creating and formatting documents for record keeping, creating and formatting document for Project Plan submission, and creating and organizing GitHub repository (02/02)</w:t>
+            </w:r>
+          </w:p>
+          <w:p>
+            <w:pPr>
+              <w:pStyle w:val="ListParagraph"/>
+              <w:numPr>
+                <w:ilvl w:val="0"/>
+                <w:numId w:val="1"/>
+              </w:numPr>
+              <w:spacing w:line="360" w:lineRule="auto"/>
+              <w:rPr>
+                <w:rFonts w:ascii="Times New Roman" w:hAnsi="Times New Roman" w:cs="Times New Roman"/>
+              </w:rPr>
+            </w:pPr>
+            <w:proofErr w:type="gramStart"/>
+            <w:r>
+              <w:rPr>
+                <w:rFonts w:ascii="Times New Roman" w:hAnsi="Times New Roman" w:cs="Times New Roman"/>
+              </w:rPr>
+              <w:lastRenderedPageBreak/>
+              <w:t>2 hour</w:t>
+            </w:r>
+            <w:proofErr w:type="gramEnd"/>
+            <w:r>
+              <w:rPr>
+                <w:rFonts w:ascii="Times New Roman" w:hAnsi="Times New Roman" w:cs="Times New Roman"/>
+              </w:rPr>
+              <w:t xml:space="preserve"> team meeting (02/03)</w:t>
+            </w:r>
+          </w:p>
+          <w:p>
+            <w:pPr>
+              <w:pStyle w:val="ListParagraph"/>
+              <w:numPr>
+                <w:ilvl w:val="0"/>
+                <w:numId w:val="1"/>
+              </w:numPr>
+              <w:spacing w:line="360" w:lineRule="auto"/>
+              <w:rPr>
+                <w:rFonts w:ascii="Times New Roman" w:hAnsi="Times New Roman" w:cs="Times New Roman"/>
+              </w:rPr>
+            </w:pPr>
+            <w:r>
+              <w:rPr>
+                <w:rFonts w:ascii="Times New Roman" w:hAnsi="Times New Roman" w:cs="Times New Roman"/>
+              </w:rPr>
+              <w:t>2.2 hours updating resume, listing tasks for Project Plan’s scope, assigning and clarifying team roles, confirming and recording team resources/tools (02/04)</w:t>
+            </w:r>
+          </w:p>
+          <w:p>
+            <w:pPr>
+              <w:pStyle w:val="ListParagraph"/>
+              <w:numPr>
+                <w:ilvl w:val="0"/>
+                <w:numId w:val="1"/>
+              </w:numPr>
+              <w:spacing w:line="360" w:lineRule="auto"/>
+              <w:rPr>
+                <w:rFonts w:ascii="Times New Roman" w:hAnsi="Times New Roman" w:cs="Times New Roman"/>
+              </w:rPr>
+            </w:pPr>
+            <w:r>
+              <w:rPr>
+                <w:rFonts w:ascii="Times New Roman" w:hAnsi="Times New Roman" w:cs="Times New Roman"/>
+              </w:rPr>
+              <w:t>2 hours working on WBS (02/05)</w:t>
+            </w:r>
+          </w:p>
+        </w:tc>
+      </w:tr>
+      <w:tr>
+        <w:tc>
+          <w:tcPr>
+            <w:tcW w:w="1975" w:type="dxa"/>
+          </w:tcPr>
+          <w:p>
+            <w:pPr>
+              <w:spacing w:line="360" w:lineRule="auto"/>
+              <w:jc w:val="center"/>
+              <w:rPr>
+                <w:rFonts w:ascii="Times New Roman" w:hAnsi="Times New Roman" w:cs="Times New Roman"/>
+              </w:rPr>
+            </w:pPr>
+            <w:r>
+              <w:rPr>
+                <w:rFonts w:ascii="Times New Roman" w:hAnsi="Times New Roman" w:cs="Times New Roman"/>
+              </w:rPr>
+              <w:lastRenderedPageBreak/>
+              <w:t>02/08 – 02/14</w:t>
+            </w:r>
+          </w:p>
+        </w:tc>
+        <w:tc>
+          <w:tcPr>
+            <w:tcW w:w="7375" w:type="dxa"/>
+          </w:tcPr>
+          <w:p>
+            <w:pPr>
+              <w:pStyle w:val="ListParagraph"/>
+              <w:numPr>
+                <w:ilvl w:val="0"/>
+                <w:numId w:val="1"/>
+              </w:numPr>
+              <w:spacing w:line="360" w:lineRule="auto"/>
+              <w:rPr>
+                <w:rFonts w:ascii="Times New Roman" w:hAnsi="Times New Roman" w:cs="Times New Roman"/>
+              </w:rPr>
+            </w:pPr>
+            <w:r>
+              <w:rPr>
+                <w:rFonts w:ascii="Times New Roman" w:hAnsi="Times New Roman" w:cs="Times New Roman"/>
+              </w:rPr>
+              <w:t>2.2 hours working on the testing section of the Project Plan, updating my resume, and updating meeting notes (02/10)</w:t>
+            </w:r>
+          </w:p>
+          <w:p>
+            <w:pPr>
+              <w:pStyle w:val="ListParagraph"/>
+              <w:numPr>
+                <w:ilvl w:val="0"/>
+                <w:numId w:val="1"/>
+              </w:numPr>
+              <w:spacing w:line="360" w:lineRule="auto"/>
+              <w:rPr>
+                <w:rFonts w:ascii="Times New Roman" w:hAnsi="Times New Roman" w:cs="Times New Roman"/>
+              </w:rPr>
+            </w:pPr>
+            <w:r>
+              <w:rPr>
+                <w:rFonts w:ascii="Times New Roman" w:hAnsi="Times New Roman" w:cs="Times New Roman"/>
+              </w:rPr>
+              <w:t>1.8 hours completing the testing section, continuing work on WBS (02/12)</w:t>
+            </w:r>
+          </w:p>
+        </w:tc>
+      </w:tr>
+      <w:tr>
+        <w:tc>
+          <w:tcPr>
+            <w:tcW w:w="1975" w:type="dxa"/>
+          </w:tcPr>
+          <w:p>
+            <w:pPr>
+              <w:spacing w:line="360" w:lineRule="auto"/>
+              <w:jc w:val="center"/>
+              <w:rPr>
+                <w:rFonts w:ascii="Times New Roman" w:hAnsi="Times New Roman" w:cs="Times New Roman"/>
+              </w:rPr>
+            </w:pPr>
+            <w:r>
+              <w:rPr>
+                <w:rFonts w:ascii="Times New Roman" w:hAnsi="Times New Roman" w:cs="Times New Roman"/>
+              </w:rPr>
+              <w:t>02/16 – 02/21</w:t>
+            </w:r>
+          </w:p>
+        </w:tc>
+        <w:tc>
+          <w:tcPr>
+            <w:tcW w:w="7375" w:type="dxa"/>
+          </w:tcPr>
+          <w:p>
+            <w:pPr>
+              <w:pStyle w:val="ListParagraph"/>
+              <w:numPr>
+                <w:ilvl w:val="0"/>
+                <w:numId w:val="1"/>
+              </w:numPr>
+              <w:spacing w:line="360" w:lineRule="auto"/>
+              <w:rPr>
+                <w:rFonts w:ascii="Times New Roman" w:hAnsi="Times New Roman" w:cs="Times New Roman"/>
+              </w:rPr>
+            </w:pPr>
+            <w:r>
+              <w:rPr>
+                <w:rFonts w:ascii="Times New Roman" w:hAnsi="Times New Roman" w:cs="Times New Roman"/>
+              </w:rPr>
+              <w:t>57 mins organizing GitHub repo and message team about upcoming schedule and others (02/16)</w:t>
+            </w:r>
+          </w:p>
+          <w:p>
+            <w:pPr>
+              <w:pStyle w:val="ListParagraph"/>
+              <w:numPr>
+                <w:ilvl w:val="0"/>
+                <w:numId w:val="1"/>
+              </w:numPr>
+              <w:spacing w:line="360" w:lineRule="auto"/>
+              <w:rPr>
+                <w:rFonts w:ascii="Times New Roman" w:hAnsi="Times New Roman" w:cs="Times New Roman"/>
+              </w:rPr>
+            </w:pPr>
+            <w:r>
+              <w:rPr>
+                <w:rFonts w:ascii="Times New Roman" w:hAnsi="Times New Roman" w:cs="Times New Roman"/>
+              </w:rPr>
+              <w:t>5.2 hours designing architecture of login/sign up module, drafting GUI, assigning staff usernames (02/16)</w:t>
+            </w:r>
+          </w:p>
+          <w:p>
+            <w:pPr>
+              <w:pStyle w:val="ListParagraph"/>
+              <w:numPr>
+                <w:ilvl w:val="0"/>
+                <w:numId w:val="1"/>
+              </w:numPr>
+              <w:spacing w:line="360" w:lineRule="auto"/>
+              <w:rPr>
+                <w:rFonts w:ascii="Times New Roman" w:hAnsi="Times New Roman" w:cs="Times New Roman"/>
+              </w:rPr>
+            </w:pPr>
+            <w:r>
+              <w:rPr>
+                <w:rFonts w:ascii="Times New Roman" w:hAnsi="Times New Roman" w:cs="Times New Roman"/>
+              </w:rPr>
+              <w:t>40 mins designing initial schema for database (02/17)</w:t>
+            </w:r>
+          </w:p>
+          <w:p>
+            <w:pPr>
+              <w:pStyle w:val="ListParagraph"/>
+              <w:numPr>
+                <w:ilvl w:val="0"/>
+                <w:numId w:val="1"/>
+              </w:numPr>
+              <w:spacing w:line="360" w:lineRule="auto"/>
+              <w:rPr>
+                <w:rFonts w:ascii="Times New Roman" w:hAnsi="Times New Roman" w:cs="Times New Roman"/>
+              </w:rPr>
+            </w:pPr>
+            <w:r>
+              <w:rPr>
+                <w:rFonts w:ascii="Times New Roman" w:hAnsi="Times New Roman" w:cs="Times New Roman"/>
+              </w:rPr>
+              <w:t>30 mins creating database ERD (02/17)</w:t>
+            </w:r>
+          </w:p>
+          <w:p>
+            <w:pPr>
+              <w:pStyle w:val="ListParagraph"/>
+              <w:numPr>
+                <w:ilvl w:val="0"/>
+                <w:numId w:val="1"/>
+              </w:numPr>
+              <w:spacing w:line="360" w:lineRule="auto"/>
+              <w:rPr>
+                <w:rFonts w:ascii="Times New Roman" w:hAnsi="Times New Roman" w:cs="Times New Roman"/>
+              </w:rPr>
+            </w:pPr>
+            <w:r>
+              <w:rPr>
+                <w:rFonts w:ascii="Times New Roman" w:hAnsi="Times New Roman" w:cs="Times New Roman"/>
+              </w:rPr>
+              <w:t>1.2 hour in-class, team meeting (02/17)</w:t>
+            </w:r>
+          </w:p>
+          <w:p>
+            <w:pPr>
+              <w:pStyle w:val="ListParagraph"/>
+              <w:numPr>
+                <w:ilvl w:val="0"/>
+                <w:numId w:val="1"/>
+              </w:numPr>
+              <w:spacing w:line="360" w:lineRule="auto"/>
+              <w:rPr>
+                <w:rFonts w:ascii="Times New Roman" w:hAnsi="Times New Roman" w:cs="Times New Roman"/>
+              </w:rPr>
+            </w:pPr>
+            <w:r>
+              <w:rPr>
+                <w:rFonts w:ascii="Times New Roman" w:hAnsi="Times New Roman" w:cs="Times New Roman"/>
+              </w:rPr>
+              <w:t>1.17 hours making use case diagrams</w:t>
+            </w:r>
+          </w:p>
+        </w:tc>
+      </w:tr>
+      <w:tr>
+        <w:tc>
+          <w:tcPr>
+            <w:tcW w:w="1975" w:type="dxa"/>
+          </w:tcPr>
+          <w:p>
+            <w:pPr>
+              <w:spacing w:line="360" w:lineRule="auto"/>
+              <w:jc w:val="center"/>
+              <w:rPr>
+                <w:rFonts w:ascii="Times New Roman" w:hAnsi="Times New Roman" w:cs="Times New Roman"/>
+              </w:rPr>
+            </w:pPr>
+            <w:r>
+              <w:rPr>
+                <w:rFonts w:ascii="Times New Roman" w:hAnsi="Times New Roman" w:cs="Times New Roman"/>
+              </w:rPr>
+              <w:t>02/23 – 02/28</w:t>
+            </w:r>
+          </w:p>
+        </w:tc>
+        <w:tc>
+          <w:tcPr>
+            <w:tcW w:w="7375" w:type="dxa"/>
+          </w:tcPr>
+          <w:p>
+            <w:pPr>
+              <w:pStyle w:val="ListParagraph"/>
+              <w:numPr>
+                <w:ilvl w:val="0"/>
+                <w:numId w:val="1"/>
+              </w:numPr>
+              <w:spacing w:line="360" w:lineRule="auto"/>
+              <w:rPr>
+                <w:rFonts w:ascii="Times New Roman" w:hAnsi="Times New Roman" w:cs="Times New Roman"/>
+              </w:rPr>
+            </w:pPr>
+            <w:r>
+              <w:rPr>
+                <w:rFonts w:ascii="Times New Roman" w:hAnsi="Times New Roman" w:cs="Times New Roman"/>
+              </w:rPr>
+              <w:t>1 hour completing status report for week 02/16 to 02/20 (02/26)</w:t>
+            </w:r>
+          </w:p>
+          <w:p>
+            <w:pPr>
+              <w:pStyle w:val="ListParagraph"/>
+              <w:numPr>
+                <w:ilvl w:val="0"/>
+                <w:numId w:val="1"/>
+              </w:numPr>
+              <w:spacing w:line="360" w:lineRule="auto"/>
+              <w:rPr>
+                <w:rFonts w:ascii="Times New Roman" w:hAnsi="Times New Roman" w:cs="Times New Roman"/>
+              </w:rPr>
+            </w:pPr>
+            <w:r>
+              <w:rPr>
+                <w:rFonts w:ascii="Times New Roman" w:hAnsi="Times New Roman" w:cs="Times New Roman"/>
+              </w:rPr>
+              <w:t>1 hour team meeting (02/26)</w:t>
+            </w:r>
+          </w:p>
+        </w:tc>
+      </w:tr>
+      <w:tr>
+        <w:tc>
+          <w:tcPr>
+            <w:tcW w:w="1975" w:type="dxa"/>
+          </w:tcPr>
+          <w:p>
+            <w:pPr>
+              <w:spacing w:line="360" w:lineRule="auto"/>
+              <w:jc w:val="center"/>
+              <w:rPr>
+                <w:rFonts w:ascii="Times New Roman" w:hAnsi="Times New Roman" w:cs="Times New Roman"/>
+              </w:rPr>
+            </w:pPr>
+            <w:r>
+              <w:rPr>
+                <w:rFonts w:ascii="Times New Roman" w:hAnsi="Times New Roman" w:cs="Times New Roman"/>
+              </w:rPr>
+              <w:t>03/02 – 03/07</w:t>
+            </w:r>
+          </w:p>
+        </w:tc>
+        <w:tc>
+          <w:tcPr>
+            <w:tcW w:w="7375" w:type="dxa"/>
+          </w:tcPr>
+          <w:p>
+            <w:pPr>
+              <w:spacing w:line="360" w:lineRule="auto"/>
+              <w:rPr>
+                <w:rFonts w:ascii="Times New Roman" w:hAnsi="Times New Roman" w:cs="Times New Roman"/>
+              </w:rPr>
+            </w:pPr>
+          </w:p>
+        </w:tc>
+      </w:tr>
+      <w:tr>
+        <w:tc>
+          <w:tcPr>
+            <w:tcW w:w="1975" w:type="dxa"/>
+          </w:tcPr>
+          <w:p>
+            <w:pPr>
+              <w:spacing w:line="360" w:lineRule="auto"/>
+              <w:jc w:val="center"/>
+              <w:rPr>
+                <w:rFonts w:ascii="Times New Roman" w:hAnsi="Times New Roman" w:cs="Times New Roman"/>
+              </w:rPr>
+            </w:pPr>
+            <w:r>
+              <w:rPr>
+                <w:rFonts w:ascii="Times New Roman" w:hAnsi="Times New Roman" w:cs="Times New Roman"/>
+              </w:rPr>
+              <w:t>03/09 – 03/14</w:t>
+            </w:r>
+          </w:p>
+        </w:tc>
+        <w:tc>
+          <w:tcPr>
+            <w:tcW w:w="7375" w:type="dxa"/>
+          </w:tcPr>
+          <w:p>
+            <w:pPr>
+              <w:spacing w:line="360" w:lineRule="auto"/>
+              <w:rPr>
+                <w:rFonts w:ascii="Times New Roman" w:hAnsi="Times New Roman" w:cs="Times New Roman"/>
+              </w:rPr>
+            </w:pPr>
+          </w:p>
+        </w:tc>
+      </w:tr>
+      <w:tr>
+        <w:tc>
+          <w:tcPr>
+            <w:tcW w:w="1975" w:type="dxa"/>
+          </w:tcPr>
+          <w:p>
+            <w:pPr>
+              <w:spacing w:line="360" w:lineRule="auto"/>
+              <w:jc w:val="center"/>
+              <w:rPr>
+                <w:rFonts w:ascii="Times New Roman" w:hAnsi="Times New Roman" w:cs="Times New Roman"/>
+              </w:rPr>
+            </w:pPr>
+            <w:r>
+              <w:rPr>
+                <w:rFonts w:ascii="Times New Roman" w:hAnsi="Times New Roman" w:cs="Times New Roman"/>
+              </w:rPr>
+              <w:t>03/16 – 03/20</w:t>
+            </w:r>
+          </w:p>
+        </w:tc>
+        <w:tc>
+          <w:tcPr>
+            <w:tcW w:w="7375" w:type="dxa"/>
+          </w:tcPr>
+          <w:p>
+            <w:pPr>
+              <w:spacing w:line="360" w:lineRule="auto"/>
+              <w:rPr>
+                <w:rFonts w:ascii="Times New Roman" w:hAnsi="Times New Roman" w:cs="Times New Roman"/>
+              </w:rPr>
+            </w:pPr>
+          </w:p>
+        </w:tc>
+      </w:tr>
+      <w:tr>
+        <w:tc>
+          <w:tcPr>
+            <w:tcW w:w="1975" w:type="dxa"/>
+          </w:tcPr>
+          <w:p>
+            <w:pPr>
+              <w:spacing w:line="360" w:lineRule="auto"/>
+              <w:jc w:val="center"/>
+              <w:rPr>
+                <w:rFonts w:ascii="Times New Roman" w:hAnsi="Times New Roman" w:cs="Times New Roman"/>
+              </w:rPr>
+            </w:pPr>
+            <w:r>
+              <w:rPr>
+                <w:rFonts w:ascii="Times New Roman" w:hAnsi="Times New Roman" w:cs="Times New Roman"/>
+              </w:rPr>
+              <w:t>03/23 – 03/28</w:t>
+            </w:r>
+          </w:p>
+        </w:tc>
+        <w:tc>
+          <w:tcPr>
+            <w:tcW w:w="7375" w:type="dxa"/>
+          </w:tcPr>
+          <w:p>
+            <w:pPr>
+              <w:spacing w:line="360" w:lineRule="auto"/>
+              <w:rPr>
+                <w:rFonts w:ascii="Times New Roman" w:hAnsi="Times New Roman" w:cs="Times New Roman"/>
+              </w:rPr>
+            </w:pPr>
+          </w:p>
+        </w:tc>
+      </w:tr>
+      <w:tr>
+        <w:tc>
+          <w:tcPr>
+            <w:tcW w:w="1975" w:type="dxa"/>
+          </w:tcPr>
+          <w:p>
+            <w:pPr>
+              <w:spacing w:line="360" w:lineRule="auto"/>
+              <w:jc w:val="center"/>
+              <w:rPr>
+                <w:rFonts w:ascii="Times New Roman" w:hAnsi="Times New Roman" w:cs="Times New Roman"/>
+              </w:rPr>
+            </w:pPr>
+            <w:r>
+              <w:rPr>
+                <w:rFonts w:ascii="Times New Roman" w:hAnsi="Times New Roman" w:cs="Times New Roman"/>
+              </w:rPr>
+              <w:t>03/30 – 04/04</w:t>
+            </w:r>
+          </w:p>
+        </w:tc>
+        <w:tc>
+          <w:tcPr>
+            <w:tcW w:w="7375" w:type="dxa"/>
+          </w:tcPr>
+          <w:p>
+            <w:pPr>
+              <w:spacing w:line="360" w:lineRule="auto"/>
+              <w:rPr>
+                <w:rFonts w:ascii="Times New Roman" w:hAnsi="Times New Roman" w:cs="Times New Roman"/>
+              </w:rPr>
+            </w:pPr>
+          </w:p>
+        </w:tc>
+      </w:tr>
+      <w:tr>
+        <w:tc>
+          <w:tcPr>
+            <w:tcW w:w="1975" w:type="dxa"/>
+          </w:tcPr>
+          <w:p>
+            <w:pPr>
+              <w:spacing w:line="360" w:lineRule="auto"/>
+              <w:jc w:val="center"/>
+              <w:rPr>
+                <w:rFonts w:ascii="Times New Roman" w:hAnsi="Times New Roman" w:cs="Times New Roman"/>
+              </w:rPr>
+            </w:pPr>
+            <w:r>
+              <w:rPr>
+                <w:rFonts w:ascii="Times New Roman" w:hAnsi="Times New Roman" w:cs="Times New Roman"/>
+              </w:rPr>
+              <w:t>04/06 – 04/11</w:t>
+            </w:r>
+          </w:p>
+        </w:tc>
+        <w:tc>
+          <w:tcPr>
+            <w:tcW w:w="7375" w:type="dxa"/>
+          </w:tcPr>
+          <w:p>
+            <w:pPr>
+              <w:spacing w:line="360" w:lineRule="auto"/>
+              <w:rPr>
+                <w:rFonts w:ascii="Times New Roman" w:hAnsi="Times New Roman" w:cs="Times New Roman"/>
+              </w:rPr>
+            </w:pPr>
+          </w:p>
+        </w:tc>
+      </w:tr>
+      <w:tr>
+        <w:tc>
+          <w:tcPr>
+            <w:tcW w:w="1975" w:type="dxa"/>
+          </w:tcPr>
+          <w:p>
+            <w:pPr>
+              <w:spacing w:line="360" w:lineRule="auto"/>
+              <w:jc w:val="center"/>
+              <w:rPr>
+                <w:rFonts w:ascii="Times New Roman" w:hAnsi="Times New Roman" w:cs="Times New Roman"/>
+              </w:rPr>
+            </w:pPr>
+            <w:r>
+              <w:rPr>
+                <w:rFonts w:ascii="Times New Roman" w:hAnsi="Times New Roman" w:cs="Times New Roman"/>
+              </w:rPr>
+              <w:t>04/13 – 04/16</w:t>
+            </w:r>
+          </w:p>
+        </w:tc>
+        <w:tc>
+          <w:tcPr>
+            <w:tcW w:w="7375" w:type="dxa"/>
+          </w:tcPr>
+          <w:p>
+            <w:pPr>
+              <w:spacing w:line="360" w:lineRule="auto"/>
+              <w:rPr>
+                <w:rFonts w:ascii="Times New Roman" w:hAnsi="Times New Roman" w:cs="Times New Roman"/>
+              </w:rPr>
+            </w:pPr>
+          </w:p>
+        </w:tc>
+      </w:tr>
+    </w:tbl>
     <w:p>
       <w:pPr>
         <w:spacing w:line="360" w:lineRule="auto"/>

</xml_diff>

<commit_message>
Update to Time Sheet
</commit_message>
<xml_diff>
--- a/Documentation/Records and Status Reports/Time Sheet.docx
+++ b/Documentation/Records and Status Reports/Time Sheet.docx
@@ -2108,6 +2108,50 @@
                 <w:rFonts w:ascii="Times New Roman" w:hAnsi="Times New Roman" w:cs="Times New Roman"/>
               </w:rPr>
               <w:t>1 hour team meeting (02/26)</w:t>
+            </w:r>
+          </w:p>
+          <w:p>
+            <w:pPr>
+              <w:pStyle w:val="ListParagraph"/>
+              <w:numPr>
+                <w:ilvl w:val="0"/>
+                <w:numId w:val="1"/>
+              </w:numPr>
+              <w:spacing w:line="360" w:lineRule="auto"/>
+              <w:rPr>
+                <w:rFonts w:ascii="Times New Roman" w:hAnsi="Times New Roman" w:cs="Times New Roman"/>
+              </w:rPr>
+            </w:pPr>
+            <w:r>
+              <w:rPr>
+                <w:rFonts w:ascii="Times New Roman" w:hAnsi="Times New Roman" w:cs="Times New Roman"/>
+              </w:rPr>
+              <w:t>3 hours updating architecture design doc for clock-in/out, drafting GUI for clock-in/out module (02/27, 02/28)</w:t>
+            </w:r>
+          </w:p>
+          <w:p>
+            <w:pPr>
+              <w:pStyle w:val="ListParagraph"/>
+              <w:numPr>
+                <w:ilvl w:val="0"/>
+                <w:numId w:val="1"/>
+              </w:numPr>
+              <w:spacing w:line="360" w:lineRule="auto"/>
+              <w:rPr>
+                <w:rFonts w:ascii="Times New Roman" w:hAnsi="Times New Roman" w:cs="Times New Roman"/>
+              </w:rPr>
+            </w:pPr>
+            <w:r>
+              <w:rPr>
+                <w:rFonts w:ascii="Times New Roman" w:hAnsi="Times New Roman" w:cs="Times New Roman"/>
+              </w:rPr>
+              <w:t>1.67</w:t>
+            </w:r>
+            <w:r>
+              <w:rPr>
+                <w:rFonts w:ascii="Times New Roman" w:hAnsi="Times New Roman" w:cs="Times New Roman"/>
+              </w:rPr>
+              <w:t xml:space="preserve"> hours updating Login GUI drafts, updating Login architecture, updating architecture standards (02/28)</w:t>
             </w:r>
           </w:p>
         </w:tc>

</xml_diff>

<commit_message>
Documentation updates * updates to status report of 02/23-02/27 * updates to status report format and file type for 02/16-02/20 * update to Time Sheet
</commit_message>
<xml_diff>
--- a/Documentation/Records and Status Reports/Time Sheet.docx
+++ b/Documentation/Records and Status Reports/Time Sheet.docx
@@ -2183,11 +2183,41 @@
           </w:tcPr>
           <w:p>
             <w:pPr>
-              <w:spacing w:line="360" w:lineRule="auto"/>
-              <w:rPr>
-                <w:rFonts w:ascii="Times New Roman" w:hAnsi="Times New Roman" w:cs="Times New Roman"/>
-              </w:rPr>
-            </w:pPr>
+              <w:pStyle w:val="ListParagraph"/>
+              <w:numPr>
+                <w:ilvl w:val="0"/>
+                <w:numId w:val="1"/>
+              </w:numPr>
+              <w:spacing w:line="360" w:lineRule="auto"/>
+              <w:rPr>
+                <w:rFonts w:ascii="Times New Roman" w:hAnsi="Times New Roman" w:cs="Times New Roman"/>
+              </w:rPr>
+            </w:pPr>
+            <w:r>
+              <w:rPr>
+                <w:rFonts w:ascii="Times New Roman" w:hAnsi="Times New Roman" w:cs="Times New Roman"/>
+              </w:rPr>
+              <w:t>1.7 hours updating schema (03/02)</w:t>
+            </w:r>
+          </w:p>
+          <w:p>
+            <w:pPr>
+              <w:pStyle w:val="ListParagraph"/>
+              <w:numPr>
+                <w:ilvl w:val="0"/>
+                <w:numId w:val="1"/>
+              </w:numPr>
+              <w:spacing w:line="360" w:lineRule="auto"/>
+              <w:rPr>
+                <w:rFonts w:ascii="Times New Roman" w:hAnsi="Times New Roman" w:cs="Times New Roman"/>
+              </w:rPr>
+            </w:pPr>
+            <w:r>
+              <w:rPr>
+                <w:rFonts w:ascii="Times New Roman" w:hAnsi="Times New Roman" w:cs="Times New Roman"/>
+              </w:rPr>
+              <w:t>30 minutes updating status report (03/02)</w:t>
+            </w:r>
           </w:p>
         </w:tc>
       </w:tr>
@@ -2383,6 +2413,7 @@
               <w:rPr>
                 <w:rFonts w:ascii="Times New Roman" w:hAnsi="Times New Roman" w:cs="Times New Roman"/>
               </w:rPr>
+              <w:lastRenderedPageBreak/>
               <w:t>04/13 – 04/16</w:t>
             </w:r>
           </w:p>

</xml_diff>

<commit_message>
Time Sheet and Meeting Records updated * include information of 12 March team meeting
</commit_message>
<xml_diff>
--- a/Documentation/Records and Status Reports/Time Sheet.docx
+++ b/Documentation/Records and Status Reports/Time Sheet.docx
@@ -384,11 +384,22 @@
           </w:tcPr>
           <w:p>
             <w:pPr>
-              <w:spacing w:line="360" w:lineRule="auto"/>
-              <w:rPr>
-                <w:rFonts w:ascii="Times New Roman" w:hAnsi="Times New Roman" w:cs="Times New Roman"/>
-              </w:rPr>
-            </w:pPr>
+              <w:pStyle w:val="ListParagraph"/>
+              <w:numPr>
+                <w:ilvl w:val="0"/>
+                <w:numId w:val="1"/>
+              </w:numPr>
+              <w:spacing w:line="360" w:lineRule="auto"/>
+              <w:rPr>
+                <w:rFonts w:ascii="Times New Roman" w:hAnsi="Times New Roman" w:cs="Times New Roman"/>
+              </w:rPr>
+            </w:pPr>
+            <w:r>
+              <w:rPr>
+                <w:rFonts w:ascii="Times New Roman" w:hAnsi="Times New Roman" w:cs="Times New Roman"/>
+              </w:rPr>
+              <w:t>30 mins in team meeting (03/12)</w:t>
+            </w:r>
           </w:p>
         </w:tc>
       </w:tr>
@@ -907,6 +918,7 @@
               <w:rPr>
                 <w:rFonts w:ascii="Times New Roman" w:hAnsi="Times New Roman" w:cs="Times New Roman"/>
               </w:rPr>
+              <w:lastRenderedPageBreak/>
               <w:t>03/09 – 03/14</w:t>
             </w:r>
           </w:p>
@@ -917,32 +929,42 @@
           </w:tcPr>
           <w:p>
             <w:pPr>
-              <w:spacing w:line="360" w:lineRule="auto"/>
-              <w:rPr>
-                <w:rFonts w:ascii="Times New Roman" w:hAnsi="Times New Roman" w:cs="Times New Roman"/>
-              </w:rPr>
-            </w:pPr>
-          </w:p>
-        </w:tc>
-      </w:tr>
-      <w:tr>
-        <w:tc>
-          <w:tcPr>
-            <w:tcW w:w="1975" w:type="dxa"/>
-          </w:tcPr>
-          <w:p>
-            <w:pPr>
-              <w:spacing w:line="360" w:lineRule="auto"/>
-              <w:jc w:val="center"/>
-              <w:rPr>
-                <w:rFonts w:ascii="Times New Roman" w:hAnsi="Times New Roman" w:cs="Times New Roman"/>
-              </w:rPr>
-            </w:pPr>
-            <w:r>
-              <w:rPr>
-                <w:rFonts w:ascii="Times New Roman" w:hAnsi="Times New Roman" w:cs="Times New Roman"/>
-              </w:rPr>
-              <w:lastRenderedPageBreak/>
+              <w:pStyle w:val="ListParagraph"/>
+              <w:numPr>
+                <w:ilvl w:val="0"/>
+                <w:numId w:val="1"/>
+              </w:numPr>
+              <w:spacing w:line="360" w:lineRule="auto"/>
+              <w:rPr>
+                <w:rFonts w:ascii="Times New Roman" w:hAnsi="Times New Roman" w:cs="Times New Roman"/>
+              </w:rPr>
+            </w:pPr>
+            <w:r>
+              <w:rPr>
+                <w:rFonts w:ascii="Times New Roman" w:hAnsi="Times New Roman" w:cs="Times New Roman"/>
+              </w:rPr>
+              <w:t>2 hours in team meeting (03/12)</w:t>
+            </w:r>
+          </w:p>
+        </w:tc>
+      </w:tr>
+      <w:tr>
+        <w:tc>
+          <w:tcPr>
+            <w:tcW w:w="1975" w:type="dxa"/>
+          </w:tcPr>
+          <w:p>
+            <w:pPr>
+              <w:spacing w:line="360" w:lineRule="auto"/>
+              <w:jc w:val="center"/>
+              <w:rPr>
+                <w:rFonts w:ascii="Times New Roman" w:hAnsi="Times New Roman" w:cs="Times New Roman"/>
+              </w:rPr>
+            </w:pPr>
+            <w:r>
+              <w:rPr>
+                <w:rFonts w:ascii="Times New Roman" w:hAnsi="Times New Roman" w:cs="Times New Roman"/>
+              </w:rPr>
               <w:t>03/16 – 03/20</w:t>
             </w:r>
           </w:p>
@@ -1451,11 +1473,22 @@
           </w:tcPr>
           <w:p>
             <w:pPr>
-              <w:spacing w:line="360" w:lineRule="auto"/>
-              <w:rPr>
-                <w:rFonts w:ascii="Times New Roman" w:hAnsi="Times New Roman" w:cs="Times New Roman"/>
-              </w:rPr>
-            </w:pPr>
+              <w:pStyle w:val="ListParagraph"/>
+              <w:numPr>
+                <w:ilvl w:val="0"/>
+                <w:numId w:val="1"/>
+              </w:numPr>
+              <w:spacing w:line="360" w:lineRule="auto"/>
+              <w:rPr>
+                <w:rFonts w:ascii="Times New Roman" w:hAnsi="Times New Roman" w:cs="Times New Roman"/>
+              </w:rPr>
+            </w:pPr>
+            <w:r>
+              <w:rPr>
+                <w:rFonts w:ascii="Times New Roman" w:hAnsi="Times New Roman" w:cs="Times New Roman"/>
+              </w:rPr>
+              <w:t>2 hours in team meeting (03/12)</w:t>
+            </w:r>
           </w:p>
         </w:tc>
       </w:tr>
@@ -1769,7 +1802,14 @@
               <w:rPr>
                 <w:rFonts w:ascii="Times New Roman" w:hAnsi="Times New Roman" w:cs="Times New Roman"/>
               </w:rPr>
-              <w:t>ewing Project Plan outline, creating and formatting documents for record keeping, creating and formatting document for Project Plan submission, and creating and organizing GitHub repository (02/02)</w:t>
+              <w:t xml:space="preserve">ewing Project Plan outline, creating and formatting documents for record keeping, creating and formatting document </w:t>
+            </w:r>
+            <w:r>
+              <w:rPr>
+                <w:rFonts w:ascii="Times New Roman" w:hAnsi="Times New Roman" w:cs="Times New Roman"/>
+              </w:rPr>
+              <w:lastRenderedPageBreak/>
+              <w:t>for Project Plan submission, and creating and organizing GitHub repository (02/02)</w:t>
             </w:r>
           </w:p>
           <w:p>
@@ -1789,7 +1829,6 @@
               <w:rPr>
                 <w:rFonts w:ascii="Times New Roman" w:hAnsi="Times New Roman" w:cs="Times New Roman"/>
               </w:rPr>
-              <w:lastRenderedPageBreak/>
               <w:t>2 hour</w:t>
             </w:r>
             <w:proofErr w:type="gramEnd"/>
@@ -2317,6 +2356,7 @@
               <w:rPr>
                 <w:rFonts w:ascii="Times New Roman" w:hAnsi="Times New Roman" w:cs="Times New Roman"/>
               </w:rPr>
+              <w:lastRenderedPageBreak/>
               <w:t>2 hours updating use case diagrams, creating business flow diagram (03/10)</w:t>
             </w:r>
           </w:p>
@@ -2336,7 +2376,6 @@
               <w:rPr>
                 <w:rFonts w:ascii="Times New Roman" w:hAnsi="Times New Roman" w:cs="Times New Roman"/>
               </w:rPr>
-              <w:lastRenderedPageBreak/>
               <w:t>~</w:t>
             </w:r>
             <w:r>
@@ -2377,34 +2416,6 @@
               <w:t xml:space="preserve"> (03/10)</w:t>
             </w:r>
           </w:p>
-        </w:tc>
-      </w:tr>
-      <w:tr>
-        <w:tc>
-          <w:tcPr>
-            <w:tcW w:w="1975" w:type="dxa"/>
-          </w:tcPr>
-          <w:p>
-            <w:pPr>
-              <w:spacing w:line="360" w:lineRule="auto"/>
-              <w:jc w:val="center"/>
-              <w:rPr>
-                <w:rFonts w:ascii="Times New Roman" w:hAnsi="Times New Roman" w:cs="Times New Roman"/>
-              </w:rPr>
-            </w:pPr>
-            <w:r>
-              <w:rPr>
-                <w:rFonts w:ascii="Times New Roman" w:hAnsi="Times New Roman" w:cs="Times New Roman"/>
-              </w:rPr>
-              <w:lastRenderedPageBreak/>
-              <w:t>03/16 – 03/20</w:t>
-            </w:r>
-          </w:p>
-        </w:tc>
-        <w:tc>
-          <w:tcPr>
-            <w:tcW w:w="7375" w:type="dxa"/>
-          </w:tcPr>
           <w:p>
             <w:pPr>
               <w:pStyle w:val="ListParagraph"/>
@@ -2421,19 +2432,7 @@
               <w:rPr>
                 <w:rFonts w:ascii="Times New Roman" w:hAnsi="Times New Roman" w:cs="Times New Roman"/>
               </w:rPr>
-              <w:t>2.17 hours adding confirmed requirements to Requirement Document, constructing and updating architecture</w:t>
-            </w:r>
-            <w:r>
-              <w:rPr>
-                <w:rFonts w:ascii="Times New Roman" w:hAnsi="Times New Roman" w:cs="Times New Roman"/>
-              </w:rPr>
-              <w:t xml:space="preserve"> designs</w:t>
-            </w:r>
-            <w:r>
-              <w:rPr>
-                <w:rFonts w:ascii="Times New Roman" w:hAnsi="Times New Roman" w:cs="Times New Roman"/>
-              </w:rPr>
-              <w:t>, writing code for creating staff profiles (03/11)</w:t>
+              <w:t>2.17 hours adding confirmed requirements to Requirement Document, constructing and updating architecture designs, writing code for creating staff profiles (03/11)</w:t>
             </w:r>
           </w:p>
           <w:p>
@@ -2452,37 +2451,7 @@
               <w:rPr>
                 <w:rFonts w:ascii="Times New Roman" w:hAnsi="Times New Roman" w:cs="Times New Roman"/>
               </w:rPr>
-              <w:t>1</w:t>
-            </w:r>
-            <w:r>
-              <w:rPr>
-                <w:rFonts w:ascii="Times New Roman" w:hAnsi="Times New Roman" w:cs="Times New Roman"/>
-              </w:rPr>
-              <w:t>.33</w:t>
-            </w:r>
-            <w:r>
-              <w:rPr>
-                <w:rFonts w:ascii="Times New Roman" w:hAnsi="Times New Roman" w:cs="Times New Roman"/>
-              </w:rPr>
-              <w:t xml:space="preserve"> hour</w:t>
-            </w:r>
-            <w:r>
-              <w:rPr>
-                <w:rFonts w:ascii="Times New Roman" w:hAnsi="Times New Roman" w:cs="Times New Roman"/>
-              </w:rPr>
-              <w:t>s</w:t>
-            </w:r>
-            <w:r>
-              <w:rPr>
-                <w:rFonts w:ascii="Times New Roman" w:hAnsi="Times New Roman" w:cs="Times New Roman"/>
-              </w:rPr>
-              <w:t xml:space="preserve"> updating architecture standards, architecture designs, GUI designs for manager’s ability create/edit/delete staff profiles</w:t>
-            </w:r>
-            <w:r>
-              <w:rPr>
-                <w:rFonts w:ascii="Times New Roman" w:hAnsi="Times New Roman" w:cs="Times New Roman"/>
-              </w:rPr>
-              <w:t xml:space="preserve"> (03/11)</w:t>
+              <w:t>1.33 hours updating architecture standards, architecture designs, GUI designs for manager’s ability create/edit/delete staff profiles (03/11)</w:t>
             </w:r>
           </w:p>
           <w:p>
@@ -2503,6 +2472,66 @@
               </w:rPr>
               <w:t>2.5 hours designing GUI draft for manager function to create/edit/delete staff profiles (03/12)</w:t>
             </w:r>
+          </w:p>
+          <w:p>
+            <w:pPr>
+              <w:pStyle w:val="ListParagraph"/>
+              <w:numPr>
+                <w:ilvl w:val="0"/>
+                <w:numId w:val="1"/>
+              </w:numPr>
+              <w:spacing w:line="360" w:lineRule="auto"/>
+              <w:rPr>
+                <w:rFonts w:ascii="Times New Roman" w:hAnsi="Times New Roman" w:cs="Times New Roman"/>
+              </w:rPr>
+            </w:pPr>
+            <w:r>
+              <w:rPr>
+                <w:rFonts w:ascii="Times New Roman" w:hAnsi="Times New Roman" w:cs="Times New Roman"/>
+              </w:rPr>
+              <w:t>2 hours in team meeting (03/12)</w:t>
+            </w:r>
+          </w:p>
+        </w:tc>
+      </w:tr>
+      <w:tr>
+        <w:tc>
+          <w:tcPr>
+            <w:tcW w:w="1975" w:type="dxa"/>
+          </w:tcPr>
+          <w:p>
+            <w:pPr>
+              <w:spacing w:line="360" w:lineRule="auto"/>
+              <w:jc w:val="center"/>
+              <w:rPr>
+                <w:rFonts w:ascii="Times New Roman" w:hAnsi="Times New Roman" w:cs="Times New Roman"/>
+              </w:rPr>
+            </w:pPr>
+            <w:r>
+              <w:rPr>
+                <w:rFonts w:ascii="Times New Roman" w:hAnsi="Times New Roman" w:cs="Times New Roman"/>
+              </w:rPr>
+              <w:lastRenderedPageBreak/>
+              <w:t>03/16 – 03/20</w:t>
+            </w:r>
+          </w:p>
+        </w:tc>
+        <w:tc>
+          <w:tcPr>
+            <w:tcW w:w="7375" w:type="dxa"/>
+          </w:tcPr>
+          <w:p>
+            <w:pPr>
+              <w:pStyle w:val="ListParagraph"/>
+              <w:numPr>
+                <w:ilvl w:val="0"/>
+                <w:numId w:val="1"/>
+              </w:numPr>
+              <w:spacing w:line="360" w:lineRule="auto"/>
+              <w:rPr>
+                <w:rFonts w:ascii="Times New Roman" w:hAnsi="Times New Roman" w:cs="Times New Roman"/>
+              </w:rPr>
+            </w:pPr>
           </w:p>
         </w:tc>
       </w:tr>

</xml_diff>

<commit_message>
Updates to architecture Standards, Architecure Details for SSReqs and Time Sheet
</commit_message>
<xml_diff>
--- a/Documentation/Records and Status Reports/Time Sheet.docx
+++ b/Documentation/Records and Status Reports/Time Sheet.docx
@@ -2490,6 +2490,25 @@
                 <w:rFonts w:ascii="Times New Roman" w:hAnsi="Times New Roman" w:cs="Times New Roman"/>
               </w:rPr>
               <w:t>2 hours in team meeting (03/12)</w:t>
+            </w:r>
+          </w:p>
+          <w:p>
+            <w:pPr>
+              <w:pStyle w:val="ListParagraph"/>
+              <w:numPr>
+                <w:ilvl w:val="0"/>
+                <w:numId w:val="1"/>
+              </w:numPr>
+              <w:spacing w:line="360" w:lineRule="auto"/>
+              <w:rPr>
+                <w:rFonts w:ascii="Times New Roman" w:hAnsi="Times New Roman" w:cs="Times New Roman"/>
+              </w:rPr>
+            </w:pPr>
+            <w:r>
+              <w:rPr>
+                <w:rFonts w:ascii="Times New Roman" w:hAnsi="Times New Roman" w:cs="Times New Roman"/>
+              </w:rPr>
+              <w:t>2 hours updating architecture designs (03/14)</w:t>
             </w:r>
           </w:p>
         </w:tc>

</xml_diff>

<commit_message>
Time Sheet updated and Reqs Processing Guide adjusted
</commit_message>
<xml_diff>
--- a/Documentation/Records and Status Reports/Time Sheet.docx
+++ b/Documentation/Records and Status Reports/Time Sheet.docx
@@ -2509,6 +2509,25 @@
                 <w:rFonts w:ascii="Times New Roman" w:hAnsi="Times New Roman" w:cs="Times New Roman"/>
               </w:rPr>
               <w:t>2 hours updating architecture designs (03/14)</w:t>
+            </w:r>
+          </w:p>
+          <w:p>
+            <w:pPr>
+              <w:pStyle w:val="ListParagraph"/>
+              <w:numPr>
+                <w:ilvl w:val="0"/>
+                <w:numId w:val="1"/>
+              </w:numPr>
+              <w:spacing w:line="360" w:lineRule="auto"/>
+              <w:rPr>
+                <w:rFonts w:ascii="Times New Roman" w:hAnsi="Times New Roman" w:cs="Times New Roman"/>
+              </w:rPr>
+            </w:pPr>
+            <w:r>
+              <w:rPr>
+                <w:rFonts w:ascii="Times New Roman" w:hAnsi="Times New Roman" w:cs="Times New Roman"/>
+              </w:rPr>
+              <w:t>~40 minutes updating Requirements Document by specifying implementation plans for each requirement (03/14)</w:t>
             </w:r>
           </w:p>
         </w:tc>

</xml_diff>

<commit_message>
Requirements identification and implementation plans completed in Requirements Document
</commit_message>
<xml_diff>
--- a/Documentation/Records and Status Reports/Time Sheet.docx
+++ b/Documentation/Records and Status Reports/Time Sheet.docx
@@ -2570,6 +2570,12 @@
                 <w:rFonts w:ascii="Times New Roman" w:hAnsi="Times New Roman" w:cs="Times New Roman"/>
               </w:rPr>
             </w:pPr>
+            <w:r>
+              <w:rPr>
+                <w:rFonts w:ascii="Times New Roman" w:hAnsi="Times New Roman" w:cs="Times New Roman"/>
+              </w:rPr>
+              <w:t>1.67 hours completing the functional and nonfunctional sections of the Requirements Doc (03/16)</w:t>
+            </w:r>
           </w:p>
         </w:tc>
       </w:tr>

</xml_diff>

<commit_message>
Updates to Requirements Document
</commit_message>
<xml_diff>
--- a/Documentation/Records and Status Reports/Time Sheet.docx
+++ b/Documentation/Records and Status Reports/Time Sheet.docx
@@ -2575,6 +2575,44 @@
                 <w:rFonts w:ascii="Times New Roman" w:hAnsi="Times New Roman" w:cs="Times New Roman"/>
               </w:rPr>
               <w:t>1.67 hours completing the functional and nonfunctional sections of the Requirements Doc (03/16)</w:t>
+            </w:r>
+          </w:p>
+          <w:p>
+            <w:pPr>
+              <w:pStyle w:val="ListParagraph"/>
+              <w:numPr>
+                <w:ilvl w:val="0"/>
+                <w:numId w:val="1"/>
+              </w:numPr>
+              <w:spacing w:line="360" w:lineRule="auto"/>
+              <w:rPr>
+                <w:rFonts w:ascii="Times New Roman" w:hAnsi="Times New Roman" w:cs="Times New Roman"/>
+              </w:rPr>
+            </w:pPr>
+            <w:r>
+              <w:rPr>
+                <w:rFonts w:ascii="Times New Roman" w:hAnsi="Times New Roman" w:cs="Times New Roman"/>
+              </w:rPr>
+              <w:t>~2 hours correcting Requirements Document (03/18)</w:t>
+            </w:r>
+          </w:p>
+          <w:p>
+            <w:pPr>
+              <w:pStyle w:val="ListParagraph"/>
+              <w:numPr>
+                <w:ilvl w:val="0"/>
+                <w:numId w:val="1"/>
+              </w:numPr>
+              <w:spacing w:line="360" w:lineRule="auto"/>
+              <w:rPr>
+                <w:rFonts w:ascii="Times New Roman" w:hAnsi="Times New Roman" w:cs="Times New Roman"/>
+              </w:rPr>
+            </w:pPr>
+            <w:r>
+              <w:rPr>
+                <w:rFonts w:ascii="Times New Roman" w:hAnsi="Times New Roman" w:cs="Times New Roman"/>
+              </w:rPr>
+              <w:t>45 mins creating calendar for remainder of project assignments (03/18)</w:t>
             </w:r>
           </w:p>
         </w:tc>

</xml_diff>

<commit_message>
Completed Requirements Document - time sheet updated - final draft of Requirements Document - additional diagrams uploaded relating to reqs doc
</commit_message>
<xml_diff>
--- a/Documentation/Records and Status Reports/Time Sheet.docx
+++ b/Documentation/Records and Status Reports/Time Sheet.docx
@@ -2754,6 +2754,44 @@
               <w:t>1.5 hours working on class diagrams (03/20)</w:t>
             </w:r>
           </w:p>
+          <w:p>
+            <w:pPr>
+              <w:pStyle w:val="ListParagraph"/>
+              <w:numPr>
+                <w:ilvl w:val="0"/>
+                <w:numId w:val="1"/>
+              </w:numPr>
+              <w:spacing w:line="360" w:lineRule="auto"/>
+              <w:rPr>
+                <w:rFonts w:ascii="Times New Roman" w:hAnsi="Times New Roman" w:cs="Times New Roman"/>
+              </w:rPr>
+            </w:pPr>
+            <w:r>
+              <w:rPr>
+                <w:rFonts w:ascii="Times New Roman" w:hAnsi="Times New Roman" w:cs="Times New Roman"/>
+              </w:rPr>
+              <w:t>~1.5 hours completing class diagrams (03/20)</w:t>
+            </w:r>
+          </w:p>
+          <w:p>
+            <w:pPr>
+              <w:pStyle w:val="ListParagraph"/>
+              <w:numPr>
+                <w:ilvl w:val="0"/>
+                <w:numId w:val="1"/>
+              </w:numPr>
+              <w:spacing w:line="360" w:lineRule="auto"/>
+              <w:rPr>
+                <w:rFonts w:ascii="Times New Roman" w:hAnsi="Times New Roman" w:cs="Times New Roman"/>
+              </w:rPr>
+            </w:pPr>
+            <w:r>
+              <w:rPr>
+                <w:rFonts w:ascii="Times New Roman" w:hAnsi="Times New Roman" w:cs="Times New Roman"/>
+              </w:rPr>
+              <w:t>~4 completing flow of events diagram and decision tables (03/21)</w:t>
+            </w:r>
+          </w:p>
         </w:tc>
       </w:tr>
       <w:tr>
@@ -2808,6 +2846,7 @@
               <w:rPr>
                 <w:rFonts w:ascii="Times New Roman" w:hAnsi="Times New Roman" w:cs="Times New Roman"/>
               </w:rPr>
+              <w:lastRenderedPageBreak/>
               <w:t>03/30 – 04/04</w:t>
             </w:r>
           </w:p>
@@ -2878,7 +2917,6 @@
               <w:rPr>
                 <w:rFonts w:ascii="Times New Roman" w:hAnsi="Times New Roman" w:cs="Times New Roman"/>
               </w:rPr>
-              <w:lastRenderedPageBreak/>
               <w:t>04/13 – 04/16</w:t>
             </w:r>
           </w:p>

</xml_diff>

<commit_message>
Updated Time Sheet, Meeting Records, and Status Report
</commit_message>
<xml_diff>
--- a/Documentation/Records and Status Reports/Time Sheet.docx
+++ b/Documentation/Records and Status Reports/Time Sheet.docx
@@ -62,7 +62,7 @@
     </w:p>
     <w:tbl>
       <w:tblPr>
-        <w:tblStyle w:val="TableGrid"/>
+        <w:tblStyle w:val="Tablaconcuadrcula"/>
         <w:tblW w:w="0" w:type="auto"/>
         <w:tblLook w:val="04A0" w:firstRow="1" w:lastRow="0" w:firstColumn="1" w:lastColumn="0" w:noHBand="0" w:noVBand="1"/>
       </w:tblPr>
@@ -149,7 +149,7 @@
           </w:tcPr>
           <w:p>
             <w:pPr>
-              <w:pStyle w:val="ListParagraph"/>
+              <w:pStyle w:val="Prrafodelista"/>
               <w:numPr>
                 <w:ilvl w:val="0"/>
                 <w:numId w:val="1"/>
@@ -168,7 +168,7 @@
           </w:p>
           <w:p>
             <w:pPr>
-              <w:pStyle w:val="ListParagraph"/>
+              <w:pStyle w:val="Prrafodelista"/>
               <w:numPr>
                 <w:ilvl w:val="0"/>
                 <w:numId w:val="1"/>
@@ -187,7 +187,7 @@
           </w:p>
           <w:p>
             <w:pPr>
-              <w:pStyle w:val="ListParagraph"/>
+              <w:pStyle w:val="Prrafodelista"/>
               <w:numPr>
                 <w:ilvl w:val="0"/>
                 <w:numId w:val="1"/>
@@ -268,7 +268,7 @@
           </w:tcPr>
           <w:p>
             <w:pPr>
-              <w:pStyle w:val="ListParagraph"/>
+              <w:pStyle w:val="Prrafodelista"/>
               <w:numPr>
                 <w:ilvl w:val="0"/>
                 <w:numId w:val="1"/>
@@ -384,7 +384,7 @@
           </w:tcPr>
           <w:p>
             <w:pPr>
-              <w:pStyle w:val="ListParagraph"/>
+              <w:pStyle w:val="Prrafodelista"/>
               <w:numPr>
                 <w:ilvl w:val="0"/>
                 <w:numId w:val="1"/>
@@ -436,7 +436,7 @@
           </w:tcPr>
           <w:p>
             <w:pPr>
-              <w:pStyle w:val="ListParagraph"/>
+              <w:pStyle w:val="Prrafodelista"/>
               <w:numPr>
                 <w:ilvl w:val="0"/>
                 <w:numId w:val="1"/>
@@ -455,7 +455,7 @@
           </w:p>
           <w:p>
             <w:pPr>
-              <w:pStyle w:val="ListParagraph"/>
+              <w:pStyle w:val="Prrafodelista"/>
               <w:numPr>
                 <w:ilvl w:val="0"/>
                 <w:numId w:val="1"/>
@@ -650,7 +650,7 @@
     </w:p>
     <w:tbl>
       <w:tblPr>
-        <w:tblStyle w:val="TableGrid"/>
+        <w:tblStyle w:val="Tablaconcuadrcula"/>
         <w:tblW w:w="0" w:type="auto"/>
         <w:tblLook w:val="04A0" w:firstRow="1" w:lastRow="0" w:firstColumn="1" w:lastColumn="0" w:noHBand="0" w:noVBand="1"/>
       </w:tblPr>
@@ -737,7 +737,7 @@
           </w:tcPr>
           <w:p>
             <w:pPr>
-              <w:pStyle w:val="ListParagraph"/>
+              <w:pStyle w:val="Prrafodelista"/>
               <w:numPr>
                 <w:ilvl w:val="0"/>
                 <w:numId w:val="1"/>
@@ -756,7 +756,7 @@
           </w:p>
           <w:p>
             <w:pPr>
-              <w:pStyle w:val="ListParagraph"/>
+              <w:pStyle w:val="Prrafodelista"/>
               <w:numPr>
                 <w:ilvl w:val="0"/>
                 <w:numId w:val="1"/>
@@ -837,7 +837,7 @@
           </w:tcPr>
           <w:p>
             <w:pPr>
-              <w:pStyle w:val="ListParagraph"/>
+              <w:pStyle w:val="Prrafodelista"/>
               <w:numPr>
                 <w:ilvl w:val="0"/>
                 <w:numId w:val="1"/>
@@ -883,7 +883,7 @@
           </w:tcPr>
           <w:p>
             <w:pPr>
-              <w:pStyle w:val="ListParagraph"/>
+              <w:pStyle w:val="Prrafodelista"/>
               <w:numPr>
                 <w:ilvl w:val="0"/>
                 <w:numId w:val="1"/>
@@ -965,7 +965,7 @@
           </w:tcPr>
           <w:p>
             <w:pPr>
-              <w:pStyle w:val="ListParagraph"/>
+              <w:pStyle w:val="Prrafodelista"/>
               <w:numPr>
                 <w:ilvl w:val="0"/>
                 <w:numId w:val="1"/>
@@ -1017,7 +1017,7 @@
           </w:tcPr>
           <w:p>
             <w:pPr>
-              <w:pStyle w:val="ListParagraph"/>
+              <w:pStyle w:val="Prrafodelista"/>
               <w:numPr>
                 <w:ilvl w:val="0"/>
                 <w:numId w:val="1"/>
@@ -1063,11 +1063,29 @@
           </w:tcPr>
           <w:p>
             <w:pPr>
-              <w:spacing w:line="360" w:lineRule="auto"/>
-              <w:rPr>
-                <w:rFonts w:ascii="Times New Roman" w:hAnsi="Times New Roman" w:cs="Times New Roman"/>
-              </w:rPr>
-            </w:pPr>
+              <w:pStyle w:val="Prrafodelista"/>
+              <w:numPr>
+                <w:ilvl w:val="0"/>
+                <w:numId w:val="1"/>
+              </w:numPr>
+              <w:spacing w:line="360" w:lineRule="auto"/>
+              <w:rPr>
+                <w:rFonts w:ascii="Times New Roman" w:hAnsi="Times New Roman" w:cs="Times New Roman"/>
+              </w:rPr>
+            </w:pPr>
+            <w:r>
+              <w:rPr>
+                <w:rFonts w:ascii="Times New Roman" w:hAnsi="Times New Roman" w:cs="Times New Roman"/>
+              </w:rPr>
+              <w:t xml:space="preserve">~30 mins team </w:t>
+            </w:r>
+            <w:r>
+              <w:rPr>
+                <w:rFonts w:ascii="Times New Roman" w:hAnsi="Times New Roman" w:cs="Times New Roman"/>
+                <w:lang w:val="es-AR"/>
+              </w:rPr>
+              <w:t>meeting (03/25)</w:t>
+            </w:r>
           </w:p>
         </w:tc>
       </w:tr>
@@ -1204,7 +1222,7 @@
     </w:p>
     <w:tbl>
       <w:tblPr>
-        <w:tblStyle w:val="TableGrid"/>
+        <w:tblStyle w:val="Tablaconcuadrcula"/>
         <w:tblW w:w="0" w:type="auto"/>
         <w:tblLook w:val="04A0" w:firstRow="1" w:lastRow="0" w:firstColumn="1" w:lastColumn="0" w:noHBand="0" w:noVBand="1"/>
       </w:tblPr>
@@ -1291,7 +1309,7 @@
           </w:tcPr>
           <w:p>
             <w:pPr>
-              <w:pStyle w:val="ListParagraph"/>
+              <w:pStyle w:val="Prrafodelista"/>
               <w:numPr>
                 <w:ilvl w:val="0"/>
                 <w:numId w:val="1"/>
@@ -1310,7 +1328,7 @@
           </w:p>
           <w:p>
             <w:pPr>
-              <w:pStyle w:val="ListParagraph"/>
+              <w:pStyle w:val="Prrafodelista"/>
               <w:numPr>
                 <w:ilvl w:val="0"/>
                 <w:numId w:val="1"/>
@@ -1329,7 +1347,7 @@
           </w:p>
           <w:p>
             <w:pPr>
-              <w:pStyle w:val="ListParagraph"/>
+              <w:pStyle w:val="Prrafodelista"/>
               <w:numPr>
                 <w:ilvl w:val="0"/>
                 <w:numId w:val="1"/>
@@ -1451,7 +1469,7 @@
           </w:tcPr>
           <w:p>
             <w:pPr>
-              <w:pStyle w:val="ListParagraph"/>
+              <w:pStyle w:val="Prrafodelista"/>
               <w:numPr>
                 <w:ilvl w:val="0"/>
                 <w:numId w:val="1"/>
@@ -1532,7 +1550,7 @@
           </w:tcPr>
           <w:p>
             <w:pPr>
-              <w:pStyle w:val="ListParagraph"/>
+              <w:pStyle w:val="Prrafodelista"/>
               <w:numPr>
                 <w:ilvl w:val="0"/>
                 <w:numId w:val="1"/>
@@ -1584,7 +1602,7 @@
           </w:tcPr>
           <w:p>
             <w:pPr>
-              <w:pStyle w:val="ListParagraph"/>
+              <w:pStyle w:val="Prrafodelista"/>
               <w:numPr>
                 <w:ilvl w:val="0"/>
                 <w:numId w:val="1"/>
@@ -1771,7 +1789,7 @@
     </w:p>
     <w:tbl>
       <w:tblPr>
-        <w:tblStyle w:val="TableGrid"/>
+        <w:tblStyle w:val="Tablaconcuadrcula"/>
         <w:tblW w:w="0" w:type="auto"/>
         <w:tblLook w:val="04A0" w:firstRow="1" w:lastRow="0" w:firstColumn="1" w:lastColumn="0" w:noHBand="0" w:noVBand="1"/>
       </w:tblPr>
@@ -1858,7 +1876,7 @@
           </w:tcPr>
           <w:p>
             <w:pPr>
-              <w:pStyle w:val="ListParagraph"/>
+              <w:pStyle w:val="Prrafodelista"/>
               <w:numPr>
                 <w:ilvl w:val="0"/>
                 <w:numId w:val="1"/>
@@ -1890,7 +1908,7 @@
           </w:p>
           <w:p>
             <w:pPr>
-              <w:pStyle w:val="ListParagraph"/>
+              <w:pStyle w:val="Prrafodelista"/>
               <w:numPr>
                 <w:ilvl w:val="0"/>
                 <w:numId w:val="1"/>
@@ -1917,7 +1935,7 @@
           </w:p>
           <w:p>
             <w:pPr>
-              <w:pStyle w:val="ListParagraph"/>
+              <w:pStyle w:val="Prrafodelista"/>
               <w:numPr>
                 <w:ilvl w:val="0"/>
                 <w:numId w:val="1"/>
@@ -1936,7 +1954,7 @@
           </w:p>
           <w:p>
             <w:pPr>
-              <w:pStyle w:val="ListParagraph"/>
+              <w:pStyle w:val="Prrafodelista"/>
               <w:numPr>
                 <w:ilvl w:val="0"/>
                 <w:numId w:val="1"/>
@@ -1983,7 +2001,7 @@
           </w:tcPr>
           <w:p>
             <w:pPr>
-              <w:pStyle w:val="ListParagraph"/>
+              <w:pStyle w:val="Prrafodelista"/>
               <w:numPr>
                 <w:ilvl w:val="0"/>
                 <w:numId w:val="1"/>
@@ -2002,7 +2020,7 @@
           </w:p>
           <w:p>
             <w:pPr>
-              <w:pStyle w:val="ListParagraph"/>
+              <w:pStyle w:val="Prrafodelista"/>
               <w:numPr>
                 <w:ilvl w:val="0"/>
                 <w:numId w:val="1"/>
@@ -2048,7 +2066,7 @@
           </w:tcPr>
           <w:p>
             <w:pPr>
-              <w:pStyle w:val="ListParagraph"/>
+              <w:pStyle w:val="Prrafodelista"/>
               <w:numPr>
                 <w:ilvl w:val="0"/>
                 <w:numId w:val="1"/>
@@ -2067,7 +2085,7 @@
           </w:p>
           <w:p>
             <w:pPr>
-              <w:pStyle w:val="ListParagraph"/>
+              <w:pStyle w:val="Prrafodelista"/>
               <w:numPr>
                 <w:ilvl w:val="0"/>
                 <w:numId w:val="1"/>
@@ -2086,7 +2104,7 @@
           </w:p>
           <w:p>
             <w:pPr>
-              <w:pStyle w:val="ListParagraph"/>
+              <w:pStyle w:val="Prrafodelista"/>
               <w:numPr>
                 <w:ilvl w:val="0"/>
                 <w:numId w:val="1"/>
@@ -2105,7 +2123,7 @@
           </w:p>
           <w:p>
             <w:pPr>
-              <w:pStyle w:val="ListParagraph"/>
+              <w:pStyle w:val="Prrafodelista"/>
               <w:numPr>
                 <w:ilvl w:val="0"/>
                 <w:numId w:val="1"/>
@@ -2124,7 +2142,7 @@
           </w:p>
           <w:p>
             <w:pPr>
-              <w:pStyle w:val="ListParagraph"/>
+              <w:pStyle w:val="Prrafodelista"/>
               <w:numPr>
                 <w:ilvl w:val="0"/>
                 <w:numId w:val="1"/>
@@ -2143,7 +2161,7 @@
           </w:p>
           <w:p>
             <w:pPr>
-              <w:pStyle w:val="ListParagraph"/>
+              <w:pStyle w:val="Prrafodelista"/>
               <w:numPr>
                 <w:ilvl w:val="0"/>
                 <w:numId w:val="1"/>
@@ -2189,7 +2207,7 @@
           </w:tcPr>
           <w:p>
             <w:pPr>
-              <w:pStyle w:val="ListParagraph"/>
+              <w:pStyle w:val="Prrafodelista"/>
               <w:numPr>
                 <w:ilvl w:val="0"/>
                 <w:numId w:val="1"/>
@@ -2208,7 +2226,7 @@
           </w:p>
           <w:p>
             <w:pPr>
-              <w:pStyle w:val="ListParagraph"/>
+              <w:pStyle w:val="Prrafodelista"/>
               <w:numPr>
                 <w:ilvl w:val="0"/>
                 <w:numId w:val="1"/>
@@ -2227,7 +2245,7 @@
           </w:p>
           <w:p>
             <w:pPr>
-              <w:pStyle w:val="ListParagraph"/>
+              <w:pStyle w:val="Prrafodelista"/>
               <w:numPr>
                 <w:ilvl w:val="0"/>
                 <w:numId w:val="1"/>
@@ -2246,7 +2264,7 @@
           </w:p>
           <w:p>
             <w:pPr>
-              <w:pStyle w:val="ListParagraph"/>
+              <w:pStyle w:val="Prrafodelista"/>
               <w:numPr>
                 <w:ilvl w:val="0"/>
                 <w:numId w:val="1"/>
@@ -2298,7 +2316,7 @@
           </w:tcPr>
           <w:p>
             <w:pPr>
-              <w:pStyle w:val="ListParagraph"/>
+              <w:pStyle w:val="Prrafodelista"/>
               <w:numPr>
                 <w:ilvl w:val="0"/>
                 <w:numId w:val="1"/>
@@ -2317,7 +2335,7 @@
           </w:p>
           <w:p>
             <w:pPr>
-              <w:pStyle w:val="ListParagraph"/>
+              <w:pStyle w:val="Prrafodelista"/>
               <w:numPr>
                 <w:ilvl w:val="0"/>
                 <w:numId w:val="1"/>
@@ -2363,7 +2381,7 @@
           </w:tcPr>
           <w:p>
             <w:pPr>
-              <w:pStyle w:val="ListParagraph"/>
+              <w:pStyle w:val="Prrafodelista"/>
               <w:numPr>
                 <w:ilvl w:val="0"/>
                 <w:numId w:val="1"/>
@@ -2418,7 +2436,7 @@
           </w:p>
           <w:p>
             <w:pPr>
-              <w:pStyle w:val="ListParagraph"/>
+              <w:pStyle w:val="Prrafodelista"/>
               <w:numPr>
                 <w:ilvl w:val="0"/>
                 <w:numId w:val="1"/>
@@ -2438,7 +2456,7 @@
           </w:p>
           <w:p>
             <w:pPr>
-              <w:pStyle w:val="ListParagraph"/>
+              <w:pStyle w:val="Prrafodelista"/>
               <w:numPr>
                 <w:ilvl w:val="0"/>
                 <w:numId w:val="1"/>
@@ -2469,7 +2487,7 @@
           </w:p>
           <w:p>
             <w:pPr>
-              <w:pStyle w:val="ListParagraph"/>
+              <w:pStyle w:val="Prrafodelista"/>
               <w:numPr>
                 <w:ilvl w:val="0"/>
                 <w:numId w:val="1"/>
@@ -2494,7 +2512,7 @@
           </w:p>
           <w:p>
             <w:pPr>
-              <w:pStyle w:val="ListParagraph"/>
+              <w:pStyle w:val="Prrafodelista"/>
               <w:numPr>
                 <w:ilvl w:val="0"/>
                 <w:numId w:val="1"/>
@@ -2513,7 +2531,7 @@
           </w:p>
           <w:p>
             <w:pPr>
-              <w:pStyle w:val="ListParagraph"/>
+              <w:pStyle w:val="Prrafodelista"/>
               <w:numPr>
                 <w:ilvl w:val="0"/>
                 <w:numId w:val="1"/>
@@ -2532,7 +2550,7 @@
           </w:p>
           <w:p>
             <w:pPr>
-              <w:pStyle w:val="ListParagraph"/>
+              <w:pStyle w:val="Prrafodelista"/>
               <w:numPr>
                 <w:ilvl w:val="0"/>
                 <w:numId w:val="1"/>
@@ -2551,7 +2569,7 @@
           </w:p>
           <w:p>
             <w:pPr>
-              <w:pStyle w:val="ListParagraph"/>
+              <w:pStyle w:val="Prrafodelista"/>
               <w:numPr>
                 <w:ilvl w:val="0"/>
                 <w:numId w:val="1"/>
@@ -2570,7 +2588,7 @@
           </w:p>
           <w:p>
             <w:pPr>
-              <w:pStyle w:val="ListParagraph"/>
+              <w:pStyle w:val="Prrafodelista"/>
               <w:numPr>
                 <w:ilvl w:val="0"/>
                 <w:numId w:val="1"/>
@@ -2589,7 +2607,7 @@
           </w:p>
           <w:p>
             <w:pPr>
-              <w:pStyle w:val="ListParagraph"/>
+              <w:pStyle w:val="Prrafodelista"/>
               <w:numPr>
                 <w:ilvl w:val="0"/>
                 <w:numId w:val="1"/>
@@ -2642,7 +2660,7 @@
           </w:tcPr>
           <w:p>
             <w:pPr>
-              <w:pStyle w:val="ListParagraph"/>
+              <w:pStyle w:val="Prrafodelista"/>
               <w:numPr>
                 <w:ilvl w:val="0"/>
                 <w:numId w:val="1"/>
@@ -2661,7 +2679,7 @@
           </w:p>
           <w:p>
             <w:pPr>
-              <w:pStyle w:val="ListParagraph"/>
+              <w:pStyle w:val="Prrafodelista"/>
               <w:numPr>
                 <w:ilvl w:val="0"/>
                 <w:numId w:val="1"/>
@@ -2680,7 +2698,7 @@
           </w:p>
           <w:p>
             <w:pPr>
-              <w:pStyle w:val="ListParagraph"/>
+              <w:pStyle w:val="Prrafodelista"/>
               <w:numPr>
                 <w:ilvl w:val="0"/>
                 <w:numId w:val="1"/>
@@ -2699,7 +2717,7 @@
           </w:p>
           <w:p>
             <w:pPr>
-              <w:pStyle w:val="ListParagraph"/>
+              <w:pStyle w:val="Prrafodelista"/>
               <w:numPr>
                 <w:ilvl w:val="0"/>
                 <w:numId w:val="1"/>
@@ -2718,7 +2736,7 @@
           </w:p>
           <w:p>
             <w:pPr>
-              <w:pStyle w:val="ListParagraph"/>
+              <w:pStyle w:val="Prrafodelista"/>
               <w:numPr>
                 <w:ilvl w:val="0"/>
                 <w:numId w:val="1"/>
@@ -2737,7 +2755,7 @@
           </w:p>
           <w:p>
             <w:pPr>
-              <w:pStyle w:val="ListParagraph"/>
+              <w:pStyle w:val="Prrafodelista"/>
               <w:numPr>
                 <w:ilvl w:val="0"/>
                 <w:numId w:val="1"/>
@@ -2756,7 +2774,7 @@
           </w:p>
           <w:p>
             <w:pPr>
-              <w:pStyle w:val="ListParagraph"/>
+              <w:pStyle w:val="Prrafodelista"/>
               <w:numPr>
                 <w:ilvl w:val="0"/>
                 <w:numId w:val="1"/>
@@ -2775,7 +2793,7 @@
           </w:p>
           <w:p>
             <w:pPr>
-              <w:pStyle w:val="ListParagraph"/>
+              <w:pStyle w:val="Prrafodelista"/>
               <w:numPr>
                 <w:ilvl w:val="0"/>
                 <w:numId w:val="1"/>
@@ -2821,11 +2839,70 @@
           </w:tcPr>
           <w:p>
             <w:pPr>
-              <w:spacing w:line="360" w:lineRule="auto"/>
-              <w:rPr>
-                <w:rFonts w:ascii="Times New Roman" w:hAnsi="Times New Roman" w:cs="Times New Roman"/>
-              </w:rPr>
-            </w:pPr>
+              <w:pStyle w:val="Prrafodelista"/>
+              <w:numPr>
+                <w:ilvl w:val="0"/>
+                <w:numId w:val="1"/>
+              </w:numPr>
+              <w:spacing w:line="360" w:lineRule="auto"/>
+              <w:rPr>
+                <w:rFonts w:ascii="Times New Roman" w:hAnsi="Times New Roman" w:cs="Times New Roman"/>
+              </w:rPr>
+            </w:pPr>
+            <w:r>
+              <w:rPr>
+                <w:rFonts w:ascii="Times New Roman" w:hAnsi="Times New Roman" w:cs="Times New Roman"/>
+              </w:rPr>
+              <w:t>33 mins working on GUI (03/25)</w:t>
+            </w:r>
+          </w:p>
+          <w:p>
+            <w:pPr>
+              <w:pStyle w:val="Prrafodelista"/>
+              <w:numPr>
+                <w:ilvl w:val="0"/>
+                <w:numId w:val="1"/>
+              </w:numPr>
+              <w:spacing w:line="360" w:lineRule="auto"/>
+              <w:rPr>
+                <w:rFonts w:ascii="Times New Roman" w:hAnsi="Times New Roman" w:cs="Times New Roman"/>
+              </w:rPr>
+            </w:pPr>
+            <w:r>
+              <w:rPr>
+                <w:rFonts w:ascii="Times New Roman" w:hAnsi="Times New Roman" w:cs="Times New Roman"/>
+                <w:kern w:val="0"/>
+                <w14:ligatures w14:val="none"/>
+              </w:rPr>
+              <w:lastRenderedPageBreak/>
+              <w:t>2.83 hours Creating GUI draft pages (03/25)</w:t>
+            </w:r>
+          </w:p>
+          <w:p>
+            <w:pPr>
+              <w:pStyle w:val="Prrafodelista"/>
+              <w:numPr>
+                <w:ilvl w:val="0"/>
+                <w:numId w:val="1"/>
+              </w:numPr>
+              <w:spacing w:line="360" w:lineRule="auto"/>
+              <w:rPr>
+                <w:rFonts w:ascii="Times New Roman" w:hAnsi="Times New Roman" w:cs="Times New Roman"/>
+              </w:rPr>
+            </w:pPr>
+            <w:r>
+              <w:rPr>
+                <w:rFonts w:ascii="Times New Roman" w:hAnsi="Times New Roman" w:cs="Times New Roman"/>
+              </w:rPr>
+              <w:t xml:space="preserve">~30 mins team </w:t>
+            </w:r>
+            <w:r>
+              <w:rPr>
+                <w:rFonts w:ascii="Times New Roman" w:hAnsi="Times New Roman" w:cs="Times New Roman"/>
+                <w:lang w:val="es-AR"/>
+              </w:rPr>
+              <w:t>meeting (03/25)</w:t>
+            </w:r>
           </w:p>
         </w:tc>
       </w:tr>
@@ -3023,7 +3100,7 @@
     <w:sdtContent>
       <w:p>
         <w:pPr>
-          <w:pStyle w:val="Header"/>
+          <w:pStyle w:val="Encabezado"/>
           <w:jc w:val="right"/>
         </w:pPr>
         <w:r>
@@ -3037,7 +3114,7 @@
   </w:sdt>
   <w:p>
     <w:pPr>
-      <w:pStyle w:val="Header"/>
+      <w:pStyle w:val="Encabezado"/>
     </w:pPr>
   </w:p>
 </w:hdr>
@@ -3160,6 +3237,18 @@
   </w:abstractNum>
   <w:num w:numId="1" w16cid:durableId="279073847">
     <w:abstractNumId w:val="0"/>
+  </w:num>
+  <w:num w:numId="2" w16cid:durableId="445195328">
+    <w:abstractNumId w:val="0"/>
+    <w:lvlOverride w:ilvl="0"/>
+    <w:lvlOverride w:ilvl="1"/>
+    <w:lvlOverride w:ilvl="2"/>
+    <w:lvlOverride w:ilvl="3"/>
+    <w:lvlOverride w:ilvl="4"/>
+    <w:lvlOverride w:ilvl="5"/>
+    <w:lvlOverride w:ilvl="6"/>
+    <w:lvlOverride w:ilvl="7"/>
+    <w:lvlOverride w:ilvl="8"/>
   </w:num>
 </w:numbering>
 </file>
@@ -3565,11 +3654,11 @@
     <w:name w:val="Normal"/>
     <w:qFormat/>
   </w:style>
-  <w:style w:type="paragraph" w:styleId="Heading1">
+  <w:style w:type="paragraph" w:styleId="Ttulo1">
     <w:name w:val="heading 1"/>
     <w:basedOn w:val="Normal"/>
     <w:next w:val="Normal"/>
-    <w:link w:val="Heading1Char"/>
+    <w:link w:val="Ttulo1Car"/>
     <w:uiPriority w:val="9"/>
     <w:qFormat/>
     <w:rsid w:val="001A62EF"/>
@@ -3586,11 +3675,11 @@
       <w:szCs w:val="40"/>
     </w:rPr>
   </w:style>
-  <w:style w:type="paragraph" w:styleId="Heading2">
+  <w:style w:type="paragraph" w:styleId="Ttulo2">
     <w:name w:val="heading 2"/>
     <w:basedOn w:val="Normal"/>
     <w:next w:val="Normal"/>
-    <w:link w:val="Heading2Char"/>
+    <w:link w:val="Ttulo2Car"/>
     <w:uiPriority w:val="9"/>
     <w:semiHidden/>
     <w:unhideWhenUsed/>
@@ -3609,11 +3698,11 @@
       <w:szCs w:val="32"/>
     </w:rPr>
   </w:style>
-  <w:style w:type="paragraph" w:styleId="Heading3">
+  <w:style w:type="paragraph" w:styleId="Ttulo3">
     <w:name w:val="heading 3"/>
     <w:basedOn w:val="Normal"/>
     <w:next w:val="Normal"/>
-    <w:link w:val="Heading3Char"/>
+    <w:link w:val="Ttulo3Car"/>
     <w:uiPriority w:val="9"/>
     <w:semiHidden/>
     <w:unhideWhenUsed/>
@@ -3632,11 +3721,11 @@
       <w:szCs w:val="28"/>
     </w:rPr>
   </w:style>
-  <w:style w:type="paragraph" w:styleId="Heading4">
+  <w:style w:type="paragraph" w:styleId="Ttulo4">
     <w:name w:val="heading 4"/>
     <w:basedOn w:val="Normal"/>
     <w:next w:val="Normal"/>
-    <w:link w:val="Heading4Char"/>
+    <w:link w:val="Ttulo4Car"/>
     <w:uiPriority w:val="9"/>
     <w:semiHidden/>
     <w:unhideWhenUsed/>
@@ -3655,11 +3744,11 @@
       <w:color w:val="0F4761" w:themeColor="accent1" w:themeShade="BF"/>
     </w:rPr>
   </w:style>
-  <w:style w:type="paragraph" w:styleId="Heading5">
+  <w:style w:type="paragraph" w:styleId="Ttulo5">
     <w:name w:val="heading 5"/>
     <w:basedOn w:val="Normal"/>
     <w:next w:val="Normal"/>
-    <w:link w:val="Heading5Char"/>
+    <w:link w:val="Ttulo5Car"/>
     <w:uiPriority w:val="9"/>
     <w:semiHidden/>
     <w:unhideWhenUsed/>
@@ -3676,11 +3765,11 @@
       <w:color w:val="0F4761" w:themeColor="accent1" w:themeShade="BF"/>
     </w:rPr>
   </w:style>
-  <w:style w:type="paragraph" w:styleId="Heading6">
+  <w:style w:type="paragraph" w:styleId="Ttulo6">
     <w:name w:val="heading 6"/>
     <w:basedOn w:val="Normal"/>
     <w:next w:val="Normal"/>
-    <w:link w:val="Heading6Char"/>
+    <w:link w:val="Ttulo6Car"/>
     <w:uiPriority w:val="9"/>
     <w:semiHidden/>
     <w:unhideWhenUsed/>
@@ -3699,11 +3788,11 @@
       <w:color w:val="595959" w:themeColor="text1" w:themeTint="A6"/>
     </w:rPr>
   </w:style>
-  <w:style w:type="paragraph" w:styleId="Heading7">
+  <w:style w:type="paragraph" w:styleId="Ttulo7">
     <w:name w:val="heading 7"/>
     <w:basedOn w:val="Normal"/>
     <w:next w:val="Normal"/>
-    <w:link w:val="Heading7Char"/>
+    <w:link w:val="Ttulo7Car"/>
     <w:uiPriority w:val="9"/>
     <w:semiHidden/>
     <w:unhideWhenUsed/>
@@ -3720,11 +3809,11 @@
       <w:color w:val="595959" w:themeColor="text1" w:themeTint="A6"/>
     </w:rPr>
   </w:style>
-  <w:style w:type="paragraph" w:styleId="Heading8">
+  <w:style w:type="paragraph" w:styleId="Ttulo8">
     <w:name w:val="heading 8"/>
     <w:basedOn w:val="Normal"/>
     <w:next w:val="Normal"/>
-    <w:link w:val="Heading8Char"/>
+    <w:link w:val="Ttulo8Car"/>
     <w:uiPriority w:val="9"/>
     <w:semiHidden/>
     <w:unhideWhenUsed/>
@@ -3743,11 +3832,11 @@
       <w:color w:val="272727" w:themeColor="text1" w:themeTint="D8"/>
     </w:rPr>
   </w:style>
-  <w:style w:type="paragraph" w:styleId="Heading9">
+  <w:style w:type="paragraph" w:styleId="Ttulo9">
     <w:name w:val="heading 9"/>
     <w:basedOn w:val="Normal"/>
     <w:next w:val="Normal"/>
-    <w:link w:val="Heading9Char"/>
+    <w:link w:val="Ttulo9Car"/>
     <w:uiPriority w:val="9"/>
     <w:semiHidden/>
     <w:unhideWhenUsed/>
@@ -3764,13 +3853,13 @@
       <w:color w:val="272727" w:themeColor="text1" w:themeTint="D8"/>
     </w:rPr>
   </w:style>
-  <w:style w:type="character" w:default="1" w:styleId="DefaultParagraphFont">
+  <w:style w:type="character" w:default="1" w:styleId="Fuentedeprrafopredeter">
     <w:name w:val="Default Paragraph Font"/>
     <w:uiPriority w:val="1"/>
     <w:semiHidden/>
     <w:unhideWhenUsed/>
   </w:style>
-  <w:style w:type="table" w:default="1" w:styleId="TableNormal">
+  <w:style w:type="table" w:default="1" w:styleId="Tablanormal">
     <w:name w:val="Normal Table"/>
     <w:uiPriority w:val="99"/>
     <w:semiHidden/>
@@ -3785,16 +3874,16 @@
       </w:tblCellMar>
     </w:tblPr>
   </w:style>
-  <w:style w:type="numbering" w:default="1" w:styleId="NoList">
+  <w:style w:type="numbering" w:default="1" w:styleId="Sinlista">
     <w:name w:val="No List"/>
     <w:uiPriority w:val="99"/>
     <w:semiHidden/>
     <w:unhideWhenUsed/>
   </w:style>
-  <w:style w:type="character" w:customStyle="1" w:styleId="Heading1Char">
-    <w:name w:val="Heading 1 Char"/>
-    <w:basedOn w:val="DefaultParagraphFont"/>
-    <w:link w:val="Heading1"/>
+  <w:style w:type="character" w:customStyle="1" w:styleId="Ttulo1Car">
+    <w:name w:val="Título 1 Car"/>
+    <w:basedOn w:val="Fuentedeprrafopredeter"/>
+    <w:link w:val="Ttulo1"/>
     <w:uiPriority w:val="9"/>
     <w:rsid w:val="001A62EF"/>
     <w:rPr>
@@ -3804,10 +3893,10 @@
       <w:szCs w:val="40"/>
     </w:rPr>
   </w:style>
-  <w:style w:type="character" w:customStyle="1" w:styleId="Heading2Char">
-    <w:name w:val="Heading 2 Char"/>
-    <w:basedOn w:val="DefaultParagraphFont"/>
-    <w:link w:val="Heading2"/>
+  <w:style w:type="character" w:customStyle="1" w:styleId="Ttulo2Car">
+    <w:name w:val="Título 2 Car"/>
+    <w:basedOn w:val="Fuentedeprrafopredeter"/>
+    <w:link w:val="Ttulo2"/>
     <w:uiPriority w:val="9"/>
     <w:semiHidden/>
     <w:rsid w:val="001A62EF"/>
@@ -3818,10 +3907,10 @@
       <w:szCs w:val="32"/>
     </w:rPr>
   </w:style>
-  <w:style w:type="character" w:customStyle="1" w:styleId="Heading3Char">
-    <w:name w:val="Heading 3 Char"/>
-    <w:basedOn w:val="DefaultParagraphFont"/>
-    <w:link w:val="Heading3"/>
+  <w:style w:type="character" w:customStyle="1" w:styleId="Ttulo3Car">
+    <w:name w:val="Título 3 Car"/>
+    <w:basedOn w:val="Fuentedeprrafopredeter"/>
+    <w:link w:val="Ttulo3"/>
     <w:uiPriority w:val="9"/>
     <w:semiHidden/>
     <w:rsid w:val="001A62EF"/>
@@ -3832,10 +3921,10 @@
       <w:szCs w:val="28"/>
     </w:rPr>
   </w:style>
-  <w:style w:type="character" w:customStyle="1" w:styleId="Heading4Char">
-    <w:name w:val="Heading 4 Char"/>
-    <w:basedOn w:val="DefaultParagraphFont"/>
-    <w:link w:val="Heading4"/>
+  <w:style w:type="character" w:customStyle="1" w:styleId="Ttulo4Car">
+    <w:name w:val="Título 4 Car"/>
+    <w:basedOn w:val="Fuentedeprrafopredeter"/>
+    <w:link w:val="Ttulo4"/>
     <w:uiPriority w:val="9"/>
     <w:semiHidden/>
     <w:rsid w:val="001A62EF"/>
@@ -3846,10 +3935,10 @@
       <w:color w:val="0F4761" w:themeColor="accent1" w:themeShade="BF"/>
     </w:rPr>
   </w:style>
-  <w:style w:type="character" w:customStyle="1" w:styleId="Heading5Char">
-    <w:name w:val="Heading 5 Char"/>
-    <w:basedOn w:val="DefaultParagraphFont"/>
-    <w:link w:val="Heading5"/>
+  <w:style w:type="character" w:customStyle="1" w:styleId="Ttulo5Car">
+    <w:name w:val="Título 5 Car"/>
+    <w:basedOn w:val="Fuentedeprrafopredeter"/>
+    <w:link w:val="Ttulo5"/>
     <w:uiPriority w:val="9"/>
     <w:semiHidden/>
     <w:rsid w:val="001A62EF"/>
@@ -3858,10 +3947,10 @@
       <w:color w:val="0F4761" w:themeColor="accent1" w:themeShade="BF"/>
     </w:rPr>
   </w:style>
-  <w:style w:type="character" w:customStyle="1" w:styleId="Heading6Char">
-    <w:name w:val="Heading 6 Char"/>
-    <w:basedOn w:val="DefaultParagraphFont"/>
-    <w:link w:val="Heading6"/>
+  <w:style w:type="character" w:customStyle="1" w:styleId="Ttulo6Car">
+    <w:name w:val="Título 6 Car"/>
+    <w:basedOn w:val="Fuentedeprrafopredeter"/>
+    <w:link w:val="Ttulo6"/>
     <w:uiPriority w:val="9"/>
     <w:semiHidden/>
     <w:rsid w:val="001A62EF"/>
@@ -3872,10 +3961,10 @@
       <w:color w:val="595959" w:themeColor="text1" w:themeTint="A6"/>
     </w:rPr>
   </w:style>
-  <w:style w:type="character" w:customStyle="1" w:styleId="Heading7Char">
-    <w:name w:val="Heading 7 Char"/>
-    <w:basedOn w:val="DefaultParagraphFont"/>
-    <w:link w:val="Heading7"/>
+  <w:style w:type="character" w:customStyle="1" w:styleId="Ttulo7Car">
+    <w:name w:val="Título 7 Car"/>
+    <w:basedOn w:val="Fuentedeprrafopredeter"/>
+    <w:link w:val="Ttulo7"/>
     <w:uiPriority w:val="9"/>
     <w:semiHidden/>
     <w:rsid w:val="001A62EF"/>
@@ -3884,10 +3973,10 @@
       <w:color w:val="595959" w:themeColor="text1" w:themeTint="A6"/>
     </w:rPr>
   </w:style>
-  <w:style w:type="character" w:customStyle="1" w:styleId="Heading8Char">
-    <w:name w:val="Heading 8 Char"/>
-    <w:basedOn w:val="DefaultParagraphFont"/>
-    <w:link w:val="Heading8"/>
+  <w:style w:type="character" w:customStyle="1" w:styleId="Ttulo8Car">
+    <w:name w:val="Título 8 Car"/>
+    <w:basedOn w:val="Fuentedeprrafopredeter"/>
+    <w:link w:val="Ttulo8"/>
     <w:uiPriority w:val="9"/>
     <w:semiHidden/>
     <w:rsid w:val="001A62EF"/>
@@ -3898,10 +3987,10 @@
       <w:color w:val="272727" w:themeColor="text1" w:themeTint="D8"/>
     </w:rPr>
   </w:style>
-  <w:style w:type="character" w:customStyle="1" w:styleId="Heading9Char">
-    <w:name w:val="Heading 9 Char"/>
-    <w:basedOn w:val="DefaultParagraphFont"/>
-    <w:link w:val="Heading9"/>
+  <w:style w:type="character" w:customStyle="1" w:styleId="Ttulo9Car">
+    <w:name w:val="Título 9 Car"/>
+    <w:basedOn w:val="Fuentedeprrafopredeter"/>
+    <w:link w:val="Ttulo9"/>
     <w:uiPriority w:val="9"/>
     <w:semiHidden/>
     <w:rsid w:val="001A62EF"/>
@@ -3910,11 +3999,11 @@
       <w:color w:val="272727" w:themeColor="text1" w:themeTint="D8"/>
     </w:rPr>
   </w:style>
-  <w:style w:type="paragraph" w:styleId="Title">
+  <w:style w:type="paragraph" w:styleId="Ttulo">
     <w:name w:val="Title"/>
     <w:basedOn w:val="Normal"/>
     <w:next w:val="Normal"/>
-    <w:link w:val="TitleChar"/>
+    <w:link w:val="TtuloCar"/>
     <w:uiPriority w:val="10"/>
     <w:qFormat/>
     <w:rsid w:val="001A62EF"/>
@@ -3930,10 +4019,10 @@
       <w:szCs w:val="56"/>
     </w:rPr>
   </w:style>
-  <w:style w:type="character" w:customStyle="1" w:styleId="TitleChar">
-    <w:name w:val="Title Char"/>
-    <w:basedOn w:val="DefaultParagraphFont"/>
-    <w:link w:val="Title"/>
+  <w:style w:type="character" w:customStyle="1" w:styleId="TtuloCar">
+    <w:name w:val="Título Car"/>
+    <w:basedOn w:val="Fuentedeprrafopredeter"/>
+    <w:link w:val="Ttulo"/>
     <w:uiPriority w:val="10"/>
     <w:rsid w:val="001A62EF"/>
     <w:rPr>
@@ -3944,11 +4033,11 @@
       <w:szCs w:val="56"/>
     </w:rPr>
   </w:style>
-  <w:style w:type="paragraph" w:styleId="Subtitle">
+  <w:style w:type="paragraph" w:styleId="Subttulo">
     <w:name w:val="Subtitle"/>
     <w:basedOn w:val="Normal"/>
     <w:next w:val="Normal"/>
-    <w:link w:val="SubtitleChar"/>
+    <w:link w:val="SubttuloCar"/>
     <w:uiPriority w:val="11"/>
     <w:qFormat/>
     <w:rsid w:val="001A62EF"/>
@@ -3965,10 +4054,10 @@
       <w:szCs w:val="28"/>
     </w:rPr>
   </w:style>
-  <w:style w:type="character" w:customStyle="1" w:styleId="SubtitleChar">
-    <w:name w:val="Subtitle Char"/>
-    <w:basedOn w:val="DefaultParagraphFont"/>
-    <w:link w:val="Subtitle"/>
+  <w:style w:type="character" w:customStyle="1" w:styleId="SubttuloCar">
+    <w:name w:val="Subtítulo Car"/>
+    <w:basedOn w:val="Fuentedeprrafopredeter"/>
+    <w:link w:val="Subttulo"/>
     <w:uiPriority w:val="11"/>
     <w:rsid w:val="001A62EF"/>
     <w:rPr>
@@ -3979,11 +4068,11 @@
       <w:szCs w:val="28"/>
     </w:rPr>
   </w:style>
-  <w:style w:type="paragraph" w:styleId="Quote">
+  <w:style w:type="paragraph" w:styleId="Cita">
     <w:name w:val="Quote"/>
     <w:basedOn w:val="Normal"/>
     <w:next w:val="Normal"/>
-    <w:link w:val="QuoteChar"/>
+    <w:link w:val="CitaCar"/>
     <w:uiPriority w:val="29"/>
     <w:qFormat/>
     <w:rsid w:val="001A62EF"/>
@@ -3997,10 +4086,10 @@
       <w:color w:val="404040" w:themeColor="text1" w:themeTint="BF"/>
     </w:rPr>
   </w:style>
-  <w:style w:type="character" w:customStyle="1" w:styleId="QuoteChar">
-    <w:name w:val="Quote Char"/>
-    <w:basedOn w:val="DefaultParagraphFont"/>
-    <w:link w:val="Quote"/>
+  <w:style w:type="character" w:customStyle="1" w:styleId="CitaCar">
+    <w:name w:val="Cita Car"/>
+    <w:basedOn w:val="Fuentedeprrafopredeter"/>
+    <w:link w:val="Cita"/>
     <w:uiPriority w:val="29"/>
     <w:rsid w:val="001A62EF"/>
     <w:rPr>
@@ -4009,7 +4098,7 @@
       <w:color w:val="404040" w:themeColor="text1" w:themeTint="BF"/>
     </w:rPr>
   </w:style>
-  <w:style w:type="paragraph" w:styleId="ListParagraph">
+  <w:style w:type="paragraph" w:styleId="Prrafodelista">
     <w:name w:val="List Paragraph"/>
     <w:basedOn w:val="Normal"/>
     <w:uiPriority w:val="34"/>
@@ -4020,9 +4109,9 @@
       <w:contextualSpacing/>
     </w:pPr>
   </w:style>
-  <w:style w:type="character" w:styleId="IntenseEmphasis">
+  <w:style w:type="character" w:styleId="nfasisintenso">
     <w:name w:val="Intense Emphasis"/>
-    <w:basedOn w:val="DefaultParagraphFont"/>
+    <w:basedOn w:val="Fuentedeprrafopredeter"/>
     <w:uiPriority w:val="21"/>
     <w:qFormat/>
     <w:rsid w:val="001A62EF"/>
@@ -4032,11 +4121,11 @@
       <w:color w:val="0F4761" w:themeColor="accent1" w:themeShade="BF"/>
     </w:rPr>
   </w:style>
-  <w:style w:type="paragraph" w:styleId="IntenseQuote">
+  <w:style w:type="paragraph" w:styleId="Citadestacada">
     <w:name w:val="Intense Quote"/>
     <w:basedOn w:val="Normal"/>
     <w:next w:val="Normal"/>
-    <w:link w:val="IntenseQuoteChar"/>
+    <w:link w:val="CitadestacadaCar"/>
     <w:uiPriority w:val="30"/>
     <w:qFormat/>
     <w:rsid w:val="001A62EF"/>
@@ -4055,10 +4144,10 @@
       <w:color w:val="0F4761" w:themeColor="accent1" w:themeShade="BF"/>
     </w:rPr>
   </w:style>
-  <w:style w:type="character" w:customStyle="1" w:styleId="IntenseQuoteChar">
-    <w:name w:val="Intense Quote Char"/>
-    <w:basedOn w:val="DefaultParagraphFont"/>
-    <w:link w:val="IntenseQuote"/>
+  <w:style w:type="character" w:customStyle="1" w:styleId="CitadestacadaCar">
+    <w:name w:val="Cita destacada Car"/>
+    <w:basedOn w:val="Fuentedeprrafopredeter"/>
+    <w:link w:val="Citadestacada"/>
     <w:uiPriority w:val="30"/>
     <w:rsid w:val="001A62EF"/>
     <w:rPr>
@@ -4067,9 +4156,9 @@
       <w:color w:val="0F4761" w:themeColor="accent1" w:themeShade="BF"/>
     </w:rPr>
   </w:style>
-  <w:style w:type="character" w:styleId="IntenseReference">
+  <w:style w:type="character" w:styleId="Referenciaintensa">
     <w:name w:val="Intense Reference"/>
-    <w:basedOn w:val="DefaultParagraphFont"/>
+    <w:basedOn w:val="Fuentedeprrafopredeter"/>
     <w:uiPriority w:val="32"/>
     <w:qFormat/>
     <w:rsid w:val="001A62EF"/>
@@ -4081,9 +4170,9 @@
       <w:spacing w:val="5"/>
     </w:rPr>
   </w:style>
-  <w:style w:type="table" w:styleId="TableGrid">
+  <w:style w:type="table" w:styleId="Tablaconcuadrcula">
     <w:name w:val="Table Grid"/>
-    <w:basedOn w:val="TableNormal"/>
+    <w:basedOn w:val="Tablanormal"/>
     <w:uiPriority w:val="39"/>
     <w:rsid w:val="0045417D"/>
     <w:pPr>
@@ -4100,7 +4189,7 @@
       </w:tblBorders>
     </w:tblPr>
   </w:style>
-  <w:style w:type="paragraph" w:styleId="Revision">
+  <w:style w:type="paragraph" w:styleId="Revisin">
     <w:name w:val="Revision"/>
     <w:hidden/>
     <w:uiPriority w:val="99"/>
@@ -4110,10 +4199,10 @@
       <w:spacing w:after="0" w:line="240" w:lineRule="auto"/>
     </w:pPr>
   </w:style>
-  <w:style w:type="paragraph" w:styleId="Header">
+  <w:style w:type="paragraph" w:styleId="Encabezado">
     <w:name w:val="header"/>
     <w:basedOn w:val="Normal"/>
-    <w:link w:val="HeaderChar"/>
+    <w:link w:val="EncabezadoCar"/>
     <w:uiPriority w:val="99"/>
     <w:unhideWhenUsed/>
     <w:rsid w:val="002818BE"/>
@@ -4125,17 +4214,17 @@
       <w:spacing w:after="0" w:line="240" w:lineRule="auto"/>
     </w:pPr>
   </w:style>
-  <w:style w:type="character" w:customStyle="1" w:styleId="HeaderChar">
-    <w:name w:val="Header Char"/>
-    <w:basedOn w:val="DefaultParagraphFont"/>
-    <w:link w:val="Header"/>
+  <w:style w:type="character" w:customStyle="1" w:styleId="EncabezadoCar">
+    <w:name w:val="Encabezado Car"/>
+    <w:basedOn w:val="Fuentedeprrafopredeter"/>
+    <w:link w:val="Encabezado"/>
     <w:uiPriority w:val="99"/>
     <w:rsid w:val="002818BE"/>
   </w:style>
-  <w:style w:type="paragraph" w:styleId="Footer">
+  <w:style w:type="paragraph" w:styleId="Piedepgina">
     <w:name w:val="footer"/>
     <w:basedOn w:val="Normal"/>
-    <w:link w:val="FooterChar"/>
+    <w:link w:val="PiedepginaCar"/>
     <w:uiPriority w:val="99"/>
     <w:unhideWhenUsed/>
     <w:rsid w:val="002818BE"/>
@@ -4147,10 +4236,10 @@
       <w:spacing w:after="0" w:line="240" w:lineRule="auto"/>
     </w:pPr>
   </w:style>
-  <w:style w:type="character" w:customStyle="1" w:styleId="FooterChar">
-    <w:name w:val="Footer Char"/>
-    <w:basedOn w:val="DefaultParagraphFont"/>
-    <w:link w:val="Footer"/>
+  <w:style w:type="character" w:customStyle="1" w:styleId="PiedepginaCar">
+    <w:name w:val="Pie de página Car"/>
+    <w:basedOn w:val="Fuentedeprrafopredeter"/>
+    <w:link w:val="Piedepgina"/>
     <w:uiPriority w:val="99"/>
     <w:rsid w:val="002818BE"/>
   </w:style>

</xml_diff>

<commit_message>
Time Sheet and Status Report updates
</commit_message>
<xml_diff>
--- a/Documentation/Records and Status Reports/Time Sheet.docx
+++ b/Documentation/Records and Status Reports/Time Sheet.docx
@@ -62,7 +62,7 @@
     </w:p>
     <w:tbl>
       <w:tblPr>
-        <w:tblStyle w:val="Tablaconcuadrcula"/>
+        <w:tblStyle w:val="TableGrid"/>
         <w:tblW w:w="0" w:type="auto"/>
         <w:tblLook w:val="04A0" w:firstRow="1" w:lastRow="0" w:firstColumn="1" w:lastColumn="0" w:noHBand="0" w:noVBand="1"/>
       </w:tblPr>
@@ -149,7 +149,7 @@
           </w:tcPr>
           <w:p>
             <w:pPr>
-              <w:pStyle w:val="Prrafodelista"/>
+              <w:pStyle w:val="ListParagraph"/>
               <w:numPr>
                 <w:ilvl w:val="0"/>
                 <w:numId w:val="1"/>
@@ -168,7 +168,7 @@
           </w:p>
           <w:p>
             <w:pPr>
-              <w:pStyle w:val="Prrafodelista"/>
+              <w:pStyle w:val="ListParagraph"/>
               <w:numPr>
                 <w:ilvl w:val="0"/>
                 <w:numId w:val="1"/>
@@ -187,7 +187,7 @@
           </w:p>
           <w:p>
             <w:pPr>
-              <w:pStyle w:val="Prrafodelista"/>
+              <w:pStyle w:val="ListParagraph"/>
               <w:numPr>
                 <w:ilvl w:val="0"/>
                 <w:numId w:val="1"/>
@@ -268,7 +268,7 @@
           </w:tcPr>
           <w:p>
             <w:pPr>
-              <w:pStyle w:val="Prrafodelista"/>
+              <w:pStyle w:val="ListParagraph"/>
               <w:numPr>
                 <w:ilvl w:val="0"/>
                 <w:numId w:val="1"/>
@@ -384,7 +384,7 @@
           </w:tcPr>
           <w:p>
             <w:pPr>
-              <w:pStyle w:val="Prrafodelista"/>
+              <w:pStyle w:val="ListParagraph"/>
               <w:numPr>
                 <w:ilvl w:val="0"/>
                 <w:numId w:val="1"/>
@@ -436,7 +436,7 @@
           </w:tcPr>
           <w:p>
             <w:pPr>
-              <w:pStyle w:val="Prrafodelista"/>
+              <w:pStyle w:val="ListParagraph"/>
               <w:numPr>
                 <w:ilvl w:val="0"/>
                 <w:numId w:val="1"/>
@@ -455,7 +455,7 @@
           </w:p>
           <w:p>
             <w:pPr>
-              <w:pStyle w:val="Prrafodelista"/>
+              <w:pStyle w:val="ListParagraph"/>
               <w:numPr>
                 <w:ilvl w:val="0"/>
                 <w:numId w:val="1"/>
@@ -501,11 +501,22 @@
           </w:tcPr>
           <w:p>
             <w:pPr>
-              <w:spacing w:line="360" w:lineRule="auto"/>
-              <w:rPr>
-                <w:rFonts w:ascii="Times New Roman" w:hAnsi="Times New Roman" w:cs="Times New Roman"/>
-              </w:rPr>
-            </w:pPr>
+              <w:pStyle w:val="ListParagraph"/>
+              <w:numPr>
+                <w:ilvl w:val="0"/>
+                <w:numId w:val="1"/>
+              </w:numPr>
+              <w:spacing w:line="360" w:lineRule="auto"/>
+              <w:rPr>
+                <w:rFonts w:ascii="Times New Roman" w:hAnsi="Times New Roman" w:cs="Times New Roman"/>
+              </w:rPr>
+            </w:pPr>
+            <w:r>
+              <w:rPr>
+                <w:rFonts w:ascii="Times New Roman" w:hAnsi="Times New Roman" w:cs="Times New Roman"/>
+              </w:rPr>
+              <w:t>~5 hours working on GUI components (03/28)</w:t>
+            </w:r>
           </w:p>
         </w:tc>
       </w:tr>
@@ -650,7 +661,7 @@
     </w:p>
     <w:tbl>
       <w:tblPr>
-        <w:tblStyle w:val="Tablaconcuadrcula"/>
+        <w:tblStyle w:val="TableGrid"/>
         <w:tblW w:w="0" w:type="auto"/>
         <w:tblLook w:val="04A0" w:firstRow="1" w:lastRow="0" w:firstColumn="1" w:lastColumn="0" w:noHBand="0" w:noVBand="1"/>
       </w:tblPr>
@@ -737,7 +748,7 @@
           </w:tcPr>
           <w:p>
             <w:pPr>
-              <w:pStyle w:val="Prrafodelista"/>
+              <w:pStyle w:val="ListParagraph"/>
               <w:numPr>
                 <w:ilvl w:val="0"/>
                 <w:numId w:val="1"/>
@@ -756,7 +767,7 @@
           </w:p>
           <w:p>
             <w:pPr>
-              <w:pStyle w:val="Prrafodelista"/>
+              <w:pStyle w:val="ListParagraph"/>
               <w:numPr>
                 <w:ilvl w:val="0"/>
                 <w:numId w:val="1"/>
@@ -837,7 +848,7 @@
           </w:tcPr>
           <w:p>
             <w:pPr>
-              <w:pStyle w:val="Prrafodelista"/>
+              <w:pStyle w:val="ListParagraph"/>
               <w:numPr>
                 <w:ilvl w:val="0"/>
                 <w:numId w:val="1"/>
@@ -883,7 +894,7 @@
           </w:tcPr>
           <w:p>
             <w:pPr>
-              <w:pStyle w:val="Prrafodelista"/>
+              <w:pStyle w:val="ListParagraph"/>
               <w:numPr>
                 <w:ilvl w:val="0"/>
                 <w:numId w:val="1"/>
@@ -965,7 +976,7 @@
           </w:tcPr>
           <w:p>
             <w:pPr>
-              <w:pStyle w:val="Prrafodelista"/>
+              <w:pStyle w:val="ListParagraph"/>
               <w:numPr>
                 <w:ilvl w:val="0"/>
                 <w:numId w:val="1"/>
@@ -1017,7 +1028,7 @@
           </w:tcPr>
           <w:p>
             <w:pPr>
-              <w:pStyle w:val="Prrafodelista"/>
+              <w:pStyle w:val="ListParagraph"/>
               <w:numPr>
                 <w:ilvl w:val="0"/>
                 <w:numId w:val="1"/>
@@ -1063,7 +1074,7 @@
           </w:tcPr>
           <w:p>
             <w:pPr>
-              <w:pStyle w:val="Prrafodelista"/>
+              <w:pStyle w:val="ListParagraph"/>
               <w:numPr>
                 <w:ilvl w:val="0"/>
                 <w:numId w:val="1"/>
@@ -1085,6 +1096,37 @@
                 <w:lang w:val="es-AR"/>
               </w:rPr>
               <w:t>meeting (03/25)</w:t>
+            </w:r>
+          </w:p>
+          <w:p>
+            <w:pPr>
+              <w:pStyle w:val="ListParagraph"/>
+              <w:numPr>
+                <w:ilvl w:val="0"/>
+                <w:numId w:val="1"/>
+              </w:numPr>
+              <w:spacing w:line="360" w:lineRule="auto"/>
+              <w:rPr>
+                <w:rFonts w:ascii="Times New Roman" w:hAnsi="Times New Roman" w:cs="Times New Roman"/>
+              </w:rPr>
+            </w:pPr>
+            <w:r>
+              <w:rPr>
+                <w:rFonts w:ascii="Times New Roman" w:hAnsi="Times New Roman" w:cs="Times New Roman"/>
+              </w:rPr>
+              <w:t>~</w:t>
+            </w:r>
+            <w:r>
+              <w:rPr>
+                <w:rFonts w:ascii="Times New Roman" w:hAnsi="Times New Roman" w:cs="Times New Roman"/>
+              </w:rPr>
+              <w:t>5</w:t>
+            </w:r>
+            <w:r>
+              <w:rPr>
+                <w:rFonts w:ascii="Times New Roman" w:hAnsi="Times New Roman" w:cs="Times New Roman"/>
+              </w:rPr>
+              <w:t xml:space="preserve"> hours working on GUI components (03/28)</w:t>
             </w:r>
           </w:p>
         </w:tc>
@@ -1222,7 +1264,7 @@
     </w:p>
     <w:tbl>
       <w:tblPr>
-        <w:tblStyle w:val="Tablaconcuadrcula"/>
+        <w:tblStyle w:val="TableGrid"/>
         <w:tblW w:w="0" w:type="auto"/>
         <w:tblLook w:val="04A0" w:firstRow="1" w:lastRow="0" w:firstColumn="1" w:lastColumn="0" w:noHBand="0" w:noVBand="1"/>
       </w:tblPr>
@@ -1309,7 +1351,7 @@
           </w:tcPr>
           <w:p>
             <w:pPr>
-              <w:pStyle w:val="Prrafodelista"/>
+              <w:pStyle w:val="ListParagraph"/>
               <w:numPr>
                 <w:ilvl w:val="0"/>
                 <w:numId w:val="1"/>
@@ -1328,7 +1370,7 @@
           </w:p>
           <w:p>
             <w:pPr>
-              <w:pStyle w:val="Prrafodelista"/>
+              <w:pStyle w:val="ListParagraph"/>
               <w:numPr>
                 <w:ilvl w:val="0"/>
                 <w:numId w:val="1"/>
@@ -1347,7 +1389,7 @@
           </w:p>
           <w:p>
             <w:pPr>
-              <w:pStyle w:val="Prrafodelista"/>
+              <w:pStyle w:val="ListParagraph"/>
               <w:numPr>
                 <w:ilvl w:val="0"/>
                 <w:numId w:val="1"/>
@@ -1469,7 +1511,7 @@
           </w:tcPr>
           <w:p>
             <w:pPr>
-              <w:pStyle w:val="Prrafodelista"/>
+              <w:pStyle w:val="ListParagraph"/>
               <w:numPr>
                 <w:ilvl w:val="0"/>
                 <w:numId w:val="1"/>
@@ -1550,7 +1592,7 @@
           </w:tcPr>
           <w:p>
             <w:pPr>
-              <w:pStyle w:val="Prrafodelista"/>
+              <w:pStyle w:val="ListParagraph"/>
               <w:numPr>
                 <w:ilvl w:val="0"/>
                 <w:numId w:val="1"/>
@@ -1602,7 +1644,7 @@
           </w:tcPr>
           <w:p>
             <w:pPr>
-              <w:pStyle w:val="Prrafodelista"/>
+              <w:pStyle w:val="ListParagraph"/>
               <w:numPr>
                 <w:ilvl w:val="0"/>
                 <w:numId w:val="1"/>
@@ -1648,11 +1690,60 @@
           </w:tcPr>
           <w:p>
             <w:pPr>
-              <w:spacing w:line="360" w:lineRule="auto"/>
-              <w:rPr>
-                <w:rFonts w:ascii="Times New Roman" w:hAnsi="Times New Roman" w:cs="Times New Roman"/>
-              </w:rPr>
-            </w:pPr>
+              <w:pStyle w:val="ListParagraph"/>
+              <w:numPr>
+                <w:ilvl w:val="0"/>
+                <w:numId w:val="1"/>
+              </w:numPr>
+              <w:spacing w:line="360" w:lineRule="auto"/>
+              <w:rPr>
+                <w:rFonts w:ascii="Times New Roman" w:hAnsi="Times New Roman" w:cs="Times New Roman"/>
+              </w:rPr>
+            </w:pPr>
+            <w:r>
+              <w:rPr>
+                <w:rFonts w:ascii="Times New Roman" w:hAnsi="Times New Roman" w:cs="Times New Roman"/>
+              </w:rPr>
+              <w:t>~</w:t>
+            </w:r>
+            <w:r>
+              <w:rPr>
+                <w:rFonts w:ascii="Times New Roman" w:hAnsi="Times New Roman" w:cs="Times New Roman"/>
+              </w:rPr>
+              <w:t>2.5</w:t>
+            </w:r>
+            <w:r>
+              <w:rPr>
+                <w:rFonts w:ascii="Times New Roman" w:hAnsi="Times New Roman" w:cs="Times New Roman"/>
+              </w:rPr>
+              <w:t xml:space="preserve"> </w:t>
+            </w:r>
+            <w:proofErr w:type="gramStart"/>
+            <w:r>
+              <w:rPr>
+                <w:rFonts w:ascii="Times New Roman" w:hAnsi="Times New Roman" w:cs="Times New Roman"/>
+              </w:rPr>
+              <w:t>hour</w:t>
+            </w:r>
+            <w:proofErr w:type="gramEnd"/>
+            <w:r>
+              <w:rPr>
+                <w:rFonts w:ascii="Times New Roman" w:hAnsi="Times New Roman" w:cs="Times New Roman"/>
+              </w:rPr>
+              <w:t xml:space="preserve"> working on GUI components (03/28</w:t>
+            </w:r>
+            <w:r>
+              <w:rPr>
+                <w:rFonts w:ascii="Times New Roman" w:hAnsi="Times New Roman" w:cs="Times New Roman"/>
+              </w:rPr>
+              <w:t>-03/29</w:t>
+            </w:r>
+            <w:r>
+              <w:rPr>
+                <w:rFonts w:ascii="Times New Roman" w:hAnsi="Times New Roman" w:cs="Times New Roman"/>
+              </w:rPr>
+              <w:t>)</w:t>
+            </w:r>
           </w:p>
         </w:tc>
       </w:tr>
@@ -1789,7 +1880,7 @@
     </w:p>
     <w:tbl>
       <w:tblPr>
-        <w:tblStyle w:val="Tablaconcuadrcula"/>
+        <w:tblStyle w:val="TableGrid"/>
         <w:tblW w:w="0" w:type="auto"/>
         <w:tblLook w:val="04A0" w:firstRow="1" w:lastRow="0" w:firstColumn="1" w:lastColumn="0" w:noHBand="0" w:noVBand="1"/>
       </w:tblPr>
@@ -1866,6 +1957,7 @@
               <w:rPr>
                 <w:rFonts w:ascii="Times New Roman" w:hAnsi="Times New Roman" w:cs="Times New Roman"/>
               </w:rPr>
+              <w:lastRenderedPageBreak/>
               <w:t>02/02 – 02/07</w:t>
             </w:r>
           </w:p>
@@ -1876,7 +1968,7 @@
           </w:tcPr>
           <w:p>
             <w:pPr>
-              <w:pStyle w:val="Prrafodelista"/>
+              <w:pStyle w:val="ListParagraph"/>
               <w:numPr>
                 <w:ilvl w:val="0"/>
                 <w:numId w:val="1"/>
@@ -1896,92 +1988,900 @@
               <w:rPr>
                 <w:rFonts w:ascii="Times New Roman" w:hAnsi="Times New Roman" w:cs="Times New Roman"/>
               </w:rPr>
-              <w:t xml:space="preserve">ewing Project Plan outline, creating and formatting documents for record keeping, creating and formatting document </w:t>
-            </w:r>
+              <w:t>ewing Project Plan outline, creating and formatting documents for record keeping, creating and formatting document for Project Plan submission, and creating and organizing GitHub repository (02/02)</w:t>
+            </w:r>
+          </w:p>
+          <w:p>
+            <w:pPr>
+              <w:pStyle w:val="ListParagraph"/>
+              <w:numPr>
+                <w:ilvl w:val="0"/>
+                <w:numId w:val="1"/>
+              </w:numPr>
+              <w:spacing w:line="360" w:lineRule="auto"/>
+              <w:rPr>
+                <w:rFonts w:ascii="Times New Roman" w:hAnsi="Times New Roman" w:cs="Times New Roman"/>
+              </w:rPr>
+            </w:pPr>
+            <w:proofErr w:type="gramStart"/>
+            <w:r>
+              <w:rPr>
+                <w:rFonts w:ascii="Times New Roman" w:hAnsi="Times New Roman" w:cs="Times New Roman"/>
+              </w:rPr>
+              <w:t>2 hour</w:t>
+            </w:r>
+            <w:proofErr w:type="gramEnd"/>
+            <w:r>
+              <w:rPr>
+                <w:rFonts w:ascii="Times New Roman" w:hAnsi="Times New Roman" w:cs="Times New Roman"/>
+              </w:rPr>
+              <w:t xml:space="preserve"> team meeting (02/03)</w:t>
+            </w:r>
+          </w:p>
+          <w:p>
+            <w:pPr>
+              <w:pStyle w:val="ListParagraph"/>
+              <w:numPr>
+                <w:ilvl w:val="0"/>
+                <w:numId w:val="1"/>
+              </w:numPr>
+              <w:spacing w:line="360" w:lineRule="auto"/>
+              <w:rPr>
+                <w:rFonts w:ascii="Times New Roman" w:hAnsi="Times New Roman" w:cs="Times New Roman"/>
+              </w:rPr>
+            </w:pPr>
+            <w:r>
+              <w:rPr>
+                <w:rFonts w:ascii="Times New Roman" w:hAnsi="Times New Roman" w:cs="Times New Roman"/>
+              </w:rPr>
+              <w:t>2.2 hours updating resume, listing tasks for Project Plan’s scope, assigning and clarifying team roles, confirming and recording team resources/tools (02/04)</w:t>
+            </w:r>
+          </w:p>
+          <w:p>
+            <w:pPr>
+              <w:pStyle w:val="ListParagraph"/>
+              <w:numPr>
+                <w:ilvl w:val="0"/>
+                <w:numId w:val="1"/>
+              </w:numPr>
+              <w:spacing w:line="360" w:lineRule="auto"/>
+              <w:rPr>
+                <w:rFonts w:ascii="Times New Roman" w:hAnsi="Times New Roman" w:cs="Times New Roman"/>
+              </w:rPr>
+            </w:pPr>
+            <w:r>
+              <w:rPr>
+                <w:rFonts w:ascii="Times New Roman" w:hAnsi="Times New Roman" w:cs="Times New Roman"/>
+              </w:rPr>
+              <w:t>2 hours working on WBS (02/05)</w:t>
+            </w:r>
+          </w:p>
+        </w:tc>
+      </w:tr>
+      <w:tr>
+        <w:tc>
+          <w:tcPr>
+            <w:tcW w:w="1975" w:type="dxa"/>
+          </w:tcPr>
+          <w:p>
+            <w:pPr>
+              <w:spacing w:line="360" w:lineRule="auto"/>
+              <w:jc w:val="center"/>
+              <w:rPr>
+                <w:rFonts w:ascii="Times New Roman" w:hAnsi="Times New Roman" w:cs="Times New Roman"/>
+              </w:rPr>
+            </w:pPr>
+            <w:r>
+              <w:rPr>
+                <w:rFonts w:ascii="Times New Roman" w:hAnsi="Times New Roman" w:cs="Times New Roman"/>
+              </w:rPr>
+              <w:t>02/08 – 02/14</w:t>
+            </w:r>
+          </w:p>
+        </w:tc>
+        <w:tc>
+          <w:tcPr>
+            <w:tcW w:w="7375" w:type="dxa"/>
+          </w:tcPr>
+          <w:p>
+            <w:pPr>
+              <w:pStyle w:val="ListParagraph"/>
+              <w:numPr>
+                <w:ilvl w:val="0"/>
+                <w:numId w:val="1"/>
+              </w:numPr>
+              <w:spacing w:line="360" w:lineRule="auto"/>
+              <w:rPr>
+                <w:rFonts w:ascii="Times New Roman" w:hAnsi="Times New Roman" w:cs="Times New Roman"/>
+              </w:rPr>
+            </w:pPr>
+            <w:r>
+              <w:rPr>
+                <w:rFonts w:ascii="Times New Roman" w:hAnsi="Times New Roman" w:cs="Times New Roman"/>
+              </w:rPr>
+              <w:t>2.2 hours working on the testing section of the Project Plan, updating my resume, and updating meeting notes (02/10)</w:t>
+            </w:r>
+          </w:p>
+          <w:p>
+            <w:pPr>
+              <w:pStyle w:val="ListParagraph"/>
+              <w:numPr>
+                <w:ilvl w:val="0"/>
+                <w:numId w:val="1"/>
+              </w:numPr>
+              <w:spacing w:line="360" w:lineRule="auto"/>
+              <w:rPr>
+                <w:rFonts w:ascii="Times New Roman" w:hAnsi="Times New Roman" w:cs="Times New Roman"/>
+              </w:rPr>
+            </w:pPr>
+            <w:r>
+              <w:rPr>
+                <w:rFonts w:ascii="Times New Roman" w:hAnsi="Times New Roman" w:cs="Times New Roman"/>
+              </w:rPr>
+              <w:t>1.8 hours completing the testing section, continuing work on WBS (02/12)</w:t>
+            </w:r>
+          </w:p>
+        </w:tc>
+      </w:tr>
+      <w:tr>
+        <w:tc>
+          <w:tcPr>
+            <w:tcW w:w="1975" w:type="dxa"/>
+          </w:tcPr>
+          <w:p>
+            <w:pPr>
+              <w:spacing w:line="360" w:lineRule="auto"/>
+              <w:jc w:val="center"/>
+              <w:rPr>
+                <w:rFonts w:ascii="Times New Roman" w:hAnsi="Times New Roman" w:cs="Times New Roman"/>
+              </w:rPr>
+            </w:pPr>
+            <w:r>
+              <w:rPr>
+                <w:rFonts w:ascii="Times New Roman" w:hAnsi="Times New Roman" w:cs="Times New Roman"/>
+              </w:rPr>
+              <w:t>02/16 – 02/21</w:t>
+            </w:r>
+          </w:p>
+        </w:tc>
+        <w:tc>
+          <w:tcPr>
+            <w:tcW w:w="7375" w:type="dxa"/>
+          </w:tcPr>
+          <w:p>
+            <w:pPr>
+              <w:pStyle w:val="ListParagraph"/>
+              <w:numPr>
+                <w:ilvl w:val="0"/>
+                <w:numId w:val="1"/>
+              </w:numPr>
+              <w:spacing w:line="360" w:lineRule="auto"/>
+              <w:rPr>
+                <w:rFonts w:ascii="Times New Roman" w:hAnsi="Times New Roman" w:cs="Times New Roman"/>
+              </w:rPr>
+            </w:pPr>
+            <w:r>
+              <w:rPr>
+                <w:rFonts w:ascii="Times New Roman" w:hAnsi="Times New Roman" w:cs="Times New Roman"/>
+              </w:rPr>
+              <w:t>57 mins organizing GitHub repo and message team about upcoming schedule and others (02/16)</w:t>
+            </w:r>
+          </w:p>
+          <w:p>
+            <w:pPr>
+              <w:pStyle w:val="ListParagraph"/>
+              <w:numPr>
+                <w:ilvl w:val="0"/>
+                <w:numId w:val="1"/>
+              </w:numPr>
+              <w:spacing w:line="360" w:lineRule="auto"/>
+              <w:rPr>
+                <w:rFonts w:ascii="Times New Roman" w:hAnsi="Times New Roman" w:cs="Times New Roman"/>
+              </w:rPr>
+            </w:pPr>
+            <w:r>
+              <w:rPr>
+                <w:rFonts w:ascii="Times New Roman" w:hAnsi="Times New Roman" w:cs="Times New Roman"/>
+              </w:rPr>
+              <w:t>5.2 hours designing architecture of login/sign up module, drafting GUI, assigning staff usernames (02/16)</w:t>
+            </w:r>
+          </w:p>
+          <w:p>
+            <w:pPr>
+              <w:pStyle w:val="ListParagraph"/>
+              <w:numPr>
+                <w:ilvl w:val="0"/>
+                <w:numId w:val="1"/>
+              </w:numPr>
+              <w:spacing w:line="360" w:lineRule="auto"/>
+              <w:rPr>
+                <w:rFonts w:ascii="Times New Roman" w:hAnsi="Times New Roman" w:cs="Times New Roman"/>
+              </w:rPr>
+            </w:pPr>
+            <w:r>
+              <w:rPr>
+                <w:rFonts w:ascii="Times New Roman" w:hAnsi="Times New Roman" w:cs="Times New Roman"/>
+              </w:rPr>
+              <w:t>40 mins designing initial schema for database (02/17)</w:t>
+            </w:r>
+          </w:p>
+          <w:p>
+            <w:pPr>
+              <w:pStyle w:val="ListParagraph"/>
+              <w:numPr>
+                <w:ilvl w:val="0"/>
+                <w:numId w:val="1"/>
+              </w:numPr>
+              <w:spacing w:line="360" w:lineRule="auto"/>
+              <w:rPr>
+                <w:rFonts w:ascii="Times New Roman" w:hAnsi="Times New Roman" w:cs="Times New Roman"/>
+              </w:rPr>
+            </w:pPr>
+            <w:r>
+              <w:rPr>
+                <w:rFonts w:ascii="Times New Roman" w:hAnsi="Times New Roman" w:cs="Times New Roman"/>
+              </w:rPr>
+              <w:t>30 mins creating database ERD (02/17)</w:t>
+            </w:r>
+          </w:p>
+          <w:p>
+            <w:pPr>
+              <w:pStyle w:val="ListParagraph"/>
+              <w:numPr>
+                <w:ilvl w:val="0"/>
+                <w:numId w:val="1"/>
+              </w:numPr>
+              <w:spacing w:line="360" w:lineRule="auto"/>
+              <w:rPr>
+                <w:rFonts w:ascii="Times New Roman" w:hAnsi="Times New Roman" w:cs="Times New Roman"/>
+              </w:rPr>
+            </w:pPr>
+            <w:r>
+              <w:rPr>
+                <w:rFonts w:ascii="Times New Roman" w:hAnsi="Times New Roman" w:cs="Times New Roman"/>
+              </w:rPr>
+              <w:t>1.2 hour in-class, team meeting (02/17)</w:t>
+            </w:r>
+          </w:p>
+          <w:p>
+            <w:pPr>
+              <w:pStyle w:val="ListParagraph"/>
+              <w:numPr>
+                <w:ilvl w:val="0"/>
+                <w:numId w:val="1"/>
+              </w:numPr>
+              <w:spacing w:line="360" w:lineRule="auto"/>
+              <w:rPr>
+                <w:rFonts w:ascii="Times New Roman" w:hAnsi="Times New Roman" w:cs="Times New Roman"/>
+              </w:rPr>
+            </w:pPr>
+            <w:r>
+              <w:rPr>
+                <w:rFonts w:ascii="Times New Roman" w:hAnsi="Times New Roman" w:cs="Times New Roman"/>
+              </w:rPr>
+              <w:t>1.17 hours making use case diagrams</w:t>
+            </w:r>
+          </w:p>
+        </w:tc>
+      </w:tr>
+      <w:tr>
+        <w:tc>
+          <w:tcPr>
+            <w:tcW w:w="1975" w:type="dxa"/>
+          </w:tcPr>
+          <w:p>
+            <w:pPr>
+              <w:spacing w:line="360" w:lineRule="auto"/>
+              <w:jc w:val="center"/>
+              <w:rPr>
+                <w:rFonts w:ascii="Times New Roman" w:hAnsi="Times New Roman" w:cs="Times New Roman"/>
+              </w:rPr>
+            </w:pPr>
+            <w:r>
+              <w:rPr>
+                <w:rFonts w:ascii="Times New Roman" w:hAnsi="Times New Roman" w:cs="Times New Roman"/>
+              </w:rPr>
+              <w:t>02/23 – 02/28</w:t>
+            </w:r>
+          </w:p>
+        </w:tc>
+        <w:tc>
+          <w:tcPr>
+            <w:tcW w:w="7375" w:type="dxa"/>
+          </w:tcPr>
+          <w:p>
+            <w:pPr>
+              <w:pStyle w:val="ListParagraph"/>
+              <w:numPr>
+                <w:ilvl w:val="0"/>
+                <w:numId w:val="1"/>
+              </w:numPr>
+              <w:spacing w:line="360" w:lineRule="auto"/>
+              <w:rPr>
+                <w:rFonts w:ascii="Times New Roman" w:hAnsi="Times New Roman" w:cs="Times New Roman"/>
+              </w:rPr>
+            </w:pPr>
+            <w:r>
+              <w:rPr>
+                <w:rFonts w:ascii="Times New Roman" w:hAnsi="Times New Roman" w:cs="Times New Roman"/>
+              </w:rPr>
+              <w:t>1 hour completing status report for week 02/16 to 02/20 (02/26)</w:t>
+            </w:r>
+          </w:p>
+          <w:p>
+            <w:pPr>
+              <w:pStyle w:val="ListParagraph"/>
+              <w:numPr>
+                <w:ilvl w:val="0"/>
+                <w:numId w:val="1"/>
+              </w:numPr>
+              <w:spacing w:line="360" w:lineRule="auto"/>
+              <w:rPr>
+                <w:rFonts w:ascii="Times New Roman" w:hAnsi="Times New Roman" w:cs="Times New Roman"/>
+              </w:rPr>
+            </w:pPr>
+            <w:r>
+              <w:rPr>
+                <w:rFonts w:ascii="Times New Roman" w:hAnsi="Times New Roman" w:cs="Times New Roman"/>
+              </w:rPr>
+              <w:t>1 hour team meeting (02/26)</w:t>
+            </w:r>
+          </w:p>
+          <w:p>
+            <w:pPr>
+              <w:pStyle w:val="ListParagraph"/>
+              <w:numPr>
+                <w:ilvl w:val="0"/>
+                <w:numId w:val="1"/>
+              </w:numPr>
+              <w:spacing w:line="360" w:lineRule="auto"/>
+              <w:rPr>
+                <w:rFonts w:ascii="Times New Roman" w:hAnsi="Times New Roman" w:cs="Times New Roman"/>
+              </w:rPr>
+            </w:pPr>
+            <w:r>
+              <w:rPr>
+                <w:rFonts w:ascii="Times New Roman" w:hAnsi="Times New Roman" w:cs="Times New Roman"/>
+              </w:rPr>
+              <w:t>3 hours updating architecture design doc for clock-in/out, drafting GUI for clock-in/out module (02/27, 02/28)</w:t>
+            </w:r>
+          </w:p>
+          <w:p>
+            <w:pPr>
+              <w:pStyle w:val="ListParagraph"/>
+              <w:numPr>
+                <w:ilvl w:val="0"/>
+                <w:numId w:val="1"/>
+              </w:numPr>
+              <w:spacing w:line="360" w:lineRule="auto"/>
+              <w:rPr>
+                <w:rFonts w:ascii="Times New Roman" w:hAnsi="Times New Roman" w:cs="Times New Roman"/>
+              </w:rPr>
+            </w:pPr>
+            <w:r>
+              <w:rPr>
+                <w:rFonts w:ascii="Times New Roman" w:hAnsi="Times New Roman" w:cs="Times New Roman"/>
+              </w:rPr>
+              <w:t>1.67</w:t>
+            </w:r>
+            <w:r>
+              <w:rPr>
+                <w:rFonts w:ascii="Times New Roman" w:hAnsi="Times New Roman" w:cs="Times New Roman"/>
+              </w:rPr>
+              <w:t xml:space="preserve"> hours updating Login GUI drafts, updating Login architecture, updating architecture standards (02/28)</w:t>
+            </w:r>
+          </w:p>
+        </w:tc>
+      </w:tr>
+      <w:tr>
+        <w:tc>
+          <w:tcPr>
+            <w:tcW w:w="1975" w:type="dxa"/>
+          </w:tcPr>
+          <w:p>
+            <w:pPr>
+              <w:spacing w:line="360" w:lineRule="auto"/>
+              <w:jc w:val="center"/>
+              <w:rPr>
+                <w:rFonts w:ascii="Times New Roman" w:hAnsi="Times New Roman" w:cs="Times New Roman"/>
+              </w:rPr>
+            </w:pPr>
+            <w:r>
+              <w:rPr>
+                <w:rFonts w:ascii="Times New Roman" w:hAnsi="Times New Roman" w:cs="Times New Roman"/>
+              </w:rPr>
+              <w:t>03/02 – 03/07</w:t>
+            </w:r>
+          </w:p>
+        </w:tc>
+        <w:tc>
+          <w:tcPr>
+            <w:tcW w:w="7375" w:type="dxa"/>
+          </w:tcPr>
+          <w:p>
+            <w:pPr>
+              <w:pStyle w:val="ListParagraph"/>
+              <w:numPr>
+                <w:ilvl w:val="0"/>
+                <w:numId w:val="1"/>
+              </w:numPr>
+              <w:spacing w:line="360" w:lineRule="auto"/>
+              <w:rPr>
+                <w:rFonts w:ascii="Times New Roman" w:hAnsi="Times New Roman" w:cs="Times New Roman"/>
+              </w:rPr>
+            </w:pPr>
+            <w:r>
+              <w:rPr>
+                <w:rFonts w:ascii="Times New Roman" w:hAnsi="Times New Roman" w:cs="Times New Roman"/>
+              </w:rPr>
+              <w:t>1.7 hours updating schema (03/02)</w:t>
+            </w:r>
+          </w:p>
+          <w:p>
+            <w:pPr>
+              <w:pStyle w:val="ListParagraph"/>
+              <w:numPr>
+                <w:ilvl w:val="0"/>
+                <w:numId w:val="1"/>
+              </w:numPr>
+              <w:spacing w:line="360" w:lineRule="auto"/>
+              <w:rPr>
+                <w:rFonts w:ascii="Times New Roman" w:hAnsi="Times New Roman" w:cs="Times New Roman"/>
+              </w:rPr>
+            </w:pPr>
+            <w:r>
+              <w:rPr>
+                <w:rFonts w:ascii="Times New Roman" w:hAnsi="Times New Roman" w:cs="Times New Roman"/>
+              </w:rPr>
+              <w:t>30 minutes updating status report (03/02)</w:t>
+            </w:r>
+          </w:p>
+        </w:tc>
+      </w:tr>
+      <w:tr>
+        <w:tc>
+          <w:tcPr>
+            <w:tcW w:w="1975" w:type="dxa"/>
+          </w:tcPr>
+          <w:p>
+            <w:pPr>
+              <w:spacing w:line="360" w:lineRule="auto"/>
+              <w:jc w:val="center"/>
+              <w:rPr>
+                <w:rFonts w:ascii="Times New Roman" w:hAnsi="Times New Roman" w:cs="Times New Roman"/>
+              </w:rPr>
+            </w:pPr>
             <w:r>
               <w:rPr>
                 <w:rFonts w:ascii="Times New Roman" w:hAnsi="Times New Roman" w:cs="Times New Roman"/>
               </w:rPr>
               <w:lastRenderedPageBreak/>
-              <w:t>for Project Plan submission, and creating and organizing GitHub repository (02/02)</w:t>
-            </w:r>
-          </w:p>
-          <w:p>
-            <w:pPr>
-              <w:pStyle w:val="Prrafodelista"/>
-              <w:numPr>
-                <w:ilvl w:val="0"/>
-                <w:numId w:val="1"/>
-              </w:numPr>
-              <w:spacing w:line="360" w:lineRule="auto"/>
-              <w:rPr>
-                <w:rFonts w:ascii="Times New Roman" w:hAnsi="Times New Roman" w:cs="Times New Roman"/>
-              </w:rPr>
-            </w:pPr>
-            <w:proofErr w:type="gramStart"/>
-            <w:r>
-              <w:rPr>
-                <w:rFonts w:ascii="Times New Roman" w:hAnsi="Times New Roman" w:cs="Times New Roman"/>
-              </w:rPr>
-              <w:t>2 hour</w:t>
-            </w:r>
-            <w:proofErr w:type="gramEnd"/>
-            <w:r>
-              <w:rPr>
-                <w:rFonts w:ascii="Times New Roman" w:hAnsi="Times New Roman" w:cs="Times New Roman"/>
-              </w:rPr>
-              <w:t xml:space="preserve"> team meeting (02/03)</w:t>
-            </w:r>
-          </w:p>
-          <w:p>
-            <w:pPr>
-              <w:pStyle w:val="Prrafodelista"/>
-              <w:numPr>
-                <w:ilvl w:val="0"/>
-                <w:numId w:val="1"/>
-              </w:numPr>
-              <w:spacing w:line="360" w:lineRule="auto"/>
-              <w:rPr>
-                <w:rFonts w:ascii="Times New Roman" w:hAnsi="Times New Roman" w:cs="Times New Roman"/>
-              </w:rPr>
-            </w:pPr>
-            <w:r>
-              <w:rPr>
-                <w:rFonts w:ascii="Times New Roman" w:hAnsi="Times New Roman" w:cs="Times New Roman"/>
-              </w:rPr>
-              <w:t>2.2 hours updating resume, listing tasks for Project Plan’s scope, assigning and clarifying team roles, confirming and recording team resources/tools (02/04)</w:t>
-            </w:r>
-          </w:p>
-          <w:p>
-            <w:pPr>
-              <w:pStyle w:val="Prrafodelista"/>
-              <w:numPr>
-                <w:ilvl w:val="0"/>
-                <w:numId w:val="1"/>
-              </w:numPr>
-              <w:spacing w:line="360" w:lineRule="auto"/>
-              <w:rPr>
-                <w:rFonts w:ascii="Times New Roman" w:hAnsi="Times New Roman" w:cs="Times New Roman"/>
-              </w:rPr>
-            </w:pPr>
-            <w:r>
-              <w:rPr>
-                <w:rFonts w:ascii="Times New Roman" w:hAnsi="Times New Roman" w:cs="Times New Roman"/>
-              </w:rPr>
-              <w:t>2 hours working on WBS (02/05)</w:t>
-            </w:r>
-          </w:p>
-        </w:tc>
-      </w:tr>
-      <w:tr>
-        <w:tc>
-          <w:tcPr>
-            <w:tcW w:w="1975" w:type="dxa"/>
-          </w:tcPr>
-          <w:p>
-            <w:pPr>
-              <w:spacing w:line="360" w:lineRule="auto"/>
-              <w:jc w:val="center"/>
+              <w:t>03/09 – 03/14</w:t>
+            </w:r>
+          </w:p>
+        </w:tc>
+        <w:tc>
+          <w:tcPr>
+            <w:tcW w:w="7375" w:type="dxa"/>
+          </w:tcPr>
+          <w:p>
+            <w:pPr>
+              <w:pStyle w:val="ListParagraph"/>
+              <w:numPr>
+                <w:ilvl w:val="0"/>
+                <w:numId w:val="1"/>
+              </w:numPr>
+              <w:spacing w:line="360" w:lineRule="auto"/>
+              <w:rPr>
+                <w:rFonts w:ascii="Times New Roman" w:hAnsi="Times New Roman" w:cs="Times New Roman"/>
+              </w:rPr>
+            </w:pPr>
+            <w:r>
+              <w:rPr>
+                <w:rFonts w:ascii="Times New Roman" w:hAnsi="Times New Roman" w:cs="Times New Roman"/>
+              </w:rPr>
+              <w:t>~</w:t>
+            </w:r>
+            <w:r>
+              <w:rPr>
+                <w:rFonts w:ascii="Times New Roman" w:hAnsi="Times New Roman" w:cs="Times New Roman"/>
+              </w:rPr>
+              <w:t xml:space="preserve">1-1.5 hours </w:t>
+            </w:r>
+            <w:r>
+              <w:rPr>
+                <w:rFonts w:ascii="Times New Roman" w:hAnsi="Times New Roman" w:cs="Times New Roman"/>
+              </w:rPr>
+              <w:t>gathering/clarifying</w:t>
+            </w:r>
+            <w:r>
+              <w:rPr>
+                <w:rFonts w:ascii="Times New Roman" w:hAnsi="Times New Roman" w:cs="Times New Roman"/>
+              </w:rPr>
+              <w:t xml:space="preserve"> requirements </w:t>
+            </w:r>
+            <w:r>
+              <w:rPr>
+                <w:rFonts w:ascii="Times New Roman" w:hAnsi="Times New Roman" w:cs="Times New Roman"/>
+              </w:rPr>
+              <w:t>using</w:t>
+            </w:r>
+            <w:r>
+              <w:rPr>
+                <w:rFonts w:ascii="Times New Roman" w:hAnsi="Times New Roman" w:cs="Times New Roman"/>
+              </w:rPr>
+              <w:t xml:space="preserve"> Project </w:t>
+            </w:r>
+            <w:r>
+              <w:rPr>
+                <w:rFonts w:ascii="Times New Roman" w:hAnsi="Times New Roman" w:cs="Times New Roman"/>
+              </w:rPr>
+              <w:t>details and restaurant details documents (03/09)</w:t>
+            </w:r>
+          </w:p>
+          <w:p>
+            <w:pPr>
+              <w:pStyle w:val="ListParagraph"/>
+              <w:numPr>
+                <w:ilvl w:val="0"/>
+                <w:numId w:val="1"/>
+              </w:numPr>
+              <w:spacing w:line="360" w:lineRule="auto"/>
+              <w:rPr>
+                <w:rFonts w:ascii="Times New Roman" w:hAnsi="Times New Roman" w:cs="Times New Roman"/>
+              </w:rPr>
+            </w:pPr>
+            <w:r>
+              <w:rPr>
+                <w:rFonts w:ascii="Times New Roman" w:hAnsi="Times New Roman" w:cs="Times New Roman"/>
+              </w:rPr>
+              <w:t>2 hours updating use case diagrams, creating business flow diagram (03/10)</w:t>
+            </w:r>
+          </w:p>
+          <w:p>
+            <w:pPr>
+              <w:pStyle w:val="ListParagraph"/>
+              <w:numPr>
+                <w:ilvl w:val="0"/>
+                <w:numId w:val="1"/>
+              </w:numPr>
+              <w:spacing w:line="360" w:lineRule="auto"/>
+              <w:rPr>
+                <w:rFonts w:ascii="Times New Roman" w:hAnsi="Times New Roman" w:cs="Times New Roman"/>
+              </w:rPr>
+            </w:pPr>
+            <w:r>
+              <w:rPr>
+                <w:rFonts w:ascii="Times New Roman" w:hAnsi="Times New Roman" w:cs="Times New Roman"/>
+              </w:rPr>
+              <w:t>~</w:t>
+            </w:r>
+            <w:r>
+              <w:rPr>
+                <w:rFonts w:ascii="Times New Roman" w:hAnsi="Times New Roman" w:cs="Times New Roman"/>
+              </w:rPr>
+              <w:t>1 hour categorizing requirements for R</w:t>
+            </w:r>
+            <w:r>
+              <w:rPr>
+                <w:rFonts w:ascii="Times New Roman" w:hAnsi="Times New Roman" w:cs="Times New Roman"/>
+              </w:rPr>
+              <w:t>equirements Document assignment (03/10)</w:t>
+            </w:r>
+          </w:p>
+          <w:p>
+            <w:pPr>
+              <w:pStyle w:val="ListParagraph"/>
+              <w:numPr>
+                <w:ilvl w:val="0"/>
+                <w:numId w:val="1"/>
+              </w:numPr>
+              <w:spacing w:line="360" w:lineRule="auto"/>
+              <w:rPr>
+                <w:rFonts w:ascii="Times New Roman" w:hAnsi="Times New Roman" w:cs="Times New Roman"/>
+              </w:rPr>
+            </w:pPr>
+            <w:r>
+              <w:rPr>
+                <w:rFonts w:ascii="Times New Roman" w:hAnsi="Times New Roman" w:cs="Times New Roman"/>
+              </w:rPr>
+              <w:t>1.5 hours reviewing and editing requirements categorization, assigning requirement IDs</w:t>
+            </w:r>
+            <w:r>
+              <w:rPr>
+                <w:rFonts w:ascii="Times New Roman" w:hAnsi="Times New Roman" w:cs="Times New Roman"/>
+              </w:rPr>
+              <w:t xml:space="preserve"> (03/10)</w:t>
+            </w:r>
+          </w:p>
+          <w:p>
+            <w:pPr>
+              <w:pStyle w:val="ListParagraph"/>
+              <w:numPr>
+                <w:ilvl w:val="0"/>
+                <w:numId w:val="1"/>
+              </w:numPr>
+              <w:spacing w:line="360" w:lineRule="auto"/>
+              <w:rPr>
+                <w:rFonts w:ascii="Times New Roman" w:hAnsi="Times New Roman" w:cs="Times New Roman"/>
+              </w:rPr>
+            </w:pPr>
+            <w:r>
+              <w:rPr>
+                <w:rFonts w:ascii="Times New Roman" w:hAnsi="Times New Roman" w:cs="Times New Roman"/>
+              </w:rPr>
+              <w:t>2.17 hours adding confirmed requirements to Requirement Document, constructing and updating architecture designs, writing code for creating staff profiles (03/11)</w:t>
+            </w:r>
+          </w:p>
+          <w:p>
+            <w:pPr>
+              <w:pStyle w:val="ListParagraph"/>
+              <w:numPr>
+                <w:ilvl w:val="0"/>
+                <w:numId w:val="1"/>
+              </w:numPr>
+              <w:spacing w:line="360" w:lineRule="auto"/>
+              <w:rPr>
+                <w:rFonts w:ascii="Times New Roman" w:hAnsi="Times New Roman" w:cs="Times New Roman"/>
+              </w:rPr>
+            </w:pPr>
+            <w:r>
+              <w:rPr>
+                <w:rFonts w:ascii="Times New Roman" w:hAnsi="Times New Roman" w:cs="Times New Roman"/>
+              </w:rPr>
+              <w:t>1.33 hours updating architecture standards, architecture designs, GUI designs for manager’s ability create/edit/delete staff profiles (03/11)</w:t>
+            </w:r>
+          </w:p>
+          <w:p>
+            <w:pPr>
+              <w:pStyle w:val="ListParagraph"/>
+              <w:numPr>
+                <w:ilvl w:val="0"/>
+                <w:numId w:val="1"/>
+              </w:numPr>
+              <w:spacing w:line="360" w:lineRule="auto"/>
+              <w:rPr>
+                <w:rFonts w:ascii="Times New Roman" w:hAnsi="Times New Roman" w:cs="Times New Roman"/>
+              </w:rPr>
+            </w:pPr>
+            <w:r>
+              <w:rPr>
+                <w:rFonts w:ascii="Times New Roman" w:hAnsi="Times New Roman" w:cs="Times New Roman"/>
+              </w:rPr>
+              <w:t>2.5 hours designing GUI draft for manager function to create/edit/delete staff profiles (03/12)</w:t>
+            </w:r>
+          </w:p>
+          <w:p>
+            <w:pPr>
+              <w:pStyle w:val="ListParagraph"/>
+              <w:numPr>
+                <w:ilvl w:val="0"/>
+                <w:numId w:val="1"/>
+              </w:numPr>
+              <w:spacing w:line="360" w:lineRule="auto"/>
+              <w:rPr>
+                <w:rFonts w:ascii="Times New Roman" w:hAnsi="Times New Roman" w:cs="Times New Roman"/>
+              </w:rPr>
+            </w:pPr>
+            <w:r>
+              <w:rPr>
+                <w:rFonts w:ascii="Times New Roman" w:hAnsi="Times New Roman" w:cs="Times New Roman"/>
+              </w:rPr>
+              <w:t>2 hours in team meeting (03/12)</w:t>
+            </w:r>
+          </w:p>
+          <w:p>
+            <w:pPr>
+              <w:pStyle w:val="ListParagraph"/>
+              <w:numPr>
+                <w:ilvl w:val="0"/>
+                <w:numId w:val="1"/>
+              </w:numPr>
+              <w:spacing w:line="360" w:lineRule="auto"/>
+              <w:rPr>
+                <w:rFonts w:ascii="Times New Roman" w:hAnsi="Times New Roman" w:cs="Times New Roman"/>
+              </w:rPr>
+            </w:pPr>
+            <w:r>
+              <w:rPr>
+                <w:rFonts w:ascii="Times New Roman" w:hAnsi="Times New Roman" w:cs="Times New Roman"/>
+              </w:rPr>
+              <w:t>2 hours updating architecture designs (03/14)</w:t>
+            </w:r>
+          </w:p>
+          <w:p>
+            <w:pPr>
+              <w:pStyle w:val="ListParagraph"/>
+              <w:numPr>
+                <w:ilvl w:val="0"/>
+                <w:numId w:val="1"/>
+              </w:numPr>
+              <w:spacing w:line="360" w:lineRule="auto"/>
+              <w:rPr>
+                <w:rFonts w:ascii="Times New Roman" w:hAnsi="Times New Roman" w:cs="Times New Roman"/>
+              </w:rPr>
+            </w:pPr>
+            <w:r>
+              <w:rPr>
+                <w:rFonts w:ascii="Times New Roman" w:hAnsi="Times New Roman" w:cs="Times New Roman"/>
+              </w:rPr>
+              <w:t>~40 minutes updating Requirements Document by specifying implementation plans for each requirement (03/14)</w:t>
+            </w:r>
+          </w:p>
+        </w:tc>
+      </w:tr>
+      <w:tr>
+        <w:tc>
+          <w:tcPr>
+            <w:tcW w:w="1975" w:type="dxa"/>
+          </w:tcPr>
+          <w:p>
+            <w:pPr>
+              <w:spacing w:line="360" w:lineRule="auto"/>
+              <w:jc w:val="center"/>
+              <w:rPr>
+                <w:rFonts w:ascii="Times New Roman" w:hAnsi="Times New Roman" w:cs="Times New Roman"/>
+              </w:rPr>
+            </w:pPr>
+            <w:r>
+              <w:rPr>
+                <w:rFonts w:ascii="Times New Roman" w:hAnsi="Times New Roman" w:cs="Times New Roman"/>
+              </w:rPr>
+              <w:t>03/16 – 03/2</w:t>
+            </w:r>
+            <w:r>
+              <w:rPr>
+                <w:rFonts w:ascii="Times New Roman" w:hAnsi="Times New Roman" w:cs="Times New Roman"/>
+              </w:rPr>
+              <w:t>1</w:t>
+            </w:r>
+          </w:p>
+        </w:tc>
+        <w:tc>
+          <w:tcPr>
+            <w:tcW w:w="7375" w:type="dxa"/>
+          </w:tcPr>
+          <w:p>
+            <w:pPr>
+              <w:pStyle w:val="ListParagraph"/>
+              <w:numPr>
+                <w:ilvl w:val="0"/>
+                <w:numId w:val="1"/>
+              </w:numPr>
+              <w:spacing w:line="360" w:lineRule="auto"/>
+              <w:rPr>
+                <w:rFonts w:ascii="Times New Roman" w:hAnsi="Times New Roman" w:cs="Times New Roman"/>
+              </w:rPr>
+            </w:pPr>
+            <w:r>
+              <w:rPr>
+                <w:rFonts w:ascii="Times New Roman" w:hAnsi="Times New Roman" w:cs="Times New Roman"/>
+              </w:rPr>
+              <w:t>1.67 hours completing the functional and nonfunctional sections of the Requirements Doc (03/16)</w:t>
+            </w:r>
+          </w:p>
+          <w:p>
+            <w:pPr>
+              <w:pStyle w:val="ListParagraph"/>
+              <w:numPr>
+                <w:ilvl w:val="0"/>
+                <w:numId w:val="1"/>
+              </w:numPr>
+              <w:spacing w:line="360" w:lineRule="auto"/>
+              <w:rPr>
+                <w:rFonts w:ascii="Times New Roman" w:hAnsi="Times New Roman" w:cs="Times New Roman"/>
+              </w:rPr>
+            </w:pPr>
+            <w:r>
+              <w:rPr>
+                <w:rFonts w:ascii="Times New Roman" w:hAnsi="Times New Roman" w:cs="Times New Roman"/>
+              </w:rPr>
+              <w:t>~2 hours correcting Requirements Document (03/18)</w:t>
+            </w:r>
+          </w:p>
+          <w:p>
+            <w:pPr>
+              <w:pStyle w:val="ListParagraph"/>
+              <w:numPr>
+                <w:ilvl w:val="0"/>
+                <w:numId w:val="1"/>
+              </w:numPr>
+              <w:spacing w:line="360" w:lineRule="auto"/>
+              <w:rPr>
+                <w:rFonts w:ascii="Times New Roman" w:hAnsi="Times New Roman" w:cs="Times New Roman"/>
+              </w:rPr>
+            </w:pPr>
+            <w:r>
+              <w:rPr>
+                <w:rFonts w:ascii="Times New Roman" w:hAnsi="Times New Roman" w:cs="Times New Roman"/>
+              </w:rPr>
+              <w:t>45 mins creating calendar for remainder of project assignments (03/18)</w:t>
+            </w:r>
+          </w:p>
+          <w:p>
+            <w:pPr>
+              <w:pStyle w:val="ListParagraph"/>
+              <w:numPr>
+                <w:ilvl w:val="0"/>
+                <w:numId w:val="1"/>
+              </w:numPr>
+              <w:spacing w:line="360" w:lineRule="auto"/>
+              <w:rPr>
+                <w:rFonts w:ascii="Times New Roman" w:hAnsi="Times New Roman" w:cs="Times New Roman"/>
+              </w:rPr>
+            </w:pPr>
+            <w:r>
+              <w:rPr>
+                <w:rFonts w:ascii="Times New Roman" w:hAnsi="Times New Roman" w:cs="Times New Roman"/>
+              </w:rPr>
+              <w:t>~1 hour team meeting (03/19)</w:t>
+            </w:r>
+          </w:p>
+          <w:p>
+            <w:pPr>
+              <w:pStyle w:val="ListParagraph"/>
+              <w:numPr>
+                <w:ilvl w:val="0"/>
+                <w:numId w:val="1"/>
+              </w:numPr>
+              <w:spacing w:line="360" w:lineRule="auto"/>
+              <w:rPr>
+                <w:rFonts w:ascii="Times New Roman" w:hAnsi="Times New Roman" w:cs="Times New Roman"/>
+              </w:rPr>
+            </w:pPr>
+            <w:r>
+              <w:rPr>
+                <w:rFonts w:ascii="Times New Roman" w:hAnsi="Times New Roman" w:cs="Times New Roman"/>
+              </w:rPr>
+              <w:t>~1.5 hours completing class documentation section of Requirements Document (03/20)</w:t>
+            </w:r>
+          </w:p>
+          <w:p>
+            <w:pPr>
+              <w:pStyle w:val="ListParagraph"/>
+              <w:numPr>
+                <w:ilvl w:val="0"/>
+                <w:numId w:val="1"/>
+              </w:numPr>
+              <w:spacing w:line="360" w:lineRule="auto"/>
+              <w:rPr>
+                <w:rFonts w:ascii="Times New Roman" w:hAnsi="Times New Roman" w:cs="Times New Roman"/>
+              </w:rPr>
+            </w:pPr>
+            <w:r>
+              <w:rPr>
+                <w:rFonts w:ascii="Times New Roman" w:hAnsi="Times New Roman" w:cs="Times New Roman"/>
+              </w:rPr>
+              <w:t>1.5 hours working on class diagrams (03/20)</w:t>
+            </w:r>
+          </w:p>
+          <w:p>
+            <w:pPr>
+              <w:pStyle w:val="ListParagraph"/>
+              <w:numPr>
+                <w:ilvl w:val="0"/>
+                <w:numId w:val="1"/>
+              </w:numPr>
+              <w:spacing w:line="360" w:lineRule="auto"/>
+              <w:rPr>
+                <w:rFonts w:ascii="Times New Roman" w:hAnsi="Times New Roman" w:cs="Times New Roman"/>
+              </w:rPr>
+            </w:pPr>
+            <w:r>
+              <w:rPr>
+                <w:rFonts w:ascii="Times New Roman" w:hAnsi="Times New Roman" w:cs="Times New Roman"/>
+              </w:rPr>
+              <w:t>~1.5 hours completing class diagrams (03/20)</w:t>
+            </w:r>
+          </w:p>
+          <w:p>
+            <w:pPr>
+              <w:pStyle w:val="ListParagraph"/>
+              <w:numPr>
+                <w:ilvl w:val="0"/>
+                <w:numId w:val="1"/>
+              </w:numPr>
+              <w:spacing w:line="360" w:lineRule="auto"/>
               <w:rPr>
                 <w:rFonts w:ascii="Times New Roman" w:hAnsi="Times New Roman" w:cs="Times New Roman"/>
               </w:rPr>
@@ -1991,457 +2891,20 @@
                 <w:rFonts w:ascii="Times New Roman" w:hAnsi="Times New Roman" w:cs="Times New Roman"/>
               </w:rPr>
               <w:lastRenderedPageBreak/>
-              <w:t>02/08 – 02/14</w:t>
-            </w:r>
-          </w:p>
-        </w:tc>
-        <w:tc>
-          <w:tcPr>
-            <w:tcW w:w="7375" w:type="dxa"/>
-          </w:tcPr>
-          <w:p>
-            <w:pPr>
-              <w:pStyle w:val="Prrafodelista"/>
-              <w:numPr>
-                <w:ilvl w:val="0"/>
-                <w:numId w:val="1"/>
-              </w:numPr>
-              <w:spacing w:line="360" w:lineRule="auto"/>
-              <w:rPr>
-                <w:rFonts w:ascii="Times New Roman" w:hAnsi="Times New Roman" w:cs="Times New Roman"/>
-              </w:rPr>
-            </w:pPr>
-            <w:r>
-              <w:rPr>
-                <w:rFonts w:ascii="Times New Roman" w:hAnsi="Times New Roman" w:cs="Times New Roman"/>
-              </w:rPr>
-              <w:t>2.2 hours working on the testing section of the Project Plan, updating my resume, and updating meeting notes (02/10)</w:t>
-            </w:r>
-          </w:p>
-          <w:p>
-            <w:pPr>
-              <w:pStyle w:val="Prrafodelista"/>
-              <w:numPr>
-                <w:ilvl w:val="0"/>
-                <w:numId w:val="1"/>
-              </w:numPr>
-              <w:spacing w:line="360" w:lineRule="auto"/>
-              <w:rPr>
-                <w:rFonts w:ascii="Times New Roman" w:hAnsi="Times New Roman" w:cs="Times New Roman"/>
-              </w:rPr>
-            </w:pPr>
-            <w:r>
-              <w:rPr>
-                <w:rFonts w:ascii="Times New Roman" w:hAnsi="Times New Roman" w:cs="Times New Roman"/>
-              </w:rPr>
-              <w:t>1.8 hours completing the testing section, continuing work on WBS (02/12)</w:t>
-            </w:r>
-          </w:p>
-        </w:tc>
-      </w:tr>
-      <w:tr>
-        <w:tc>
-          <w:tcPr>
-            <w:tcW w:w="1975" w:type="dxa"/>
-          </w:tcPr>
-          <w:p>
-            <w:pPr>
-              <w:spacing w:line="360" w:lineRule="auto"/>
-              <w:jc w:val="center"/>
-              <w:rPr>
-                <w:rFonts w:ascii="Times New Roman" w:hAnsi="Times New Roman" w:cs="Times New Roman"/>
-              </w:rPr>
-            </w:pPr>
-            <w:r>
-              <w:rPr>
-                <w:rFonts w:ascii="Times New Roman" w:hAnsi="Times New Roman" w:cs="Times New Roman"/>
-              </w:rPr>
-              <w:t>02/16 – 02/21</w:t>
-            </w:r>
-          </w:p>
-        </w:tc>
-        <w:tc>
-          <w:tcPr>
-            <w:tcW w:w="7375" w:type="dxa"/>
-          </w:tcPr>
-          <w:p>
-            <w:pPr>
-              <w:pStyle w:val="Prrafodelista"/>
-              <w:numPr>
-                <w:ilvl w:val="0"/>
-                <w:numId w:val="1"/>
-              </w:numPr>
-              <w:spacing w:line="360" w:lineRule="auto"/>
-              <w:rPr>
-                <w:rFonts w:ascii="Times New Roman" w:hAnsi="Times New Roman" w:cs="Times New Roman"/>
-              </w:rPr>
-            </w:pPr>
-            <w:r>
-              <w:rPr>
-                <w:rFonts w:ascii="Times New Roman" w:hAnsi="Times New Roman" w:cs="Times New Roman"/>
-              </w:rPr>
-              <w:t>57 mins organizing GitHub repo and message team about upcoming schedule and others (02/16)</w:t>
-            </w:r>
-          </w:p>
-          <w:p>
-            <w:pPr>
-              <w:pStyle w:val="Prrafodelista"/>
-              <w:numPr>
-                <w:ilvl w:val="0"/>
-                <w:numId w:val="1"/>
-              </w:numPr>
-              <w:spacing w:line="360" w:lineRule="auto"/>
-              <w:rPr>
-                <w:rFonts w:ascii="Times New Roman" w:hAnsi="Times New Roman" w:cs="Times New Roman"/>
-              </w:rPr>
-            </w:pPr>
-            <w:r>
-              <w:rPr>
-                <w:rFonts w:ascii="Times New Roman" w:hAnsi="Times New Roman" w:cs="Times New Roman"/>
-              </w:rPr>
-              <w:t>5.2 hours designing architecture of login/sign up module, drafting GUI, assigning staff usernames (02/16)</w:t>
-            </w:r>
-          </w:p>
-          <w:p>
-            <w:pPr>
-              <w:pStyle w:val="Prrafodelista"/>
-              <w:numPr>
-                <w:ilvl w:val="0"/>
-                <w:numId w:val="1"/>
-              </w:numPr>
-              <w:spacing w:line="360" w:lineRule="auto"/>
-              <w:rPr>
-                <w:rFonts w:ascii="Times New Roman" w:hAnsi="Times New Roman" w:cs="Times New Roman"/>
-              </w:rPr>
-            </w:pPr>
-            <w:r>
-              <w:rPr>
-                <w:rFonts w:ascii="Times New Roman" w:hAnsi="Times New Roman" w:cs="Times New Roman"/>
-              </w:rPr>
-              <w:t>40 mins designing initial schema for database (02/17)</w:t>
-            </w:r>
-          </w:p>
-          <w:p>
-            <w:pPr>
-              <w:pStyle w:val="Prrafodelista"/>
-              <w:numPr>
-                <w:ilvl w:val="0"/>
-                <w:numId w:val="1"/>
-              </w:numPr>
-              <w:spacing w:line="360" w:lineRule="auto"/>
-              <w:rPr>
-                <w:rFonts w:ascii="Times New Roman" w:hAnsi="Times New Roman" w:cs="Times New Roman"/>
-              </w:rPr>
-            </w:pPr>
-            <w:r>
-              <w:rPr>
-                <w:rFonts w:ascii="Times New Roman" w:hAnsi="Times New Roman" w:cs="Times New Roman"/>
-              </w:rPr>
-              <w:t>30 mins creating database ERD (02/17)</w:t>
-            </w:r>
-          </w:p>
-          <w:p>
-            <w:pPr>
-              <w:pStyle w:val="Prrafodelista"/>
-              <w:numPr>
-                <w:ilvl w:val="0"/>
-                <w:numId w:val="1"/>
-              </w:numPr>
-              <w:spacing w:line="360" w:lineRule="auto"/>
-              <w:rPr>
-                <w:rFonts w:ascii="Times New Roman" w:hAnsi="Times New Roman" w:cs="Times New Roman"/>
-              </w:rPr>
-            </w:pPr>
-            <w:r>
-              <w:rPr>
-                <w:rFonts w:ascii="Times New Roman" w:hAnsi="Times New Roman" w:cs="Times New Roman"/>
-              </w:rPr>
-              <w:t>1.2 hour in-class, team meeting (02/17)</w:t>
-            </w:r>
-          </w:p>
-          <w:p>
-            <w:pPr>
-              <w:pStyle w:val="Prrafodelista"/>
-              <w:numPr>
-                <w:ilvl w:val="0"/>
-                <w:numId w:val="1"/>
-              </w:numPr>
-              <w:spacing w:line="360" w:lineRule="auto"/>
-              <w:rPr>
-                <w:rFonts w:ascii="Times New Roman" w:hAnsi="Times New Roman" w:cs="Times New Roman"/>
-              </w:rPr>
-            </w:pPr>
-            <w:r>
-              <w:rPr>
-                <w:rFonts w:ascii="Times New Roman" w:hAnsi="Times New Roman" w:cs="Times New Roman"/>
-              </w:rPr>
-              <w:t>1.17 hours making use case diagrams</w:t>
-            </w:r>
-          </w:p>
-        </w:tc>
-      </w:tr>
-      <w:tr>
-        <w:tc>
-          <w:tcPr>
-            <w:tcW w:w="1975" w:type="dxa"/>
-          </w:tcPr>
-          <w:p>
-            <w:pPr>
-              <w:spacing w:line="360" w:lineRule="auto"/>
-              <w:jc w:val="center"/>
-              <w:rPr>
-                <w:rFonts w:ascii="Times New Roman" w:hAnsi="Times New Roman" w:cs="Times New Roman"/>
-              </w:rPr>
-            </w:pPr>
-            <w:r>
-              <w:rPr>
-                <w:rFonts w:ascii="Times New Roman" w:hAnsi="Times New Roman" w:cs="Times New Roman"/>
-              </w:rPr>
-              <w:t>02/23 – 02/28</w:t>
-            </w:r>
-          </w:p>
-        </w:tc>
-        <w:tc>
-          <w:tcPr>
-            <w:tcW w:w="7375" w:type="dxa"/>
-          </w:tcPr>
-          <w:p>
-            <w:pPr>
-              <w:pStyle w:val="Prrafodelista"/>
-              <w:numPr>
-                <w:ilvl w:val="0"/>
-                <w:numId w:val="1"/>
-              </w:numPr>
-              <w:spacing w:line="360" w:lineRule="auto"/>
-              <w:rPr>
-                <w:rFonts w:ascii="Times New Roman" w:hAnsi="Times New Roman" w:cs="Times New Roman"/>
-              </w:rPr>
-            </w:pPr>
-            <w:r>
-              <w:rPr>
-                <w:rFonts w:ascii="Times New Roman" w:hAnsi="Times New Roman" w:cs="Times New Roman"/>
-              </w:rPr>
-              <w:t>1 hour completing status report for week 02/16 to 02/20 (02/26)</w:t>
-            </w:r>
-          </w:p>
-          <w:p>
-            <w:pPr>
-              <w:pStyle w:val="Prrafodelista"/>
-              <w:numPr>
-                <w:ilvl w:val="0"/>
-                <w:numId w:val="1"/>
-              </w:numPr>
-              <w:spacing w:line="360" w:lineRule="auto"/>
-              <w:rPr>
-                <w:rFonts w:ascii="Times New Roman" w:hAnsi="Times New Roman" w:cs="Times New Roman"/>
-              </w:rPr>
-            </w:pPr>
-            <w:r>
-              <w:rPr>
-                <w:rFonts w:ascii="Times New Roman" w:hAnsi="Times New Roman" w:cs="Times New Roman"/>
-              </w:rPr>
-              <w:t>1 hour team meeting (02/26)</w:t>
-            </w:r>
-          </w:p>
-          <w:p>
-            <w:pPr>
-              <w:pStyle w:val="Prrafodelista"/>
-              <w:numPr>
-                <w:ilvl w:val="0"/>
-                <w:numId w:val="1"/>
-              </w:numPr>
-              <w:spacing w:line="360" w:lineRule="auto"/>
-              <w:rPr>
-                <w:rFonts w:ascii="Times New Roman" w:hAnsi="Times New Roman" w:cs="Times New Roman"/>
-              </w:rPr>
-            </w:pPr>
-            <w:r>
-              <w:rPr>
-                <w:rFonts w:ascii="Times New Roman" w:hAnsi="Times New Roman" w:cs="Times New Roman"/>
-              </w:rPr>
-              <w:t>3 hours updating architecture design doc for clock-in/out, drafting GUI for clock-in/out module (02/27, 02/28)</w:t>
-            </w:r>
-          </w:p>
-          <w:p>
-            <w:pPr>
-              <w:pStyle w:val="Prrafodelista"/>
-              <w:numPr>
-                <w:ilvl w:val="0"/>
-                <w:numId w:val="1"/>
-              </w:numPr>
-              <w:spacing w:line="360" w:lineRule="auto"/>
-              <w:rPr>
-                <w:rFonts w:ascii="Times New Roman" w:hAnsi="Times New Roman" w:cs="Times New Roman"/>
-              </w:rPr>
-            </w:pPr>
-            <w:r>
-              <w:rPr>
-                <w:rFonts w:ascii="Times New Roman" w:hAnsi="Times New Roman" w:cs="Times New Roman"/>
-              </w:rPr>
-              <w:t>1.67</w:t>
-            </w:r>
-            <w:r>
-              <w:rPr>
-                <w:rFonts w:ascii="Times New Roman" w:hAnsi="Times New Roman" w:cs="Times New Roman"/>
-              </w:rPr>
-              <w:t xml:space="preserve"> hours updating Login GUI drafts, updating Login architecture, updating architecture standards (02/28)</w:t>
-            </w:r>
-          </w:p>
-        </w:tc>
-      </w:tr>
-      <w:tr>
-        <w:tc>
-          <w:tcPr>
-            <w:tcW w:w="1975" w:type="dxa"/>
-          </w:tcPr>
-          <w:p>
-            <w:pPr>
-              <w:spacing w:line="360" w:lineRule="auto"/>
-              <w:jc w:val="center"/>
-              <w:rPr>
-                <w:rFonts w:ascii="Times New Roman" w:hAnsi="Times New Roman" w:cs="Times New Roman"/>
-              </w:rPr>
-            </w:pPr>
-            <w:r>
-              <w:rPr>
-                <w:rFonts w:ascii="Times New Roman" w:hAnsi="Times New Roman" w:cs="Times New Roman"/>
-              </w:rPr>
-              <w:t>03/02 – 03/07</w:t>
-            </w:r>
-          </w:p>
-        </w:tc>
-        <w:tc>
-          <w:tcPr>
-            <w:tcW w:w="7375" w:type="dxa"/>
-          </w:tcPr>
-          <w:p>
-            <w:pPr>
-              <w:pStyle w:val="Prrafodelista"/>
-              <w:numPr>
-                <w:ilvl w:val="0"/>
-                <w:numId w:val="1"/>
-              </w:numPr>
-              <w:spacing w:line="360" w:lineRule="auto"/>
-              <w:rPr>
-                <w:rFonts w:ascii="Times New Roman" w:hAnsi="Times New Roman" w:cs="Times New Roman"/>
-              </w:rPr>
-            </w:pPr>
-            <w:r>
-              <w:rPr>
-                <w:rFonts w:ascii="Times New Roman" w:hAnsi="Times New Roman" w:cs="Times New Roman"/>
-              </w:rPr>
-              <w:t>1.7 hours updating schema (03/02)</w:t>
-            </w:r>
-          </w:p>
-          <w:p>
-            <w:pPr>
-              <w:pStyle w:val="Prrafodelista"/>
-              <w:numPr>
-                <w:ilvl w:val="0"/>
-                <w:numId w:val="1"/>
-              </w:numPr>
-              <w:spacing w:line="360" w:lineRule="auto"/>
-              <w:rPr>
-                <w:rFonts w:ascii="Times New Roman" w:hAnsi="Times New Roman" w:cs="Times New Roman"/>
-              </w:rPr>
-            </w:pPr>
-            <w:r>
-              <w:rPr>
-                <w:rFonts w:ascii="Times New Roman" w:hAnsi="Times New Roman" w:cs="Times New Roman"/>
-              </w:rPr>
-              <w:t>30 minutes updating status report (03/02)</w:t>
-            </w:r>
-          </w:p>
-        </w:tc>
-      </w:tr>
-      <w:tr>
-        <w:tc>
-          <w:tcPr>
-            <w:tcW w:w="1975" w:type="dxa"/>
-          </w:tcPr>
-          <w:p>
-            <w:pPr>
-              <w:spacing w:line="360" w:lineRule="auto"/>
-              <w:jc w:val="center"/>
-              <w:rPr>
-                <w:rFonts w:ascii="Times New Roman" w:hAnsi="Times New Roman" w:cs="Times New Roman"/>
-              </w:rPr>
-            </w:pPr>
-            <w:r>
-              <w:rPr>
-                <w:rFonts w:ascii="Times New Roman" w:hAnsi="Times New Roman" w:cs="Times New Roman"/>
-              </w:rPr>
-              <w:t>03/09 – 03/14</w:t>
-            </w:r>
-          </w:p>
-        </w:tc>
-        <w:tc>
-          <w:tcPr>
-            <w:tcW w:w="7375" w:type="dxa"/>
-          </w:tcPr>
-          <w:p>
-            <w:pPr>
-              <w:pStyle w:val="Prrafodelista"/>
-              <w:numPr>
-                <w:ilvl w:val="0"/>
-                <w:numId w:val="1"/>
-              </w:numPr>
-              <w:spacing w:line="360" w:lineRule="auto"/>
-              <w:rPr>
-                <w:rFonts w:ascii="Times New Roman" w:hAnsi="Times New Roman" w:cs="Times New Roman"/>
-              </w:rPr>
-            </w:pPr>
-            <w:r>
-              <w:rPr>
-                <w:rFonts w:ascii="Times New Roman" w:hAnsi="Times New Roman" w:cs="Times New Roman"/>
-              </w:rPr>
-              <w:t>~</w:t>
-            </w:r>
-            <w:r>
-              <w:rPr>
-                <w:rFonts w:ascii="Times New Roman" w:hAnsi="Times New Roman" w:cs="Times New Roman"/>
-              </w:rPr>
-              <w:t xml:space="preserve">1-1.5 hours </w:t>
-            </w:r>
-            <w:r>
-              <w:rPr>
-                <w:rFonts w:ascii="Times New Roman" w:hAnsi="Times New Roman" w:cs="Times New Roman"/>
-              </w:rPr>
-              <w:t>gathering/clarifying</w:t>
-            </w:r>
-            <w:r>
-              <w:rPr>
-                <w:rFonts w:ascii="Times New Roman" w:hAnsi="Times New Roman" w:cs="Times New Roman"/>
-              </w:rPr>
-              <w:t xml:space="preserve"> requirements </w:t>
-            </w:r>
-            <w:r>
-              <w:rPr>
-                <w:rFonts w:ascii="Times New Roman" w:hAnsi="Times New Roman" w:cs="Times New Roman"/>
-              </w:rPr>
-              <w:t>using</w:t>
-            </w:r>
-            <w:r>
-              <w:rPr>
-                <w:rFonts w:ascii="Times New Roman" w:hAnsi="Times New Roman" w:cs="Times New Roman"/>
-              </w:rPr>
-              <w:t xml:space="preserve"> Project </w:t>
-            </w:r>
-            <w:r>
-              <w:rPr>
-                <w:rFonts w:ascii="Times New Roman" w:hAnsi="Times New Roman" w:cs="Times New Roman"/>
-              </w:rPr>
-              <w:t>details and restaurant details documents (03/09)</w:t>
-            </w:r>
-          </w:p>
-          <w:p>
-            <w:pPr>
-              <w:pStyle w:val="Prrafodelista"/>
-              <w:numPr>
-                <w:ilvl w:val="0"/>
-                <w:numId w:val="1"/>
-              </w:numPr>
-              <w:spacing w:line="360" w:lineRule="auto"/>
+              <w:t>~4 completing flow of events diagram and decision tables (03/21)</w:t>
+            </w:r>
+          </w:p>
+        </w:tc>
+      </w:tr>
+      <w:tr>
+        <w:tc>
+          <w:tcPr>
+            <w:tcW w:w="1975" w:type="dxa"/>
+          </w:tcPr>
+          <w:p>
+            <w:pPr>
+              <w:spacing w:line="360" w:lineRule="auto"/>
+              <w:jc w:val="center"/>
               <w:rPr>
                 <w:rFonts w:ascii="Times New Roman" w:hAnsi="Times New Roman" w:cs="Times New Roman"/>
               </w:rPr>
@@ -2451,384 +2914,6 @@
                 <w:rFonts w:ascii="Times New Roman" w:hAnsi="Times New Roman" w:cs="Times New Roman"/>
               </w:rPr>
               <w:lastRenderedPageBreak/>
-              <w:t>2 hours updating use case diagrams, creating business flow diagram (03/10)</w:t>
-            </w:r>
-          </w:p>
-          <w:p>
-            <w:pPr>
-              <w:pStyle w:val="Prrafodelista"/>
-              <w:numPr>
-                <w:ilvl w:val="0"/>
-                <w:numId w:val="1"/>
-              </w:numPr>
-              <w:spacing w:line="360" w:lineRule="auto"/>
-              <w:rPr>
-                <w:rFonts w:ascii="Times New Roman" w:hAnsi="Times New Roman" w:cs="Times New Roman"/>
-              </w:rPr>
-            </w:pPr>
-            <w:r>
-              <w:rPr>
-                <w:rFonts w:ascii="Times New Roman" w:hAnsi="Times New Roman" w:cs="Times New Roman"/>
-              </w:rPr>
-              <w:t>~</w:t>
-            </w:r>
-            <w:r>
-              <w:rPr>
-                <w:rFonts w:ascii="Times New Roman" w:hAnsi="Times New Roman" w:cs="Times New Roman"/>
-              </w:rPr>
-              <w:t>1 hour categorizing requirements for R</w:t>
-            </w:r>
-            <w:r>
-              <w:rPr>
-                <w:rFonts w:ascii="Times New Roman" w:hAnsi="Times New Roman" w:cs="Times New Roman"/>
-              </w:rPr>
-              <w:t>equirements Document assignment (03/10)</w:t>
-            </w:r>
-          </w:p>
-          <w:p>
-            <w:pPr>
-              <w:pStyle w:val="Prrafodelista"/>
-              <w:numPr>
-                <w:ilvl w:val="0"/>
-                <w:numId w:val="1"/>
-              </w:numPr>
-              <w:spacing w:line="360" w:lineRule="auto"/>
-              <w:rPr>
-                <w:rFonts w:ascii="Times New Roman" w:hAnsi="Times New Roman" w:cs="Times New Roman"/>
-              </w:rPr>
-            </w:pPr>
-            <w:r>
-              <w:rPr>
-                <w:rFonts w:ascii="Times New Roman" w:hAnsi="Times New Roman" w:cs="Times New Roman"/>
-              </w:rPr>
-              <w:t>1.5 hours reviewing and editing requirements categorization, assigning requirement IDs</w:t>
-            </w:r>
-            <w:r>
-              <w:rPr>
-                <w:rFonts w:ascii="Times New Roman" w:hAnsi="Times New Roman" w:cs="Times New Roman"/>
-              </w:rPr>
-              <w:t xml:space="preserve"> (03/10)</w:t>
-            </w:r>
-          </w:p>
-          <w:p>
-            <w:pPr>
-              <w:pStyle w:val="Prrafodelista"/>
-              <w:numPr>
-                <w:ilvl w:val="0"/>
-                <w:numId w:val="1"/>
-              </w:numPr>
-              <w:spacing w:line="360" w:lineRule="auto"/>
-              <w:rPr>
-                <w:rFonts w:ascii="Times New Roman" w:hAnsi="Times New Roman" w:cs="Times New Roman"/>
-              </w:rPr>
-            </w:pPr>
-            <w:r>
-              <w:rPr>
-                <w:rFonts w:ascii="Times New Roman" w:hAnsi="Times New Roman" w:cs="Times New Roman"/>
-              </w:rPr>
-              <w:t>2.17 hours adding confirmed requirements to Requirement Document, constructing and updating architecture designs, writing code for creating staff profiles (03/11)</w:t>
-            </w:r>
-          </w:p>
-          <w:p>
-            <w:pPr>
-              <w:pStyle w:val="Prrafodelista"/>
-              <w:numPr>
-                <w:ilvl w:val="0"/>
-                <w:numId w:val="1"/>
-              </w:numPr>
-              <w:spacing w:line="360" w:lineRule="auto"/>
-              <w:rPr>
-                <w:rFonts w:ascii="Times New Roman" w:hAnsi="Times New Roman" w:cs="Times New Roman"/>
-              </w:rPr>
-            </w:pPr>
-            <w:r>
-              <w:rPr>
-                <w:rFonts w:ascii="Times New Roman" w:hAnsi="Times New Roman" w:cs="Times New Roman"/>
-              </w:rPr>
-              <w:t>1.33 hours updating architecture standards, architecture designs, GUI designs for manager’s ability create/edit/delete staff profiles (03/11)</w:t>
-            </w:r>
-          </w:p>
-          <w:p>
-            <w:pPr>
-              <w:pStyle w:val="Prrafodelista"/>
-              <w:numPr>
-                <w:ilvl w:val="0"/>
-                <w:numId w:val="1"/>
-              </w:numPr>
-              <w:spacing w:line="360" w:lineRule="auto"/>
-              <w:rPr>
-                <w:rFonts w:ascii="Times New Roman" w:hAnsi="Times New Roman" w:cs="Times New Roman"/>
-              </w:rPr>
-            </w:pPr>
-            <w:r>
-              <w:rPr>
-                <w:rFonts w:ascii="Times New Roman" w:hAnsi="Times New Roman" w:cs="Times New Roman"/>
-              </w:rPr>
-              <w:t>2.5 hours designing GUI draft for manager function to create/edit/delete staff profiles (03/12)</w:t>
-            </w:r>
-          </w:p>
-          <w:p>
-            <w:pPr>
-              <w:pStyle w:val="Prrafodelista"/>
-              <w:numPr>
-                <w:ilvl w:val="0"/>
-                <w:numId w:val="1"/>
-              </w:numPr>
-              <w:spacing w:line="360" w:lineRule="auto"/>
-              <w:rPr>
-                <w:rFonts w:ascii="Times New Roman" w:hAnsi="Times New Roman" w:cs="Times New Roman"/>
-              </w:rPr>
-            </w:pPr>
-            <w:r>
-              <w:rPr>
-                <w:rFonts w:ascii="Times New Roman" w:hAnsi="Times New Roman" w:cs="Times New Roman"/>
-              </w:rPr>
-              <w:t>2 hours in team meeting (03/12)</w:t>
-            </w:r>
-          </w:p>
-          <w:p>
-            <w:pPr>
-              <w:pStyle w:val="Prrafodelista"/>
-              <w:numPr>
-                <w:ilvl w:val="0"/>
-                <w:numId w:val="1"/>
-              </w:numPr>
-              <w:spacing w:line="360" w:lineRule="auto"/>
-              <w:rPr>
-                <w:rFonts w:ascii="Times New Roman" w:hAnsi="Times New Roman" w:cs="Times New Roman"/>
-              </w:rPr>
-            </w:pPr>
-            <w:r>
-              <w:rPr>
-                <w:rFonts w:ascii="Times New Roman" w:hAnsi="Times New Roman" w:cs="Times New Roman"/>
-              </w:rPr>
-              <w:t>2 hours updating architecture designs (03/14)</w:t>
-            </w:r>
-          </w:p>
-          <w:p>
-            <w:pPr>
-              <w:pStyle w:val="Prrafodelista"/>
-              <w:numPr>
-                <w:ilvl w:val="0"/>
-                <w:numId w:val="1"/>
-              </w:numPr>
-              <w:spacing w:line="360" w:lineRule="auto"/>
-              <w:rPr>
-                <w:rFonts w:ascii="Times New Roman" w:hAnsi="Times New Roman" w:cs="Times New Roman"/>
-              </w:rPr>
-            </w:pPr>
-            <w:r>
-              <w:rPr>
-                <w:rFonts w:ascii="Times New Roman" w:hAnsi="Times New Roman" w:cs="Times New Roman"/>
-              </w:rPr>
-              <w:t>~40 minutes updating Requirements Document by specifying implementation plans for each requirement (03/14)</w:t>
-            </w:r>
-          </w:p>
-        </w:tc>
-      </w:tr>
-      <w:tr>
-        <w:tc>
-          <w:tcPr>
-            <w:tcW w:w="1975" w:type="dxa"/>
-          </w:tcPr>
-          <w:p>
-            <w:pPr>
-              <w:spacing w:line="360" w:lineRule="auto"/>
-              <w:jc w:val="center"/>
-              <w:rPr>
-                <w:rFonts w:ascii="Times New Roman" w:hAnsi="Times New Roman" w:cs="Times New Roman"/>
-              </w:rPr>
-            </w:pPr>
-            <w:r>
-              <w:rPr>
-                <w:rFonts w:ascii="Times New Roman" w:hAnsi="Times New Roman" w:cs="Times New Roman"/>
-              </w:rPr>
-              <w:lastRenderedPageBreak/>
-              <w:t>03/16 – 03/2</w:t>
-            </w:r>
-            <w:r>
-              <w:rPr>
-                <w:rFonts w:ascii="Times New Roman" w:hAnsi="Times New Roman" w:cs="Times New Roman"/>
-              </w:rPr>
-              <w:t>1</w:t>
-            </w:r>
-          </w:p>
-        </w:tc>
-        <w:tc>
-          <w:tcPr>
-            <w:tcW w:w="7375" w:type="dxa"/>
-          </w:tcPr>
-          <w:p>
-            <w:pPr>
-              <w:pStyle w:val="Prrafodelista"/>
-              <w:numPr>
-                <w:ilvl w:val="0"/>
-                <w:numId w:val="1"/>
-              </w:numPr>
-              <w:spacing w:line="360" w:lineRule="auto"/>
-              <w:rPr>
-                <w:rFonts w:ascii="Times New Roman" w:hAnsi="Times New Roman" w:cs="Times New Roman"/>
-              </w:rPr>
-            </w:pPr>
-            <w:r>
-              <w:rPr>
-                <w:rFonts w:ascii="Times New Roman" w:hAnsi="Times New Roman" w:cs="Times New Roman"/>
-              </w:rPr>
-              <w:t>1.67 hours completing the functional and nonfunctional sections of the Requirements Doc (03/16)</w:t>
-            </w:r>
-          </w:p>
-          <w:p>
-            <w:pPr>
-              <w:pStyle w:val="Prrafodelista"/>
-              <w:numPr>
-                <w:ilvl w:val="0"/>
-                <w:numId w:val="1"/>
-              </w:numPr>
-              <w:spacing w:line="360" w:lineRule="auto"/>
-              <w:rPr>
-                <w:rFonts w:ascii="Times New Roman" w:hAnsi="Times New Roman" w:cs="Times New Roman"/>
-              </w:rPr>
-            </w:pPr>
-            <w:r>
-              <w:rPr>
-                <w:rFonts w:ascii="Times New Roman" w:hAnsi="Times New Roman" w:cs="Times New Roman"/>
-              </w:rPr>
-              <w:t>~2 hours correcting Requirements Document (03/18)</w:t>
-            </w:r>
-          </w:p>
-          <w:p>
-            <w:pPr>
-              <w:pStyle w:val="Prrafodelista"/>
-              <w:numPr>
-                <w:ilvl w:val="0"/>
-                <w:numId w:val="1"/>
-              </w:numPr>
-              <w:spacing w:line="360" w:lineRule="auto"/>
-              <w:rPr>
-                <w:rFonts w:ascii="Times New Roman" w:hAnsi="Times New Roman" w:cs="Times New Roman"/>
-              </w:rPr>
-            </w:pPr>
-            <w:r>
-              <w:rPr>
-                <w:rFonts w:ascii="Times New Roman" w:hAnsi="Times New Roman" w:cs="Times New Roman"/>
-              </w:rPr>
-              <w:t>45 mins creating calendar for remainder of project assignments (03/18)</w:t>
-            </w:r>
-          </w:p>
-          <w:p>
-            <w:pPr>
-              <w:pStyle w:val="Prrafodelista"/>
-              <w:numPr>
-                <w:ilvl w:val="0"/>
-                <w:numId w:val="1"/>
-              </w:numPr>
-              <w:spacing w:line="360" w:lineRule="auto"/>
-              <w:rPr>
-                <w:rFonts w:ascii="Times New Roman" w:hAnsi="Times New Roman" w:cs="Times New Roman"/>
-              </w:rPr>
-            </w:pPr>
-            <w:r>
-              <w:rPr>
-                <w:rFonts w:ascii="Times New Roman" w:hAnsi="Times New Roman" w:cs="Times New Roman"/>
-              </w:rPr>
-              <w:t>~1 hour team meeting (03/19)</w:t>
-            </w:r>
-          </w:p>
-          <w:p>
-            <w:pPr>
-              <w:pStyle w:val="Prrafodelista"/>
-              <w:numPr>
-                <w:ilvl w:val="0"/>
-                <w:numId w:val="1"/>
-              </w:numPr>
-              <w:spacing w:line="360" w:lineRule="auto"/>
-              <w:rPr>
-                <w:rFonts w:ascii="Times New Roman" w:hAnsi="Times New Roman" w:cs="Times New Roman"/>
-              </w:rPr>
-            </w:pPr>
-            <w:r>
-              <w:rPr>
-                <w:rFonts w:ascii="Times New Roman" w:hAnsi="Times New Roman" w:cs="Times New Roman"/>
-              </w:rPr>
-              <w:t>~1.5 hours completing class documentation section of Requirements Document (03/20)</w:t>
-            </w:r>
-          </w:p>
-          <w:p>
-            <w:pPr>
-              <w:pStyle w:val="Prrafodelista"/>
-              <w:numPr>
-                <w:ilvl w:val="0"/>
-                <w:numId w:val="1"/>
-              </w:numPr>
-              <w:spacing w:line="360" w:lineRule="auto"/>
-              <w:rPr>
-                <w:rFonts w:ascii="Times New Roman" w:hAnsi="Times New Roman" w:cs="Times New Roman"/>
-              </w:rPr>
-            </w:pPr>
-            <w:r>
-              <w:rPr>
-                <w:rFonts w:ascii="Times New Roman" w:hAnsi="Times New Roman" w:cs="Times New Roman"/>
-              </w:rPr>
-              <w:t>1.5 hours working on class diagrams (03/20)</w:t>
-            </w:r>
-          </w:p>
-          <w:p>
-            <w:pPr>
-              <w:pStyle w:val="Prrafodelista"/>
-              <w:numPr>
-                <w:ilvl w:val="0"/>
-                <w:numId w:val="1"/>
-              </w:numPr>
-              <w:spacing w:line="360" w:lineRule="auto"/>
-              <w:rPr>
-                <w:rFonts w:ascii="Times New Roman" w:hAnsi="Times New Roman" w:cs="Times New Roman"/>
-              </w:rPr>
-            </w:pPr>
-            <w:r>
-              <w:rPr>
-                <w:rFonts w:ascii="Times New Roman" w:hAnsi="Times New Roman" w:cs="Times New Roman"/>
-              </w:rPr>
-              <w:t>~1.5 hours completing class diagrams (03/20)</w:t>
-            </w:r>
-          </w:p>
-          <w:p>
-            <w:pPr>
-              <w:pStyle w:val="Prrafodelista"/>
-              <w:numPr>
-                <w:ilvl w:val="0"/>
-                <w:numId w:val="1"/>
-              </w:numPr>
-              <w:spacing w:line="360" w:lineRule="auto"/>
-              <w:rPr>
-                <w:rFonts w:ascii="Times New Roman" w:hAnsi="Times New Roman" w:cs="Times New Roman"/>
-              </w:rPr>
-            </w:pPr>
-            <w:r>
-              <w:rPr>
-                <w:rFonts w:ascii="Times New Roman" w:hAnsi="Times New Roman" w:cs="Times New Roman"/>
-              </w:rPr>
-              <w:t>~4 completing flow of events diagram and decision tables (03/21)</w:t>
-            </w:r>
-          </w:p>
-        </w:tc>
-      </w:tr>
-      <w:tr>
-        <w:tc>
-          <w:tcPr>
-            <w:tcW w:w="1975" w:type="dxa"/>
-          </w:tcPr>
-          <w:p>
-            <w:pPr>
-              <w:spacing w:line="360" w:lineRule="auto"/>
-              <w:jc w:val="center"/>
-              <w:rPr>
-                <w:rFonts w:ascii="Times New Roman" w:hAnsi="Times New Roman" w:cs="Times New Roman"/>
-              </w:rPr>
-            </w:pPr>
-            <w:r>
-              <w:rPr>
-                <w:rFonts w:ascii="Times New Roman" w:hAnsi="Times New Roman" w:cs="Times New Roman"/>
-              </w:rPr>
               <w:t>03/23 – 03/28</w:t>
             </w:r>
           </w:p>
@@ -2839,7 +2924,7 @@
           </w:tcPr>
           <w:p>
             <w:pPr>
-              <w:pStyle w:val="Prrafodelista"/>
+              <w:pStyle w:val="ListParagraph"/>
               <w:numPr>
                 <w:ilvl w:val="0"/>
                 <w:numId w:val="1"/>
@@ -2858,7 +2943,7 @@
           </w:p>
           <w:p>
             <w:pPr>
-              <w:pStyle w:val="Prrafodelista"/>
+              <w:pStyle w:val="ListParagraph"/>
               <w:numPr>
                 <w:ilvl w:val="0"/>
                 <w:numId w:val="1"/>
@@ -2874,13 +2959,12 @@
                 <w:kern w:val="0"/>
                 <w14:ligatures w14:val="none"/>
               </w:rPr>
-              <w:lastRenderedPageBreak/>
               <w:t>2.83 hours Creating GUI draft pages (03/25)</w:t>
             </w:r>
           </w:p>
           <w:p>
             <w:pPr>
-              <w:pStyle w:val="Prrafodelista"/>
+              <w:pStyle w:val="ListParagraph"/>
               <w:numPr>
                 <w:ilvl w:val="0"/>
                 <w:numId w:val="1"/>
@@ -2904,26 +2988,63 @@
               <w:t>meeting (03/25)</w:t>
             </w:r>
           </w:p>
-        </w:tc>
-      </w:tr>
-      <w:tr>
-        <w:tc>
-          <w:tcPr>
-            <w:tcW w:w="1975" w:type="dxa"/>
-          </w:tcPr>
-          <w:p>
-            <w:pPr>
-              <w:spacing w:line="360" w:lineRule="auto"/>
-              <w:jc w:val="center"/>
-              <w:rPr>
-                <w:rFonts w:ascii="Times New Roman" w:hAnsi="Times New Roman" w:cs="Times New Roman"/>
-              </w:rPr>
-            </w:pPr>
-            <w:r>
-              <w:rPr>
-                <w:rFonts w:ascii="Times New Roman" w:hAnsi="Times New Roman" w:cs="Times New Roman"/>
-              </w:rPr>
-              <w:lastRenderedPageBreak/>
+          <w:p>
+            <w:pPr>
+              <w:pStyle w:val="ListParagraph"/>
+              <w:numPr>
+                <w:ilvl w:val="0"/>
+                <w:numId w:val="1"/>
+              </w:numPr>
+              <w:spacing w:line="360" w:lineRule="auto"/>
+              <w:rPr>
+                <w:rFonts w:ascii="Times New Roman" w:hAnsi="Times New Roman" w:cs="Times New Roman"/>
+              </w:rPr>
+            </w:pPr>
+            <w:r>
+              <w:rPr>
+                <w:rFonts w:ascii="Times New Roman" w:hAnsi="Times New Roman" w:cs="Times New Roman"/>
+              </w:rPr>
+              <w:t>4 hours working on GUI components (03/28)</w:t>
+            </w:r>
+          </w:p>
+          <w:p>
+            <w:pPr>
+              <w:pStyle w:val="ListParagraph"/>
+              <w:numPr>
+                <w:ilvl w:val="0"/>
+                <w:numId w:val="1"/>
+              </w:numPr>
+              <w:spacing w:line="360" w:lineRule="auto"/>
+              <w:rPr>
+                <w:rFonts w:ascii="Times New Roman" w:hAnsi="Times New Roman" w:cs="Times New Roman"/>
+              </w:rPr>
+            </w:pPr>
+            <w:r>
+              <w:rPr>
+                <w:rFonts w:ascii="Times New Roman" w:hAnsi="Times New Roman" w:cs="Times New Roman"/>
+              </w:rPr>
+              <w:t>~5 hours working on GUI components (03/28-03/29)</w:t>
+            </w:r>
+          </w:p>
+        </w:tc>
+      </w:tr>
+      <w:tr>
+        <w:tc>
+          <w:tcPr>
+            <w:tcW w:w="1975" w:type="dxa"/>
+          </w:tcPr>
+          <w:p>
+            <w:pPr>
+              <w:spacing w:line="360" w:lineRule="auto"/>
+              <w:jc w:val="center"/>
+              <w:rPr>
+                <w:rFonts w:ascii="Times New Roman" w:hAnsi="Times New Roman" w:cs="Times New Roman"/>
+              </w:rPr>
+            </w:pPr>
+            <w:r>
+              <w:rPr>
+                <w:rFonts w:ascii="Times New Roman" w:hAnsi="Times New Roman" w:cs="Times New Roman"/>
+              </w:rPr>
               <w:t>03/30 – 04/04</w:t>
             </w:r>
           </w:p>
@@ -3100,7 +3221,7 @@
     <w:sdtContent>
       <w:p>
         <w:pPr>
-          <w:pStyle w:val="Encabezado"/>
+          <w:pStyle w:val="Header"/>
           <w:jc w:val="right"/>
         </w:pPr>
         <w:r>
@@ -3114,7 +3235,7 @@
   </w:sdt>
   <w:p>
     <w:pPr>
-      <w:pStyle w:val="Encabezado"/>
+      <w:pStyle w:val="Header"/>
     </w:pPr>
   </w:p>
 </w:hdr>
@@ -3240,15 +3361,6 @@
   </w:num>
   <w:num w:numId="2" w16cid:durableId="445195328">
     <w:abstractNumId w:val="0"/>
-    <w:lvlOverride w:ilvl="0"/>
-    <w:lvlOverride w:ilvl="1"/>
-    <w:lvlOverride w:ilvl="2"/>
-    <w:lvlOverride w:ilvl="3"/>
-    <w:lvlOverride w:ilvl="4"/>
-    <w:lvlOverride w:ilvl="5"/>
-    <w:lvlOverride w:ilvl="6"/>
-    <w:lvlOverride w:ilvl="7"/>
-    <w:lvlOverride w:ilvl="8"/>
   </w:num>
 </w:numbering>
 </file>
@@ -3654,11 +3766,11 @@
     <w:name w:val="Normal"/>
     <w:qFormat/>
   </w:style>
-  <w:style w:type="paragraph" w:styleId="Ttulo1">
+  <w:style w:type="paragraph" w:styleId="Heading1">
     <w:name w:val="heading 1"/>
     <w:basedOn w:val="Normal"/>
     <w:next w:val="Normal"/>
-    <w:link w:val="Ttulo1Car"/>
+    <w:link w:val="Heading1Char"/>
     <w:uiPriority w:val="9"/>
     <w:qFormat/>
     <w:rsid w:val="001A62EF"/>
@@ -3675,11 +3787,11 @@
       <w:szCs w:val="40"/>
     </w:rPr>
   </w:style>
-  <w:style w:type="paragraph" w:styleId="Ttulo2">
+  <w:style w:type="paragraph" w:styleId="Heading2">
     <w:name w:val="heading 2"/>
     <w:basedOn w:val="Normal"/>
     <w:next w:val="Normal"/>
-    <w:link w:val="Ttulo2Car"/>
+    <w:link w:val="Heading2Char"/>
     <w:uiPriority w:val="9"/>
     <w:semiHidden/>
     <w:unhideWhenUsed/>
@@ -3698,11 +3810,11 @@
       <w:szCs w:val="32"/>
     </w:rPr>
   </w:style>
-  <w:style w:type="paragraph" w:styleId="Ttulo3">
+  <w:style w:type="paragraph" w:styleId="Heading3">
     <w:name w:val="heading 3"/>
     <w:basedOn w:val="Normal"/>
     <w:next w:val="Normal"/>
-    <w:link w:val="Ttulo3Car"/>
+    <w:link w:val="Heading3Char"/>
     <w:uiPriority w:val="9"/>
     <w:semiHidden/>
     <w:unhideWhenUsed/>
@@ -3721,11 +3833,11 @@
       <w:szCs w:val="28"/>
     </w:rPr>
   </w:style>
-  <w:style w:type="paragraph" w:styleId="Ttulo4">
+  <w:style w:type="paragraph" w:styleId="Heading4">
     <w:name w:val="heading 4"/>
     <w:basedOn w:val="Normal"/>
     <w:next w:val="Normal"/>
-    <w:link w:val="Ttulo4Car"/>
+    <w:link w:val="Heading4Char"/>
     <w:uiPriority w:val="9"/>
     <w:semiHidden/>
     <w:unhideWhenUsed/>
@@ -3744,11 +3856,11 @@
       <w:color w:val="0F4761" w:themeColor="accent1" w:themeShade="BF"/>
     </w:rPr>
   </w:style>
-  <w:style w:type="paragraph" w:styleId="Ttulo5">
+  <w:style w:type="paragraph" w:styleId="Heading5">
     <w:name w:val="heading 5"/>
     <w:basedOn w:val="Normal"/>
     <w:next w:val="Normal"/>
-    <w:link w:val="Ttulo5Car"/>
+    <w:link w:val="Heading5Char"/>
     <w:uiPriority w:val="9"/>
     <w:semiHidden/>
     <w:unhideWhenUsed/>
@@ -3765,11 +3877,11 @@
       <w:color w:val="0F4761" w:themeColor="accent1" w:themeShade="BF"/>
     </w:rPr>
   </w:style>
-  <w:style w:type="paragraph" w:styleId="Ttulo6">
+  <w:style w:type="paragraph" w:styleId="Heading6">
     <w:name w:val="heading 6"/>
     <w:basedOn w:val="Normal"/>
     <w:next w:val="Normal"/>
-    <w:link w:val="Ttulo6Car"/>
+    <w:link w:val="Heading6Char"/>
     <w:uiPriority w:val="9"/>
     <w:semiHidden/>
     <w:unhideWhenUsed/>
@@ -3788,11 +3900,11 @@
       <w:color w:val="595959" w:themeColor="text1" w:themeTint="A6"/>
     </w:rPr>
   </w:style>
-  <w:style w:type="paragraph" w:styleId="Ttulo7">
+  <w:style w:type="paragraph" w:styleId="Heading7">
     <w:name w:val="heading 7"/>
     <w:basedOn w:val="Normal"/>
     <w:next w:val="Normal"/>
-    <w:link w:val="Ttulo7Car"/>
+    <w:link w:val="Heading7Char"/>
     <w:uiPriority w:val="9"/>
     <w:semiHidden/>
     <w:unhideWhenUsed/>
@@ -3809,11 +3921,11 @@
       <w:color w:val="595959" w:themeColor="text1" w:themeTint="A6"/>
     </w:rPr>
   </w:style>
-  <w:style w:type="paragraph" w:styleId="Ttulo8">
+  <w:style w:type="paragraph" w:styleId="Heading8">
     <w:name w:val="heading 8"/>
     <w:basedOn w:val="Normal"/>
     <w:next w:val="Normal"/>
-    <w:link w:val="Ttulo8Car"/>
+    <w:link w:val="Heading8Char"/>
     <w:uiPriority w:val="9"/>
     <w:semiHidden/>
     <w:unhideWhenUsed/>
@@ -3832,11 +3944,11 @@
       <w:color w:val="272727" w:themeColor="text1" w:themeTint="D8"/>
     </w:rPr>
   </w:style>
-  <w:style w:type="paragraph" w:styleId="Ttulo9">
+  <w:style w:type="paragraph" w:styleId="Heading9">
     <w:name w:val="heading 9"/>
     <w:basedOn w:val="Normal"/>
     <w:next w:val="Normal"/>
-    <w:link w:val="Ttulo9Car"/>
+    <w:link w:val="Heading9Char"/>
     <w:uiPriority w:val="9"/>
     <w:semiHidden/>
     <w:unhideWhenUsed/>
@@ -3853,13 +3965,13 @@
       <w:color w:val="272727" w:themeColor="text1" w:themeTint="D8"/>
     </w:rPr>
   </w:style>
-  <w:style w:type="character" w:default="1" w:styleId="Fuentedeprrafopredeter">
+  <w:style w:type="character" w:default="1" w:styleId="DefaultParagraphFont">
     <w:name w:val="Default Paragraph Font"/>
     <w:uiPriority w:val="1"/>
     <w:semiHidden/>
     <w:unhideWhenUsed/>
   </w:style>
-  <w:style w:type="table" w:default="1" w:styleId="Tablanormal">
+  <w:style w:type="table" w:default="1" w:styleId="TableNormal">
     <w:name w:val="Normal Table"/>
     <w:uiPriority w:val="99"/>
     <w:semiHidden/>
@@ -3874,16 +3986,16 @@
       </w:tblCellMar>
     </w:tblPr>
   </w:style>
-  <w:style w:type="numbering" w:default="1" w:styleId="Sinlista">
+  <w:style w:type="numbering" w:default="1" w:styleId="NoList">
     <w:name w:val="No List"/>
     <w:uiPriority w:val="99"/>
     <w:semiHidden/>
     <w:unhideWhenUsed/>
   </w:style>
-  <w:style w:type="character" w:customStyle="1" w:styleId="Ttulo1Car">
-    <w:name w:val="Título 1 Car"/>
-    <w:basedOn w:val="Fuentedeprrafopredeter"/>
-    <w:link w:val="Ttulo1"/>
+  <w:style w:type="character" w:customStyle="1" w:styleId="Heading1Char">
+    <w:name w:val="Heading 1 Char"/>
+    <w:basedOn w:val="DefaultParagraphFont"/>
+    <w:link w:val="Heading1"/>
     <w:uiPriority w:val="9"/>
     <w:rsid w:val="001A62EF"/>
     <w:rPr>
@@ -3893,10 +4005,10 @@
       <w:szCs w:val="40"/>
     </w:rPr>
   </w:style>
-  <w:style w:type="character" w:customStyle="1" w:styleId="Ttulo2Car">
-    <w:name w:val="Título 2 Car"/>
-    <w:basedOn w:val="Fuentedeprrafopredeter"/>
-    <w:link w:val="Ttulo2"/>
+  <w:style w:type="character" w:customStyle="1" w:styleId="Heading2Char">
+    <w:name w:val="Heading 2 Char"/>
+    <w:basedOn w:val="DefaultParagraphFont"/>
+    <w:link w:val="Heading2"/>
     <w:uiPriority w:val="9"/>
     <w:semiHidden/>
     <w:rsid w:val="001A62EF"/>
@@ -3907,10 +4019,10 @@
       <w:szCs w:val="32"/>
     </w:rPr>
   </w:style>
-  <w:style w:type="character" w:customStyle="1" w:styleId="Ttulo3Car">
-    <w:name w:val="Título 3 Car"/>
-    <w:basedOn w:val="Fuentedeprrafopredeter"/>
-    <w:link w:val="Ttulo3"/>
+  <w:style w:type="character" w:customStyle="1" w:styleId="Heading3Char">
+    <w:name w:val="Heading 3 Char"/>
+    <w:basedOn w:val="DefaultParagraphFont"/>
+    <w:link w:val="Heading3"/>
     <w:uiPriority w:val="9"/>
     <w:semiHidden/>
     <w:rsid w:val="001A62EF"/>
@@ -3921,10 +4033,10 @@
       <w:szCs w:val="28"/>
     </w:rPr>
   </w:style>
-  <w:style w:type="character" w:customStyle="1" w:styleId="Ttulo4Car">
-    <w:name w:val="Título 4 Car"/>
-    <w:basedOn w:val="Fuentedeprrafopredeter"/>
-    <w:link w:val="Ttulo4"/>
+  <w:style w:type="character" w:customStyle="1" w:styleId="Heading4Char">
+    <w:name w:val="Heading 4 Char"/>
+    <w:basedOn w:val="DefaultParagraphFont"/>
+    <w:link w:val="Heading4"/>
     <w:uiPriority w:val="9"/>
     <w:semiHidden/>
     <w:rsid w:val="001A62EF"/>
@@ -3935,10 +4047,10 @@
       <w:color w:val="0F4761" w:themeColor="accent1" w:themeShade="BF"/>
     </w:rPr>
   </w:style>
-  <w:style w:type="character" w:customStyle="1" w:styleId="Ttulo5Car">
-    <w:name w:val="Título 5 Car"/>
-    <w:basedOn w:val="Fuentedeprrafopredeter"/>
-    <w:link w:val="Ttulo5"/>
+  <w:style w:type="character" w:customStyle="1" w:styleId="Heading5Char">
+    <w:name w:val="Heading 5 Char"/>
+    <w:basedOn w:val="DefaultParagraphFont"/>
+    <w:link w:val="Heading5"/>
     <w:uiPriority w:val="9"/>
     <w:semiHidden/>
     <w:rsid w:val="001A62EF"/>
@@ -3947,10 +4059,10 @@
       <w:color w:val="0F4761" w:themeColor="accent1" w:themeShade="BF"/>
     </w:rPr>
   </w:style>
-  <w:style w:type="character" w:customStyle="1" w:styleId="Ttulo6Car">
-    <w:name w:val="Título 6 Car"/>
-    <w:basedOn w:val="Fuentedeprrafopredeter"/>
-    <w:link w:val="Ttulo6"/>
+  <w:style w:type="character" w:customStyle="1" w:styleId="Heading6Char">
+    <w:name w:val="Heading 6 Char"/>
+    <w:basedOn w:val="DefaultParagraphFont"/>
+    <w:link w:val="Heading6"/>
     <w:uiPriority w:val="9"/>
     <w:semiHidden/>
     <w:rsid w:val="001A62EF"/>
@@ -3961,10 +4073,10 @@
       <w:color w:val="595959" w:themeColor="text1" w:themeTint="A6"/>
     </w:rPr>
   </w:style>
-  <w:style w:type="character" w:customStyle="1" w:styleId="Ttulo7Car">
-    <w:name w:val="Título 7 Car"/>
-    <w:basedOn w:val="Fuentedeprrafopredeter"/>
-    <w:link w:val="Ttulo7"/>
+  <w:style w:type="character" w:customStyle="1" w:styleId="Heading7Char">
+    <w:name w:val="Heading 7 Char"/>
+    <w:basedOn w:val="DefaultParagraphFont"/>
+    <w:link w:val="Heading7"/>
     <w:uiPriority w:val="9"/>
     <w:semiHidden/>
     <w:rsid w:val="001A62EF"/>
@@ -3973,10 +4085,10 @@
       <w:color w:val="595959" w:themeColor="text1" w:themeTint="A6"/>
     </w:rPr>
   </w:style>
-  <w:style w:type="character" w:customStyle="1" w:styleId="Ttulo8Car">
-    <w:name w:val="Título 8 Car"/>
-    <w:basedOn w:val="Fuentedeprrafopredeter"/>
-    <w:link w:val="Ttulo8"/>
+  <w:style w:type="character" w:customStyle="1" w:styleId="Heading8Char">
+    <w:name w:val="Heading 8 Char"/>
+    <w:basedOn w:val="DefaultParagraphFont"/>
+    <w:link w:val="Heading8"/>
     <w:uiPriority w:val="9"/>
     <w:semiHidden/>
     <w:rsid w:val="001A62EF"/>
@@ -3987,10 +4099,10 @@
       <w:color w:val="272727" w:themeColor="text1" w:themeTint="D8"/>
     </w:rPr>
   </w:style>
-  <w:style w:type="character" w:customStyle="1" w:styleId="Ttulo9Car">
-    <w:name w:val="Título 9 Car"/>
-    <w:basedOn w:val="Fuentedeprrafopredeter"/>
-    <w:link w:val="Ttulo9"/>
+  <w:style w:type="character" w:customStyle="1" w:styleId="Heading9Char">
+    <w:name w:val="Heading 9 Char"/>
+    <w:basedOn w:val="DefaultParagraphFont"/>
+    <w:link w:val="Heading9"/>
     <w:uiPriority w:val="9"/>
     <w:semiHidden/>
     <w:rsid w:val="001A62EF"/>
@@ -3999,11 +4111,11 @@
       <w:color w:val="272727" w:themeColor="text1" w:themeTint="D8"/>
     </w:rPr>
   </w:style>
-  <w:style w:type="paragraph" w:styleId="Ttulo">
+  <w:style w:type="paragraph" w:styleId="Title">
     <w:name w:val="Title"/>
     <w:basedOn w:val="Normal"/>
     <w:next w:val="Normal"/>
-    <w:link w:val="TtuloCar"/>
+    <w:link w:val="TitleChar"/>
     <w:uiPriority w:val="10"/>
     <w:qFormat/>
     <w:rsid w:val="001A62EF"/>
@@ -4019,10 +4131,10 @@
       <w:szCs w:val="56"/>
     </w:rPr>
   </w:style>
-  <w:style w:type="character" w:customStyle="1" w:styleId="TtuloCar">
-    <w:name w:val="Título Car"/>
-    <w:basedOn w:val="Fuentedeprrafopredeter"/>
-    <w:link w:val="Ttulo"/>
+  <w:style w:type="character" w:customStyle="1" w:styleId="TitleChar">
+    <w:name w:val="Title Char"/>
+    <w:basedOn w:val="DefaultParagraphFont"/>
+    <w:link w:val="Title"/>
     <w:uiPriority w:val="10"/>
     <w:rsid w:val="001A62EF"/>
     <w:rPr>
@@ -4033,11 +4145,11 @@
       <w:szCs w:val="56"/>
     </w:rPr>
   </w:style>
-  <w:style w:type="paragraph" w:styleId="Subttulo">
+  <w:style w:type="paragraph" w:styleId="Subtitle">
     <w:name w:val="Subtitle"/>
     <w:basedOn w:val="Normal"/>
     <w:next w:val="Normal"/>
-    <w:link w:val="SubttuloCar"/>
+    <w:link w:val="SubtitleChar"/>
     <w:uiPriority w:val="11"/>
     <w:qFormat/>
     <w:rsid w:val="001A62EF"/>
@@ -4054,10 +4166,10 @@
       <w:szCs w:val="28"/>
     </w:rPr>
   </w:style>
-  <w:style w:type="character" w:customStyle="1" w:styleId="SubttuloCar">
-    <w:name w:val="Subtítulo Car"/>
-    <w:basedOn w:val="Fuentedeprrafopredeter"/>
-    <w:link w:val="Subttulo"/>
+  <w:style w:type="character" w:customStyle="1" w:styleId="SubtitleChar">
+    <w:name w:val="Subtitle Char"/>
+    <w:basedOn w:val="DefaultParagraphFont"/>
+    <w:link w:val="Subtitle"/>
     <w:uiPriority w:val="11"/>
     <w:rsid w:val="001A62EF"/>
     <w:rPr>
@@ -4068,11 +4180,11 @@
       <w:szCs w:val="28"/>
     </w:rPr>
   </w:style>
-  <w:style w:type="paragraph" w:styleId="Cita">
+  <w:style w:type="paragraph" w:styleId="Quote">
     <w:name w:val="Quote"/>
     <w:basedOn w:val="Normal"/>
     <w:next w:val="Normal"/>
-    <w:link w:val="CitaCar"/>
+    <w:link w:val="QuoteChar"/>
     <w:uiPriority w:val="29"/>
     <w:qFormat/>
     <w:rsid w:val="001A62EF"/>
@@ -4086,10 +4198,10 @@
       <w:color w:val="404040" w:themeColor="text1" w:themeTint="BF"/>
     </w:rPr>
   </w:style>
-  <w:style w:type="character" w:customStyle="1" w:styleId="CitaCar">
-    <w:name w:val="Cita Car"/>
-    <w:basedOn w:val="Fuentedeprrafopredeter"/>
-    <w:link w:val="Cita"/>
+  <w:style w:type="character" w:customStyle="1" w:styleId="QuoteChar">
+    <w:name w:val="Quote Char"/>
+    <w:basedOn w:val="DefaultParagraphFont"/>
+    <w:link w:val="Quote"/>
     <w:uiPriority w:val="29"/>
     <w:rsid w:val="001A62EF"/>
     <w:rPr>
@@ -4098,7 +4210,7 @@
       <w:color w:val="404040" w:themeColor="text1" w:themeTint="BF"/>
     </w:rPr>
   </w:style>
-  <w:style w:type="paragraph" w:styleId="Prrafodelista">
+  <w:style w:type="paragraph" w:styleId="ListParagraph">
     <w:name w:val="List Paragraph"/>
     <w:basedOn w:val="Normal"/>
     <w:uiPriority w:val="34"/>
@@ -4109,9 +4221,9 @@
       <w:contextualSpacing/>
     </w:pPr>
   </w:style>
-  <w:style w:type="character" w:styleId="nfasisintenso">
+  <w:style w:type="character" w:styleId="IntenseEmphasis">
     <w:name w:val="Intense Emphasis"/>
-    <w:basedOn w:val="Fuentedeprrafopredeter"/>
+    <w:basedOn w:val="DefaultParagraphFont"/>
     <w:uiPriority w:val="21"/>
     <w:qFormat/>
     <w:rsid w:val="001A62EF"/>
@@ -4121,11 +4233,11 @@
       <w:color w:val="0F4761" w:themeColor="accent1" w:themeShade="BF"/>
     </w:rPr>
   </w:style>
-  <w:style w:type="paragraph" w:styleId="Citadestacada">
+  <w:style w:type="paragraph" w:styleId="IntenseQuote">
     <w:name w:val="Intense Quote"/>
     <w:basedOn w:val="Normal"/>
     <w:next w:val="Normal"/>
-    <w:link w:val="CitadestacadaCar"/>
+    <w:link w:val="IntenseQuoteChar"/>
     <w:uiPriority w:val="30"/>
     <w:qFormat/>
     <w:rsid w:val="001A62EF"/>
@@ -4144,10 +4256,10 @@
       <w:color w:val="0F4761" w:themeColor="accent1" w:themeShade="BF"/>
     </w:rPr>
   </w:style>
-  <w:style w:type="character" w:customStyle="1" w:styleId="CitadestacadaCar">
-    <w:name w:val="Cita destacada Car"/>
-    <w:basedOn w:val="Fuentedeprrafopredeter"/>
-    <w:link w:val="Citadestacada"/>
+  <w:style w:type="character" w:customStyle="1" w:styleId="IntenseQuoteChar">
+    <w:name w:val="Intense Quote Char"/>
+    <w:basedOn w:val="DefaultParagraphFont"/>
+    <w:link w:val="IntenseQuote"/>
     <w:uiPriority w:val="30"/>
     <w:rsid w:val="001A62EF"/>
     <w:rPr>
@@ -4156,9 +4268,9 @@
       <w:color w:val="0F4761" w:themeColor="accent1" w:themeShade="BF"/>
     </w:rPr>
   </w:style>
-  <w:style w:type="character" w:styleId="Referenciaintensa">
+  <w:style w:type="character" w:styleId="IntenseReference">
     <w:name w:val="Intense Reference"/>
-    <w:basedOn w:val="Fuentedeprrafopredeter"/>
+    <w:basedOn w:val="DefaultParagraphFont"/>
     <w:uiPriority w:val="32"/>
     <w:qFormat/>
     <w:rsid w:val="001A62EF"/>
@@ -4170,9 +4282,9 @@
       <w:spacing w:val="5"/>
     </w:rPr>
   </w:style>
-  <w:style w:type="table" w:styleId="Tablaconcuadrcula">
+  <w:style w:type="table" w:styleId="TableGrid">
     <w:name w:val="Table Grid"/>
-    <w:basedOn w:val="Tablanormal"/>
+    <w:basedOn w:val="TableNormal"/>
     <w:uiPriority w:val="39"/>
     <w:rsid w:val="0045417D"/>
     <w:pPr>
@@ -4189,7 +4301,7 @@
       </w:tblBorders>
     </w:tblPr>
   </w:style>
-  <w:style w:type="paragraph" w:styleId="Revisin">
+  <w:style w:type="paragraph" w:styleId="Revision">
     <w:name w:val="Revision"/>
     <w:hidden/>
     <w:uiPriority w:val="99"/>
@@ -4199,10 +4311,10 @@
       <w:spacing w:after="0" w:line="240" w:lineRule="auto"/>
     </w:pPr>
   </w:style>
-  <w:style w:type="paragraph" w:styleId="Encabezado">
+  <w:style w:type="paragraph" w:styleId="Header">
     <w:name w:val="header"/>
     <w:basedOn w:val="Normal"/>
-    <w:link w:val="EncabezadoCar"/>
+    <w:link w:val="HeaderChar"/>
     <w:uiPriority w:val="99"/>
     <w:unhideWhenUsed/>
     <w:rsid w:val="002818BE"/>
@@ -4214,17 +4326,17 @@
       <w:spacing w:after="0" w:line="240" w:lineRule="auto"/>
     </w:pPr>
   </w:style>
-  <w:style w:type="character" w:customStyle="1" w:styleId="EncabezadoCar">
-    <w:name w:val="Encabezado Car"/>
-    <w:basedOn w:val="Fuentedeprrafopredeter"/>
-    <w:link w:val="Encabezado"/>
+  <w:style w:type="character" w:customStyle="1" w:styleId="HeaderChar">
+    <w:name w:val="Header Char"/>
+    <w:basedOn w:val="DefaultParagraphFont"/>
+    <w:link w:val="Header"/>
     <w:uiPriority w:val="99"/>
     <w:rsid w:val="002818BE"/>
   </w:style>
-  <w:style w:type="paragraph" w:styleId="Piedepgina">
+  <w:style w:type="paragraph" w:styleId="Footer">
     <w:name w:val="footer"/>
     <w:basedOn w:val="Normal"/>
-    <w:link w:val="PiedepginaCar"/>
+    <w:link w:val="FooterChar"/>
     <w:uiPriority w:val="99"/>
     <w:unhideWhenUsed/>
     <w:rsid w:val="002818BE"/>
@@ -4236,10 +4348,10 @@
       <w:spacing w:after="0" w:line="240" w:lineRule="auto"/>
     </w:pPr>
   </w:style>
-  <w:style w:type="character" w:customStyle="1" w:styleId="PiedepginaCar">
-    <w:name w:val="Pie de página Car"/>
-    <w:basedOn w:val="Fuentedeprrafopredeter"/>
-    <w:link w:val="Piedepgina"/>
+  <w:style w:type="character" w:customStyle="1" w:styleId="FooterChar">
+    <w:name w:val="Footer Char"/>
+    <w:basedOn w:val="DefaultParagraphFont"/>
+    <w:link w:val="Footer"/>
     <w:uiPriority w:val="99"/>
     <w:rsid w:val="002818BE"/>
   </w:style>

</xml_diff>

<commit_message>
Meeting Records and Time Sheet updated
</commit_message>
<xml_diff>
--- a/Documentation/Records and Status Reports/Time Sheet.docx
+++ b/Documentation/Records and Status Reports/Time Sheet.docx
@@ -62,7 +62,7 @@
     </w:p>
     <w:tbl>
       <w:tblPr>
-        <w:tblStyle w:val="Tablaconcuadrcula"/>
+        <w:tblStyle w:val="TableGrid"/>
         <w:tblW w:w="0" w:type="auto"/>
         <w:tblLook w:val="04A0" w:firstRow="1" w:lastRow="0" w:firstColumn="1" w:lastColumn="0" w:noHBand="0" w:noVBand="1"/>
       </w:tblPr>
@@ -149,7 +149,7 @@
           </w:tcPr>
           <w:p>
             <w:pPr>
-              <w:pStyle w:val="Prrafodelista"/>
+              <w:pStyle w:val="ListParagraph"/>
               <w:numPr>
                 <w:ilvl w:val="0"/>
                 <w:numId w:val="1"/>
@@ -168,7 +168,7 @@
           </w:p>
           <w:p>
             <w:pPr>
-              <w:pStyle w:val="Prrafodelista"/>
+              <w:pStyle w:val="ListParagraph"/>
               <w:numPr>
                 <w:ilvl w:val="0"/>
                 <w:numId w:val="1"/>
@@ -187,7 +187,7 @@
           </w:p>
           <w:p>
             <w:pPr>
-              <w:pStyle w:val="Prrafodelista"/>
+              <w:pStyle w:val="ListParagraph"/>
               <w:numPr>
                 <w:ilvl w:val="0"/>
                 <w:numId w:val="1"/>
@@ -268,7 +268,7 @@
           </w:tcPr>
           <w:p>
             <w:pPr>
-              <w:pStyle w:val="Prrafodelista"/>
+              <w:pStyle w:val="ListParagraph"/>
               <w:numPr>
                 <w:ilvl w:val="0"/>
                 <w:numId w:val="1"/>
@@ -384,7 +384,7 @@
           </w:tcPr>
           <w:p>
             <w:pPr>
-              <w:pStyle w:val="Prrafodelista"/>
+              <w:pStyle w:val="ListParagraph"/>
               <w:numPr>
                 <w:ilvl w:val="0"/>
                 <w:numId w:val="1"/>
@@ -436,7 +436,7 @@
           </w:tcPr>
           <w:p>
             <w:pPr>
-              <w:pStyle w:val="Prrafodelista"/>
+              <w:pStyle w:val="ListParagraph"/>
               <w:numPr>
                 <w:ilvl w:val="0"/>
                 <w:numId w:val="1"/>
@@ -455,7 +455,7 @@
           </w:p>
           <w:p>
             <w:pPr>
-              <w:pStyle w:val="Prrafodelista"/>
+              <w:pStyle w:val="ListParagraph"/>
               <w:numPr>
                 <w:ilvl w:val="0"/>
                 <w:numId w:val="1"/>
@@ -501,6 +501,7 @@
           </w:tcPr>
           <w:p>
             <w:pPr>
+              <w:pStyle w:val="ListParagraph"/>
               <w:spacing w:line="360" w:lineRule="auto"/>
               <w:rPr>
                 <w:rFonts w:ascii="Times New Roman" w:hAnsi="Times New Roman" w:cs="Times New Roman"/>
@@ -536,11 +537,22 @@
           </w:tcPr>
           <w:p>
             <w:pPr>
-              <w:spacing w:line="360" w:lineRule="auto"/>
-              <w:rPr>
-                <w:rFonts w:ascii="Times New Roman" w:hAnsi="Times New Roman" w:cs="Times New Roman"/>
-              </w:rPr>
-            </w:pPr>
+              <w:pStyle w:val="ListParagraph"/>
+              <w:numPr>
+                <w:ilvl w:val="0"/>
+                <w:numId w:val="1"/>
+              </w:numPr>
+              <w:spacing w:line="360" w:lineRule="auto"/>
+              <w:rPr>
+                <w:rFonts w:ascii="Times New Roman" w:hAnsi="Times New Roman" w:cs="Times New Roman"/>
+              </w:rPr>
+            </w:pPr>
+            <w:r>
+              <w:rPr>
+                <w:rFonts w:ascii="Times New Roman" w:hAnsi="Times New Roman" w:cs="Times New Roman"/>
+              </w:rPr>
+              <w:t>1.5 hours on virtual meeting and coding for remaining modules (04/01)</w:t>
+            </w:r>
           </w:p>
         </w:tc>
       </w:tr>
@@ -650,7 +662,7 @@
     </w:p>
     <w:tbl>
       <w:tblPr>
-        <w:tblStyle w:val="Tablaconcuadrcula"/>
+        <w:tblStyle w:val="TableGrid"/>
         <w:tblW w:w="0" w:type="auto"/>
         <w:tblLook w:val="04A0" w:firstRow="1" w:lastRow="0" w:firstColumn="1" w:lastColumn="0" w:noHBand="0" w:noVBand="1"/>
       </w:tblPr>
@@ -737,7 +749,7 @@
           </w:tcPr>
           <w:p>
             <w:pPr>
-              <w:pStyle w:val="Prrafodelista"/>
+              <w:pStyle w:val="ListParagraph"/>
               <w:numPr>
                 <w:ilvl w:val="0"/>
                 <w:numId w:val="1"/>
@@ -756,7 +768,7 @@
           </w:p>
           <w:p>
             <w:pPr>
-              <w:pStyle w:val="Prrafodelista"/>
+              <w:pStyle w:val="ListParagraph"/>
               <w:numPr>
                 <w:ilvl w:val="0"/>
                 <w:numId w:val="1"/>
@@ -837,7 +849,7 @@
           </w:tcPr>
           <w:p>
             <w:pPr>
-              <w:pStyle w:val="Prrafodelista"/>
+              <w:pStyle w:val="ListParagraph"/>
               <w:numPr>
                 <w:ilvl w:val="0"/>
                 <w:numId w:val="1"/>
@@ -873,6 +885,7 @@
               <w:rPr>
                 <w:rFonts w:ascii="Times New Roman" w:hAnsi="Times New Roman" w:cs="Times New Roman"/>
               </w:rPr>
+              <w:lastRenderedPageBreak/>
               <w:t>02/23 – 02/28</w:t>
             </w:r>
           </w:p>
@@ -883,7 +896,7 @@
           </w:tcPr>
           <w:p>
             <w:pPr>
-              <w:pStyle w:val="Prrafodelista"/>
+              <w:pStyle w:val="ListParagraph"/>
               <w:numPr>
                 <w:ilvl w:val="0"/>
                 <w:numId w:val="1"/>
@@ -919,7 +932,6 @@
               <w:rPr>
                 <w:rFonts w:ascii="Times New Roman" w:hAnsi="Times New Roman" w:cs="Times New Roman"/>
               </w:rPr>
-              <w:lastRenderedPageBreak/>
               <w:t>03/02 – 03/07</w:t>
             </w:r>
           </w:p>
@@ -965,7 +977,7 @@
           </w:tcPr>
           <w:p>
             <w:pPr>
-              <w:pStyle w:val="Prrafodelista"/>
+              <w:pStyle w:val="ListParagraph"/>
               <w:numPr>
                 <w:ilvl w:val="0"/>
                 <w:numId w:val="1"/>
@@ -1017,7 +1029,7 @@
           </w:tcPr>
           <w:p>
             <w:pPr>
-              <w:pStyle w:val="Prrafodelista"/>
+              <w:pStyle w:val="ListParagraph"/>
               <w:numPr>
                 <w:ilvl w:val="0"/>
                 <w:numId w:val="1"/>
@@ -1063,7 +1075,7 @@
           </w:tcPr>
           <w:p>
             <w:pPr>
-              <w:pStyle w:val="Prrafodelista"/>
+              <w:pStyle w:val="ListParagraph"/>
               <w:numPr>
                 <w:ilvl w:val="0"/>
                 <w:numId w:val="1"/>
@@ -1116,11 +1128,22 @@
           </w:tcPr>
           <w:p>
             <w:pPr>
-              <w:spacing w:line="360" w:lineRule="auto"/>
-              <w:rPr>
-                <w:rFonts w:ascii="Times New Roman" w:hAnsi="Times New Roman" w:cs="Times New Roman"/>
-              </w:rPr>
-            </w:pPr>
+              <w:pStyle w:val="ListParagraph"/>
+              <w:numPr>
+                <w:ilvl w:val="0"/>
+                <w:numId w:val="1"/>
+              </w:numPr>
+              <w:spacing w:line="360" w:lineRule="auto"/>
+              <w:rPr>
+                <w:rFonts w:ascii="Times New Roman" w:hAnsi="Times New Roman" w:cs="Times New Roman"/>
+              </w:rPr>
+            </w:pPr>
+            <w:r>
+              <w:rPr>
+                <w:rFonts w:ascii="Times New Roman" w:hAnsi="Times New Roman" w:cs="Times New Roman"/>
+              </w:rPr>
+              <w:t>1.5 hours on virtual meeting and coding for remaining modules (04/01)</w:t>
+            </w:r>
           </w:p>
         </w:tc>
       </w:tr>
@@ -1222,7 +1245,7 @@
     </w:p>
     <w:tbl>
       <w:tblPr>
-        <w:tblStyle w:val="Tablaconcuadrcula"/>
+        <w:tblStyle w:val="TableGrid"/>
         <w:tblW w:w="0" w:type="auto"/>
         <w:tblLook w:val="04A0" w:firstRow="1" w:lastRow="0" w:firstColumn="1" w:lastColumn="0" w:noHBand="0" w:noVBand="1"/>
       </w:tblPr>
@@ -1309,7 +1332,7 @@
           </w:tcPr>
           <w:p>
             <w:pPr>
-              <w:pStyle w:val="Prrafodelista"/>
+              <w:pStyle w:val="ListParagraph"/>
               <w:numPr>
                 <w:ilvl w:val="0"/>
                 <w:numId w:val="1"/>
@@ -1328,7 +1351,7 @@
           </w:p>
           <w:p>
             <w:pPr>
-              <w:pStyle w:val="Prrafodelista"/>
+              <w:pStyle w:val="ListParagraph"/>
               <w:numPr>
                 <w:ilvl w:val="0"/>
                 <w:numId w:val="1"/>
@@ -1347,7 +1370,7 @@
           </w:p>
           <w:p>
             <w:pPr>
-              <w:pStyle w:val="Prrafodelista"/>
+              <w:pStyle w:val="ListParagraph"/>
               <w:numPr>
                 <w:ilvl w:val="0"/>
                 <w:numId w:val="1"/>
@@ -1469,7 +1492,7 @@
           </w:tcPr>
           <w:p>
             <w:pPr>
-              <w:pStyle w:val="Prrafodelista"/>
+              <w:pStyle w:val="ListParagraph"/>
               <w:numPr>
                 <w:ilvl w:val="0"/>
                 <w:numId w:val="1"/>
@@ -1550,7 +1573,7 @@
           </w:tcPr>
           <w:p>
             <w:pPr>
-              <w:pStyle w:val="Prrafodelista"/>
+              <w:pStyle w:val="ListParagraph"/>
               <w:numPr>
                 <w:ilvl w:val="0"/>
                 <w:numId w:val="1"/>
@@ -1602,7 +1625,7 @@
           </w:tcPr>
           <w:p>
             <w:pPr>
-              <w:pStyle w:val="Prrafodelista"/>
+              <w:pStyle w:val="ListParagraph"/>
               <w:numPr>
                 <w:ilvl w:val="0"/>
                 <w:numId w:val="1"/>
@@ -1683,11 +1706,22 @@
           </w:tcPr>
           <w:p>
             <w:pPr>
-              <w:spacing w:line="360" w:lineRule="auto"/>
-              <w:rPr>
-                <w:rFonts w:ascii="Times New Roman" w:hAnsi="Times New Roman" w:cs="Times New Roman"/>
-              </w:rPr>
-            </w:pPr>
+              <w:pStyle w:val="ListParagraph"/>
+              <w:numPr>
+                <w:ilvl w:val="0"/>
+                <w:numId w:val="1"/>
+              </w:numPr>
+              <w:spacing w:line="360" w:lineRule="auto"/>
+              <w:rPr>
+                <w:rFonts w:ascii="Times New Roman" w:hAnsi="Times New Roman" w:cs="Times New Roman"/>
+              </w:rPr>
+            </w:pPr>
+            <w:r>
+              <w:rPr>
+                <w:rFonts w:ascii="Times New Roman" w:hAnsi="Times New Roman" w:cs="Times New Roman"/>
+              </w:rPr>
+              <w:t>1.5 hours on virtual meeting and coding for remaining modules (04/01)</w:t>
+            </w:r>
           </w:p>
         </w:tc>
       </w:tr>
@@ -1789,7 +1823,7 @@
     </w:p>
     <w:tbl>
       <w:tblPr>
-        <w:tblStyle w:val="Tablaconcuadrcula"/>
+        <w:tblStyle w:val="TableGrid"/>
         <w:tblW w:w="0" w:type="auto"/>
         <w:tblLook w:val="04A0" w:firstRow="1" w:lastRow="0" w:firstColumn="1" w:lastColumn="0" w:noHBand="0" w:noVBand="1"/>
       </w:tblPr>
@@ -1819,6 +1853,7 @@
                 <w:b/>
                 <w:bCs/>
               </w:rPr>
+              <w:lastRenderedPageBreak/>
               <w:t>Week</w:t>
             </w:r>
           </w:p>
@@ -1876,7 +1911,7 @@
           </w:tcPr>
           <w:p>
             <w:pPr>
-              <w:pStyle w:val="Prrafodelista"/>
+              <w:pStyle w:val="ListParagraph"/>
               <w:numPr>
                 <w:ilvl w:val="0"/>
                 <w:numId w:val="1"/>
@@ -1896,92 +1931,900 @@
               <w:rPr>
                 <w:rFonts w:ascii="Times New Roman" w:hAnsi="Times New Roman" w:cs="Times New Roman"/>
               </w:rPr>
-              <w:t xml:space="preserve">ewing Project Plan outline, creating and formatting documents for record keeping, creating and formatting document </w:t>
-            </w:r>
+              <w:t>ewing Project Plan outline, creating and formatting documents for record keeping, creating and formatting document for Project Plan submission, and creating and organizing GitHub repository (02/02)</w:t>
+            </w:r>
+          </w:p>
+          <w:p>
+            <w:pPr>
+              <w:pStyle w:val="ListParagraph"/>
+              <w:numPr>
+                <w:ilvl w:val="0"/>
+                <w:numId w:val="1"/>
+              </w:numPr>
+              <w:spacing w:line="360" w:lineRule="auto"/>
+              <w:rPr>
+                <w:rFonts w:ascii="Times New Roman" w:hAnsi="Times New Roman" w:cs="Times New Roman"/>
+              </w:rPr>
+            </w:pPr>
+            <w:proofErr w:type="gramStart"/>
+            <w:r>
+              <w:rPr>
+                <w:rFonts w:ascii="Times New Roman" w:hAnsi="Times New Roman" w:cs="Times New Roman"/>
+              </w:rPr>
+              <w:t>2 hour</w:t>
+            </w:r>
+            <w:proofErr w:type="gramEnd"/>
+            <w:r>
+              <w:rPr>
+                <w:rFonts w:ascii="Times New Roman" w:hAnsi="Times New Roman" w:cs="Times New Roman"/>
+              </w:rPr>
+              <w:t xml:space="preserve"> team meeting (02/03)</w:t>
+            </w:r>
+          </w:p>
+          <w:p>
+            <w:pPr>
+              <w:pStyle w:val="ListParagraph"/>
+              <w:numPr>
+                <w:ilvl w:val="0"/>
+                <w:numId w:val="1"/>
+              </w:numPr>
+              <w:spacing w:line="360" w:lineRule="auto"/>
+              <w:rPr>
+                <w:rFonts w:ascii="Times New Roman" w:hAnsi="Times New Roman" w:cs="Times New Roman"/>
+              </w:rPr>
+            </w:pPr>
+            <w:r>
+              <w:rPr>
+                <w:rFonts w:ascii="Times New Roman" w:hAnsi="Times New Roman" w:cs="Times New Roman"/>
+              </w:rPr>
+              <w:t>2.2 hours updating resume, listing tasks for Project Plan’s scope, assigning and clarifying team roles, confirming and recording team resources/tools (02/04)</w:t>
+            </w:r>
+          </w:p>
+          <w:p>
+            <w:pPr>
+              <w:pStyle w:val="ListParagraph"/>
+              <w:numPr>
+                <w:ilvl w:val="0"/>
+                <w:numId w:val="1"/>
+              </w:numPr>
+              <w:spacing w:line="360" w:lineRule="auto"/>
+              <w:rPr>
+                <w:rFonts w:ascii="Times New Roman" w:hAnsi="Times New Roman" w:cs="Times New Roman"/>
+              </w:rPr>
+            </w:pPr>
+            <w:r>
+              <w:rPr>
+                <w:rFonts w:ascii="Times New Roman" w:hAnsi="Times New Roman" w:cs="Times New Roman"/>
+              </w:rPr>
+              <w:t>2 hours working on WBS (02/05)</w:t>
+            </w:r>
+          </w:p>
+        </w:tc>
+      </w:tr>
+      <w:tr>
+        <w:tc>
+          <w:tcPr>
+            <w:tcW w:w="1975" w:type="dxa"/>
+          </w:tcPr>
+          <w:p>
+            <w:pPr>
+              <w:spacing w:line="360" w:lineRule="auto"/>
+              <w:jc w:val="center"/>
+              <w:rPr>
+                <w:rFonts w:ascii="Times New Roman" w:hAnsi="Times New Roman" w:cs="Times New Roman"/>
+              </w:rPr>
+            </w:pPr>
+            <w:r>
+              <w:rPr>
+                <w:rFonts w:ascii="Times New Roman" w:hAnsi="Times New Roman" w:cs="Times New Roman"/>
+              </w:rPr>
+              <w:t>02/08 – 02/14</w:t>
+            </w:r>
+          </w:p>
+        </w:tc>
+        <w:tc>
+          <w:tcPr>
+            <w:tcW w:w="7375" w:type="dxa"/>
+          </w:tcPr>
+          <w:p>
+            <w:pPr>
+              <w:pStyle w:val="ListParagraph"/>
+              <w:numPr>
+                <w:ilvl w:val="0"/>
+                <w:numId w:val="1"/>
+              </w:numPr>
+              <w:spacing w:line="360" w:lineRule="auto"/>
+              <w:rPr>
+                <w:rFonts w:ascii="Times New Roman" w:hAnsi="Times New Roman" w:cs="Times New Roman"/>
+              </w:rPr>
+            </w:pPr>
+            <w:r>
+              <w:rPr>
+                <w:rFonts w:ascii="Times New Roman" w:hAnsi="Times New Roman" w:cs="Times New Roman"/>
+              </w:rPr>
+              <w:t>2.2 hours working on the testing section of the Project Plan, updating my resume, and updating meeting notes (02/10)</w:t>
+            </w:r>
+          </w:p>
+          <w:p>
+            <w:pPr>
+              <w:pStyle w:val="ListParagraph"/>
+              <w:numPr>
+                <w:ilvl w:val="0"/>
+                <w:numId w:val="1"/>
+              </w:numPr>
+              <w:spacing w:line="360" w:lineRule="auto"/>
+              <w:rPr>
+                <w:rFonts w:ascii="Times New Roman" w:hAnsi="Times New Roman" w:cs="Times New Roman"/>
+              </w:rPr>
+            </w:pPr>
+            <w:r>
+              <w:rPr>
+                <w:rFonts w:ascii="Times New Roman" w:hAnsi="Times New Roman" w:cs="Times New Roman"/>
+              </w:rPr>
+              <w:t>1.8 hours completing the testing section, continuing work on WBS (02/12)</w:t>
+            </w:r>
+          </w:p>
+        </w:tc>
+      </w:tr>
+      <w:tr>
+        <w:tc>
+          <w:tcPr>
+            <w:tcW w:w="1975" w:type="dxa"/>
+          </w:tcPr>
+          <w:p>
+            <w:pPr>
+              <w:spacing w:line="360" w:lineRule="auto"/>
+              <w:jc w:val="center"/>
+              <w:rPr>
+                <w:rFonts w:ascii="Times New Roman" w:hAnsi="Times New Roman" w:cs="Times New Roman"/>
+              </w:rPr>
+            </w:pPr>
+            <w:r>
+              <w:rPr>
+                <w:rFonts w:ascii="Times New Roman" w:hAnsi="Times New Roman" w:cs="Times New Roman"/>
+              </w:rPr>
+              <w:t>02/16 – 02/21</w:t>
+            </w:r>
+          </w:p>
+        </w:tc>
+        <w:tc>
+          <w:tcPr>
+            <w:tcW w:w="7375" w:type="dxa"/>
+          </w:tcPr>
+          <w:p>
+            <w:pPr>
+              <w:pStyle w:val="ListParagraph"/>
+              <w:numPr>
+                <w:ilvl w:val="0"/>
+                <w:numId w:val="1"/>
+              </w:numPr>
+              <w:spacing w:line="360" w:lineRule="auto"/>
+              <w:rPr>
+                <w:rFonts w:ascii="Times New Roman" w:hAnsi="Times New Roman" w:cs="Times New Roman"/>
+              </w:rPr>
+            </w:pPr>
+            <w:r>
+              <w:rPr>
+                <w:rFonts w:ascii="Times New Roman" w:hAnsi="Times New Roman" w:cs="Times New Roman"/>
+              </w:rPr>
+              <w:t>57 mins organizing GitHub repo and message team about upcoming schedule and others (02/16)</w:t>
+            </w:r>
+          </w:p>
+          <w:p>
+            <w:pPr>
+              <w:pStyle w:val="ListParagraph"/>
+              <w:numPr>
+                <w:ilvl w:val="0"/>
+                <w:numId w:val="1"/>
+              </w:numPr>
+              <w:spacing w:line="360" w:lineRule="auto"/>
+              <w:rPr>
+                <w:rFonts w:ascii="Times New Roman" w:hAnsi="Times New Roman" w:cs="Times New Roman"/>
+              </w:rPr>
+            </w:pPr>
+            <w:r>
+              <w:rPr>
+                <w:rFonts w:ascii="Times New Roman" w:hAnsi="Times New Roman" w:cs="Times New Roman"/>
+              </w:rPr>
+              <w:t>5.2 hours designing architecture of login/sign up module, drafting GUI, assigning staff usernames (02/16)</w:t>
+            </w:r>
+          </w:p>
+          <w:p>
+            <w:pPr>
+              <w:pStyle w:val="ListParagraph"/>
+              <w:numPr>
+                <w:ilvl w:val="0"/>
+                <w:numId w:val="1"/>
+              </w:numPr>
+              <w:spacing w:line="360" w:lineRule="auto"/>
+              <w:rPr>
+                <w:rFonts w:ascii="Times New Roman" w:hAnsi="Times New Roman" w:cs="Times New Roman"/>
+              </w:rPr>
+            </w:pPr>
+            <w:r>
+              <w:rPr>
+                <w:rFonts w:ascii="Times New Roman" w:hAnsi="Times New Roman" w:cs="Times New Roman"/>
+              </w:rPr>
+              <w:t>40 mins designing initial schema for database (02/17)</w:t>
+            </w:r>
+          </w:p>
+          <w:p>
+            <w:pPr>
+              <w:pStyle w:val="ListParagraph"/>
+              <w:numPr>
+                <w:ilvl w:val="0"/>
+                <w:numId w:val="1"/>
+              </w:numPr>
+              <w:spacing w:line="360" w:lineRule="auto"/>
+              <w:rPr>
+                <w:rFonts w:ascii="Times New Roman" w:hAnsi="Times New Roman" w:cs="Times New Roman"/>
+              </w:rPr>
+            </w:pPr>
+            <w:r>
+              <w:rPr>
+                <w:rFonts w:ascii="Times New Roman" w:hAnsi="Times New Roman" w:cs="Times New Roman"/>
+              </w:rPr>
+              <w:t>30 mins creating database ERD (02/17)</w:t>
+            </w:r>
+          </w:p>
+          <w:p>
+            <w:pPr>
+              <w:pStyle w:val="ListParagraph"/>
+              <w:numPr>
+                <w:ilvl w:val="0"/>
+                <w:numId w:val="1"/>
+              </w:numPr>
+              <w:spacing w:line="360" w:lineRule="auto"/>
+              <w:rPr>
+                <w:rFonts w:ascii="Times New Roman" w:hAnsi="Times New Roman" w:cs="Times New Roman"/>
+              </w:rPr>
+            </w:pPr>
+            <w:r>
+              <w:rPr>
+                <w:rFonts w:ascii="Times New Roman" w:hAnsi="Times New Roman" w:cs="Times New Roman"/>
+              </w:rPr>
+              <w:t>1.2 hour in-class, team meeting (02/17)</w:t>
+            </w:r>
+          </w:p>
+          <w:p>
+            <w:pPr>
+              <w:pStyle w:val="ListParagraph"/>
+              <w:numPr>
+                <w:ilvl w:val="0"/>
+                <w:numId w:val="1"/>
+              </w:numPr>
+              <w:spacing w:line="360" w:lineRule="auto"/>
+              <w:rPr>
+                <w:rFonts w:ascii="Times New Roman" w:hAnsi="Times New Roman" w:cs="Times New Roman"/>
+              </w:rPr>
+            </w:pPr>
+            <w:r>
+              <w:rPr>
+                <w:rFonts w:ascii="Times New Roman" w:hAnsi="Times New Roman" w:cs="Times New Roman"/>
+              </w:rPr>
+              <w:t>1.17 hours making use case diagrams</w:t>
+            </w:r>
+          </w:p>
+        </w:tc>
+      </w:tr>
+      <w:tr>
+        <w:tc>
+          <w:tcPr>
+            <w:tcW w:w="1975" w:type="dxa"/>
+          </w:tcPr>
+          <w:p>
+            <w:pPr>
+              <w:spacing w:line="360" w:lineRule="auto"/>
+              <w:jc w:val="center"/>
+              <w:rPr>
+                <w:rFonts w:ascii="Times New Roman" w:hAnsi="Times New Roman" w:cs="Times New Roman"/>
+              </w:rPr>
+            </w:pPr>
+            <w:r>
+              <w:rPr>
+                <w:rFonts w:ascii="Times New Roman" w:hAnsi="Times New Roman" w:cs="Times New Roman"/>
+              </w:rPr>
+              <w:t>02/23 – 02/28</w:t>
+            </w:r>
+          </w:p>
+        </w:tc>
+        <w:tc>
+          <w:tcPr>
+            <w:tcW w:w="7375" w:type="dxa"/>
+          </w:tcPr>
+          <w:p>
+            <w:pPr>
+              <w:pStyle w:val="ListParagraph"/>
+              <w:numPr>
+                <w:ilvl w:val="0"/>
+                <w:numId w:val="1"/>
+              </w:numPr>
+              <w:spacing w:line="360" w:lineRule="auto"/>
+              <w:rPr>
+                <w:rFonts w:ascii="Times New Roman" w:hAnsi="Times New Roman" w:cs="Times New Roman"/>
+              </w:rPr>
+            </w:pPr>
+            <w:r>
+              <w:rPr>
+                <w:rFonts w:ascii="Times New Roman" w:hAnsi="Times New Roman" w:cs="Times New Roman"/>
+              </w:rPr>
+              <w:t>1 hour completing status report for week 02/16 to 02/20 (02/26)</w:t>
+            </w:r>
+          </w:p>
+          <w:p>
+            <w:pPr>
+              <w:pStyle w:val="ListParagraph"/>
+              <w:numPr>
+                <w:ilvl w:val="0"/>
+                <w:numId w:val="1"/>
+              </w:numPr>
+              <w:spacing w:line="360" w:lineRule="auto"/>
+              <w:rPr>
+                <w:rFonts w:ascii="Times New Roman" w:hAnsi="Times New Roman" w:cs="Times New Roman"/>
+              </w:rPr>
+            </w:pPr>
+            <w:r>
+              <w:rPr>
+                <w:rFonts w:ascii="Times New Roman" w:hAnsi="Times New Roman" w:cs="Times New Roman"/>
+              </w:rPr>
+              <w:t>1 hour team meeting (02/26)</w:t>
+            </w:r>
+          </w:p>
+          <w:p>
+            <w:pPr>
+              <w:pStyle w:val="ListParagraph"/>
+              <w:numPr>
+                <w:ilvl w:val="0"/>
+                <w:numId w:val="1"/>
+              </w:numPr>
+              <w:spacing w:line="360" w:lineRule="auto"/>
+              <w:rPr>
+                <w:rFonts w:ascii="Times New Roman" w:hAnsi="Times New Roman" w:cs="Times New Roman"/>
+              </w:rPr>
+            </w:pPr>
+            <w:r>
+              <w:rPr>
+                <w:rFonts w:ascii="Times New Roman" w:hAnsi="Times New Roman" w:cs="Times New Roman"/>
+              </w:rPr>
+              <w:t>3 hours updating architecture design doc for clock-in/out, drafting GUI for clock-in/out module (02/27, 02/28)</w:t>
+            </w:r>
+          </w:p>
+          <w:p>
+            <w:pPr>
+              <w:pStyle w:val="ListParagraph"/>
+              <w:numPr>
+                <w:ilvl w:val="0"/>
+                <w:numId w:val="1"/>
+              </w:numPr>
+              <w:spacing w:line="360" w:lineRule="auto"/>
+              <w:rPr>
+                <w:rFonts w:ascii="Times New Roman" w:hAnsi="Times New Roman" w:cs="Times New Roman"/>
+              </w:rPr>
+            </w:pPr>
+            <w:r>
+              <w:rPr>
+                <w:rFonts w:ascii="Times New Roman" w:hAnsi="Times New Roman" w:cs="Times New Roman"/>
+              </w:rPr>
+              <w:t>1.67</w:t>
+            </w:r>
+            <w:r>
+              <w:rPr>
+                <w:rFonts w:ascii="Times New Roman" w:hAnsi="Times New Roman" w:cs="Times New Roman"/>
+              </w:rPr>
+              <w:t xml:space="preserve"> hours updating Login GUI drafts, updating Login architecture, updating architecture standards (02/28)</w:t>
+            </w:r>
+          </w:p>
+        </w:tc>
+      </w:tr>
+      <w:tr>
+        <w:tc>
+          <w:tcPr>
+            <w:tcW w:w="1975" w:type="dxa"/>
+          </w:tcPr>
+          <w:p>
+            <w:pPr>
+              <w:spacing w:line="360" w:lineRule="auto"/>
+              <w:jc w:val="center"/>
+              <w:rPr>
+                <w:rFonts w:ascii="Times New Roman" w:hAnsi="Times New Roman" w:cs="Times New Roman"/>
+              </w:rPr>
+            </w:pPr>
+            <w:r>
+              <w:rPr>
+                <w:rFonts w:ascii="Times New Roman" w:hAnsi="Times New Roman" w:cs="Times New Roman"/>
+              </w:rPr>
+              <w:t>03/02 – 03/07</w:t>
+            </w:r>
+          </w:p>
+        </w:tc>
+        <w:tc>
+          <w:tcPr>
+            <w:tcW w:w="7375" w:type="dxa"/>
+          </w:tcPr>
+          <w:p>
+            <w:pPr>
+              <w:pStyle w:val="ListParagraph"/>
+              <w:numPr>
+                <w:ilvl w:val="0"/>
+                <w:numId w:val="1"/>
+              </w:numPr>
+              <w:spacing w:line="360" w:lineRule="auto"/>
+              <w:rPr>
+                <w:rFonts w:ascii="Times New Roman" w:hAnsi="Times New Roman" w:cs="Times New Roman"/>
+              </w:rPr>
+            </w:pPr>
+            <w:r>
+              <w:rPr>
+                <w:rFonts w:ascii="Times New Roman" w:hAnsi="Times New Roman" w:cs="Times New Roman"/>
+              </w:rPr>
+              <w:t>1.7 hours updating schema (03/02)</w:t>
+            </w:r>
+          </w:p>
+          <w:p>
+            <w:pPr>
+              <w:pStyle w:val="ListParagraph"/>
+              <w:numPr>
+                <w:ilvl w:val="0"/>
+                <w:numId w:val="1"/>
+              </w:numPr>
+              <w:spacing w:line="360" w:lineRule="auto"/>
+              <w:rPr>
+                <w:rFonts w:ascii="Times New Roman" w:hAnsi="Times New Roman" w:cs="Times New Roman"/>
+              </w:rPr>
+            </w:pPr>
+            <w:r>
+              <w:rPr>
+                <w:rFonts w:ascii="Times New Roman" w:hAnsi="Times New Roman" w:cs="Times New Roman"/>
+              </w:rPr>
+              <w:t>30 minutes updating status report (03/02)</w:t>
+            </w:r>
+          </w:p>
+        </w:tc>
+      </w:tr>
+      <w:tr>
+        <w:tc>
+          <w:tcPr>
+            <w:tcW w:w="1975" w:type="dxa"/>
+          </w:tcPr>
+          <w:p>
+            <w:pPr>
+              <w:spacing w:line="360" w:lineRule="auto"/>
+              <w:jc w:val="center"/>
+              <w:rPr>
+                <w:rFonts w:ascii="Times New Roman" w:hAnsi="Times New Roman" w:cs="Times New Roman"/>
+              </w:rPr>
+            </w:pPr>
             <w:r>
               <w:rPr>
                 <w:rFonts w:ascii="Times New Roman" w:hAnsi="Times New Roman" w:cs="Times New Roman"/>
               </w:rPr>
               <w:lastRenderedPageBreak/>
-              <w:t>for Project Plan submission, and creating and organizing GitHub repository (02/02)</w:t>
-            </w:r>
-          </w:p>
-          <w:p>
-            <w:pPr>
-              <w:pStyle w:val="Prrafodelista"/>
-              <w:numPr>
-                <w:ilvl w:val="0"/>
-                <w:numId w:val="1"/>
-              </w:numPr>
-              <w:spacing w:line="360" w:lineRule="auto"/>
-              <w:rPr>
-                <w:rFonts w:ascii="Times New Roman" w:hAnsi="Times New Roman" w:cs="Times New Roman"/>
-              </w:rPr>
-            </w:pPr>
-            <w:proofErr w:type="gramStart"/>
-            <w:r>
-              <w:rPr>
-                <w:rFonts w:ascii="Times New Roman" w:hAnsi="Times New Roman" w:cs="Times New Roman"/>
-              </w:rPr>
-              <w:t>2 hour</w:t>
-            </w:r>
-            <w:proofErr w:type="gramEnd"/>
-            <w:r>
-              <w:rPr>
-                <w:rFonts w:ascii="Times New Roman" w:hAnsi="Times New Roman" w:cs="Times New Roman"/>
-              </w:rPr>
-              <w:t xml:space="preserve"> team meeting (02/03)</w:t>
-            </w:r>
-          </w:p>
-          <w:p>
-            <w:pPr>
-              <w:pStyle w:val="Prrafodelista"/>
-              <w:numPr>
-                <w:ilvl w:val="0"/>
-                <w:numId w:val="1"/>
-              </w:numPr>
-              <w:spacing w:line="360" w:lineRule="auto"/>
-              <w:rPr>
-                <w:rFonts w:ascii="Times New Roman" w:hAnsi="Times New Roman" w:cs="Times New Roman"/>
-              </w:rPr>
-            </w:pPr>
-            <w:r>
-              <w:rPr>
-                <w:rFonts w:ascii="Times New Roman" w:hAnsi="Times New Roman" w:cs="Times New Roman"/>
-              </w:rPr>
-              <w:t>2.2 hours updating resume, listing tasks for Project Plan’s scope, assigning and clarifying team roles, confirming and recording team resources/tools (02/04)</w:t>
-            </w:r>
-          </w:p>
-          <w:p>
-            <w:pPr>
-              <w:pStyle w:val="Prrafodelista"/>
-              <w:numPr>
-                <w:ilvl w:val="0"/>
-                <w:numId w:val="1"/>
-              </w:numPr>
-              <w:spacing w:line="360" w:lineRule="auto"/>
-              <w:rPr>
-                <w:rFonts w:ascii="Times New Roman" w:hAnsi="Times New Roman" w:cs="Times New Roman"/>
-              </w:rPr>
-            </w:pPr>
-            <w:r>
-              <w:rPr>
-                <w:rFonts w:ascii="Times New Roman" w:hAnsi="Times New Roman" w:cs="Times New Roman"/>
-              </w:rPr>
-              <w:t>2 hours working on WBS (02/05)</w:t>
-            </w:r>
-          </w:p>
-        </w:tc>
-      </w:tr>
-      <w:tr>
-        <w:tc>
-          <w:tcPr>
-            <w:tcW w:w="1975" w:type="dxa"/>
-          </w:tcPr>
-          <w:p>
-            <w:pPr>
-              <w:spacing w:line="360" w:lineRule="auto"/>
-              <w:jc w:val="center"/>
+              <w:t>03/09 – 03/14</w:t>
+            </w:r>
+          </w:p>
+        </w:tc>
+        <w:tc>
+          <w:tcPr>
+            <w:tcW w:w="7375" w:type="dxa"/>
+          </w:tcPr>
+          <w:p>
+            <w:pPr>
+              <w:pStyle w:val="ListParagraph"/>
+              <w:numPr>
+                <w:ilvl w:val="0"/>
+                <w:numId w:val="1"/>
+              </w:numPr>
+              <w:spacing w:line="360" w:lineRule="auto"/>
+              <w:rPr>
+                <w:rFonts w:ascii="Times New Roman" w:hAnsi="Times New Roman" w:cs="Times New Roman"/>
+              </w:rPr>
+            </w:pPr>
+            <w:r>
+              <w:rPr>
+                <w:rFonts w:ascii="Times New Roman" w:hAnsi="Times New Roman" w:cs="Times New Roman"/>
+              </w:rPr>
+              <w:t>~</w:t>
+            </w:r>
+            <w:r>
+              <w:rPr>
+                <w:rFonts w:ascii="Times New Roman" w:hAnsi="Times New Roman" w:cs="Times New Roman"/>
+              </w:rPr>
+              <w:t xml:space="preserve">1-1.5 hours </w:t>
+            </w:r>
+            <w:r>
+              <w:rPr>
+                <w:rFonts w:ascii="Times New Roman" w:hAnsi="Times New Roman" w:cs="Times New Roman"/>
+              </w:rPr>
+              <w:t>gathering/clarifying</w:t>
+            </w:r>
+            <w:r>
+              <w:rPr>
+                <w:rFonts w:ascii="Times New Roman" w:hAnsi="Times New Roman" w:cs="Times New Roman"/>
+              </w:rPr>
+              <w:t xml:space="preserve"> requirements </w:t>
+            </w:r>
+            <w:r>
+              <w:rPr>
+                <w:rFonts w:ascii="Times New Roman" w:hAnsi="Times New Roman" w:cs="Times New Roman"/>
+              </w:rPr>
+              <w:t>using</w:t>
+            </w:r>
+            <w:r>
+              <w:rPr>
+                <w:rFonts w:ascii="Times New Roman" w:hAnsi="Times New Roman" w:cs="Times New Roman"/>
+              </w:rPr>
+              <w:t xml:space="preserve"> Project </w:t>
+            </w:r>
+            <w:r>
+              <w:rPr>
+                <w:rFonts w:ascii="Times New Roman" w:hAnsi="Times New Roman" w:cs="Times New Roman"/>
+              </w:rPr>
+              <w:t>details and restaurant details documents (03/09)</w:t>
+            </w:r>
+          </w:p>
+          <w:p>
+            <w:pPr>
+              <w:pStyle w:val="ListParagraph"/>
+              <w:numPr>
+                <w:ilvl w:val="0"/>
+                <w:numId w:val="1"/>
+              </w:numPr>
+              <w:spacing w:line="360" w:lineRule="auto"/>
+              <w:rPr>
+                <w:rFonts w:ascii="Times New Roman" w:hAnsi="Times New Roman" w:cs="Times New Roman"/>
+              </w:rPr>
+            </w:pPr>
+            <w:r>
+              <w:rPr>
+                <w:rFonts w:ascii="Times New Roman" w:hAnsi="Times New Roman" w:cs="Times New Roman"/>
+              </w:rPr>
+              <w:t>2 hours updating use case diagrams, creating business flow diagram (03/10)</w:t>
+            </w:r>
+          </w:p>
+          <w:p>
+            <w:pPr>
+              <w:pStyle w:val="ListParagraph"/>
+              <w:numPr>
+                <w:ilvl w:val="0"/>
+                <w:numId w:val="1"/>
+              </w:numPr>
+              <w:spacing w:line="360" w:lineRule="auto"/>
+              <w:rPr>
+                <w:rFonts w:ascii="Times New Roman" w:hAnsi="Times New Roman" w:cs="Times New Roman"/>
+              </w:rPr>
+            </w:pPr>
+            <w:r>
+              <w:rPr>
+                <w:rFonts w:ascii="Times New Roman" w:hAnsi="Times New Roman" w:cs="Times New Roman"/>
+              </w:rPr>
+              <w:t>~</w:t>
+            </w:r>
+            <w:r>
+              <w:rPr>
+                <w:rFonts w:ascii="Times New Roman" w:hAnsi="Times New Roman" w:cs="Times New Roman"/>
+              </w:rPr>
+              <w:t>1 hour categorizing requirements for R</w:t>
+            </w:r>
+            <w:r>
+              <w:rPr>
+                <w:rFonts w:ascii="Times New Roman" w:hAnsi="Times New Roman" w:cs="Times New Roman"/>
+              </w:rPr>
+              <w:t>equirements Document assignment (03/10)</w:t>
+            </w:r>
+          </w:p>
+          <w:p>
+            <w:pPr>
+              <w:pStyle w:val="ListParagraph"/>
+              <w:numPr>
+                <w:ilvl w:val="0"/>
+                <w:numId w:val="1"/>
+              </w:numPr>
+              <w:spacing w:line="360" w:lineRule="auto"/>
+              <w:rPr>
+                <w:rFonts w:ascii="Times New Roman" w:hAnsi="Times New Roman" w:cs="Times New Roman"/>
+              </w:rPr>
+            </w:pPr>
+            <w:r>
+              <w:rPr>
+                <w:rFonts w:ascii="Times New Roman" w:hAnsi="Times New Roman" w:cs="Times New Roman"/>
+              </w:rPr>
+              <w:t>1.5 hours reviewing and editing requirements categorization, assigning requirement IDs</w:t>
+            </w:r>
+            <w:r>
+              <w:rPr>
+                <w:rFonts w:ascii="Times New Roman" w:hAnsi="Times New Roman" w:cs="Times New Roman"/>
+              </w:rPr>
+              <w:t xml:space="preserve"> (03/10)</w:t>
+            </w:r>
+          </w:p>
+          <w:p>
+            <w:pPr>
+              <w:pStyle w:val="ListParagraph"/>
+              <w:numPr>
+                <w:ilvl w:val="0"/>
+                <w:numId w:val="1"/>
+              </w:numPr>
+              <w:spacing w:line="360" w:lineRule="auto"/>
+              <w:rPr>
+                <w:rFonts w:ascii="Times New Roman" w:hAnsi="Times New Roman" w:cs="Times New Roman"/>
+              </w:rPr>
+            </w:pPr>
+            <w:r>
+              <w:rPr>
+                <w:rFonts w:ascii="Times New Roman" w:hAnsi="Times New Roman" w:cs="Times New Roman"/>
+              </w:rPr>
+              <w:t>2.17 hours adding confirmed requirements to Requirement Document, constructing and updating architecture designs, writing code for creating staff profiles (03/11)</w:t>
+            </w:r>
+          </w:p>
+          <w:p>
+            <w:pPr>
+              <w:pStyle w:val="ListParagraph"/>
+              <w:numPr>
+                <w:ilvl w:val="0"/>
+                <w:numId w:val="1"/>
+              </w:numPr>
+              <w:spacing w:line="360" w:lineRule="auto"/>
+              <w:rPr>
+                <w:rFonts w:ascii="Times New Roman" w:hAnsi="Times New Roman" w:cs="Times New Roman"/>
+              </w:rPr>
+            </w:pPr>
+            <w:r>
+              <w:rPr>
+                <w:rFonts w:ascii="Times New Roman" w:hAnsi="Times New Roman" w:cs="Times New Roman"/>
+              </w:rPr>
+              <w:t>1.33 hours updating architecture standards, architecture designs, GUI designs for manager’s ability create/edit/delete staff profiles (03/11)</w:t>
+            </w:r>
+          </w:p>
+          <w:p>
+            <w:pPr>
+              <w:pStyle w:val="ListParagraph"/>
+              <w:numPr>
+                <w:ilvl w:val="0"/>
+                <w:numId w:val="1"/>
+              </w:numPr>
+              <w:spacing w:line="360" w:lineRule="auto"/>
+              <w:rPr>
+                <w:rFonts w:ascii="Times New Roman" w:hAnsi="Times New Roman" w:cs="Times New Roman"/>
+              </w:rPr>
+            </w:pPr>
+            <w:r>
+              <w:rPr>
+                <w:rFonts w:ascii="Times New Roman" w:hAnsi="Times New Roman" w:cs="Times New Roman"/>
+              </w:rPr>
+              <w:t>2.5 hours designing GUI draft for manager function to create/edit/delete staff profiles (03/12)</w:t>
+            </w:r>
+          </w:p>
+          <w:p>
+            <w:pPr>
+              <w:pStyle w:val="ListParagraph"/>
+              <w:numPr>
+                <w:ilvl w:val="0"/>
+                <w:numId w:val="1"/>
+              </w:numPr>
+              <w:spacing w:line="360" w:lineRule="auto"/>
+              <w:rPr>
+                <w:rFonts w:ascii="Times New Roman" w:hAnsi="Times New Roman" w:cs="Times New Roman"/>
+              </w:rPr>
+            </w:pPr>
+            <w:r>
+              <w:rPr>
+                <w:rFonts w:ascii="Times New Roman" w:hAnsi="Times New Roman" w:cs="Times New Roman"/>
+              </w:rPr>
+              <w:t>2 hours in team meeting (03/12)</w:t>
+            </w:r>
+          </w:p>
+          <w:p>
+            <w:pPr>
+              <w:pStyle w:val="ListParagraph"/>
+              <w:numPr>
+                <w:ilvl w:val="0"/>
+                <w:numId w:val="1"/>
+              </w:numPr>
+              <w:spacing w:line="360" w:lineRule="auto"/>
+              <w:rPr>
+                <w:rFonts w:ascii="Times New Roman" w:hAnsi="Times New Roman" w:cs="Times New Roman"/>
+              </w:rPr>
+            </w:pPr>
+            <w:r>
+              <w:rPr>
+                <w:rFonts w:ascii="Times New Roman" w:hAnsi="Times New Roman" w:cs="Times New Roman"/>
+              </w:rPr>
+              <w:t>2 hours updating architecture designs (03/14)</w:t>
+            </w:r>
+          </w:p>
+          <w:p>
+            <w:pPr>
+              <w:pStyle w:val="ListParagraph"/>
+              <w:numPr>
+                <w:ilvl w:val="0"/>
+                <w:numId w:val="1"/>
+              </w:numPr>
+              <w:spacing w:line="360" w:lineRule="auto"/>
+              <w:rPr>
+                <w:rFonts w:ascii="Times New Roman" w:hAnsi="Times New Roman" w:cs="Times New Roman"/>
+              </w:rPr>
+            </w:pPr>
+            <w:r>
+              <w:rPr>
+                <w:rFonts w:ascii="Times New Roman" w:hAnsi="Times New Roman" w:cs="Times New Roman"/>
+              </w:rPr>
+              <w:t>~40 minutes updating Requirements Document by specifying implementation plans for each requirement (03/14)</w:t>
+            </w:r>
+          </w:p>
+        </w:tc>
+      </w:tr>
+      <w:tr>
+        <w:tc>
+          <w:tcPr>
+            <w:tcW w:w="1975" w:type="dxa"/>
+          </w:tcPr>
+          <w:p>
+            <w:pPr>
+              <w:spacing w:line="360" w:lineRule="auto"/>
+              <w:jc w:val="center"/>
+              <w:rPr>
+                <w:rFonts w:ascii="Times New Roman" w:hAnsi="Times New Roman" w:cs="Times New Roman"/>
+              </w:rPr>
+            </w:pPr>
+            <w:r>
+              <w:rPr>
+                <w:rFonts w:ascii="Times New Roman" w:hAnsi="Times New Roman" w:cs="Times New Roman"/>
+              </w:rPr>
+              <w:t>03/16 – 03/2</w:t>
+            </w:r>
+            <w:r>
+              <w:rPr>
+                <w:rFonts w:ascii="Times New Roman" w:hAnsi="Times New Roman" w:cs="Times New Roman"/>
+              </w:rPr>
+              <w:t>1</w:t>
+            </w:r>
+          </w:p>
+        </w:tc>
+        <w:tc>
+          <w:tcPr>
+            <w:tcW w:w="7375" w:type="dxa"/>
+          </w:tcPr>
+          <w:p>
+            <w:pPr>
+              <w:pStyle w:val="ListParagraph"/>
+              <w:numPr>
+                <w:ilvl w:val="0"/>
+                <w:numId w:val="1"/>
+              </w:numPr>
+              <w:spacing w:line="360" w:lineRule="auto"/>
+              <w:rPr>
+                <w:rFonts w:ascii="Times New Roman" w:hAnsi="Times New Roman" w:cs="Times New Roman"/>
+              </w:rPr>
+            </w:pPr>
+            <w:r>
+              <w:rPr>
+                <w:rFonts w:ascii="Times New Roman" w:hAnsi="Times New Roman" w:cs="Times New Roman"/>
+              </w:rPr>
+              <w:t>1.67 hours completing the functional and nonfunctional sections of the Requirements Doc (03/16)</w:t>
+            </w:r>
+          </w:p>
+          <w:p>
+            <w:pPr>
+              <w:pStyle w:val="ListParagraph"/>
+              <w:numPr>
+                <w:ilvl w:val="0"/>
+                <w:numId w:val="1"/>
+              </w:numPr>
+              <w:spacing w:line="360" w:lineRule="auto"/>
+              <w:rPr>
+                <w:rFonts w:ascii="Times New Roman" w:hAnsi="Times New Roman" w:cs="Times New Roman"/>
+              </w:rPr>
+            </w:pPr>
+            <w:r>
+              <w:rPr>
+                <w:rFonts w:ascii="Times New Roman" w:hAnsi="Times New Roman" w:cs="Times New Roman"/>
+              </w:rPr>
+              <w:t>~2 hours correcting Requirements Document (03/18)</w:t>
+            </w:r>
+          </w:p>
+          <w:p>
+            <w:pPr>
+              <w:pStyle w:val="ListParagraph"/>
+              <w:numPr>
+                <w:ilvl w:val="0"/>
+                <w:numId w:val="1"/>
+              </w:numPr>
+              <w:spacing w:line="360" w:lineRule="auto"/>
+              <w:rPr>
+                <w:rFonts w:ascii="Times New Roman" w:hAnsi="Times New Roman" w:cs="Times New Roman"/>
+              </w:rPr>
+            </w:pPr>
+            <w:r>
+              <w:rPr>
+                <w:rFonts w:ascii="Times New Roman" w:hAnsi="Times New Roman" w:cs="Times New Roman"/>
+              </w:rPr>
+              <w:t>45 mins creating calendar for remainder of project assignments (03/18)</w:t>
+            </w:r>
+          </w:p>
+          <w:p>
+            <w:pPr>
+              <w:pStyle w:val="ListParagraph"/>
+              <w:numPr>
+                <w:ilvl w:val="0"/>
+                <w:numId w:val="1"/>
+              </w:numPr>
+              <w:spacing w:line="360" w:lineRule="auto"/>
+              <w:rPr>
+                <w:rFonts w:ascii="Times New Roman" w:hAnsi="Times New Roman" w:cs="Times New Roman"/>
+              </w:rPr>
+            </w:pPr>
+            <w:r>
+              <w:rPr>
+                <w:rFonts w:ascii="Times New Roman" w:hAnsi="Times New Roman" w:cs="Times New Roman"/>
+              </w:rPr>
+              <w:t>~1 hour team meeting (03/19)</w:t>
+            </w:r>
+          </w:p>
+          <w:p>
+            <w:pPr>
+              <w:pStyle w:val="ListParagraph"/>
+              <w:numPr>
+                <w:ilvl w:val="0"/>
+                <w:numId w:val="1"/>
+              </w:numPr>
+              <w:spacing w:line="360" w:lineRule="auto"/>
+              <w:rPr>
+                <w:rFonts w:ascii="Times New Roman" w:hAnsi="Times New Roman" w:cs="Times New Roman"/>
+              </w:rPr>
+            </w:pPr>
+            <w:r>
+              <w:rPr>
+                <w:rFonts w:ascii="Times New Roman" w:hAnsi="Times New Roman" w:cs="Times New Roman"/>
+              </w:rPr>
+              <w:t>~1.5 hours completing class documentation section of Requirements Document (03/20)</w:t>
+            </w:r>
+          </w:p>
+          <w:p>
+            <w:pPr>
+              <w:pStyle w:val="ListParagraph"/>
+              <w:numPr>
+                <w:ilvl w:val="0"/>
+                <w:numId w:val="1"/>
+              </w:numPr>
+              <w:spacing w:line="360" w:lineRule="auto"/>
+              <w:rPr>
+                <w:rFonts w:ascii="Times New Roman" w:hAnsi="Times New Roman" w:cs="Times New Roman"/>
+              </w:rPr>
+            </w:pPr>
+            <w:r>
+              <w:rPr>
+                <w:rFonts w:ascii="Times New Roman" w:hAnsi="Times New Roman" w:cs="Times New Roman"/>
+              </w:rPr>
+              <w:t>1.5 hours working on class diagrams (03/20)</w:t>
+            </w:r>
+          </w:p>
+          <w:p>
+            <w:pPr>
+              <w:pStyle w:val="ListParagraph"/>
+              <w:numPr>
+                <w:ilvl w:val="0"/>
+                <w:numId w:val="1"/>
+              </w:numPr>
+              <w:spacing w:line="360" w:lineRule="auto"/>
+              <w:rPr>
+                <w:rFonts w:ascii="Times New Roman" w:hAnsi="Times New Roman" w:cs="Times New Roman"/>
+              </w:rPr>
+            </w:pPr>
+            <w:r>
+              <w:rPr>
+                <w:rFonts w:ascii="Times New Roman" w:hAnsi="Times New Roman" w:cs="Times New Roman"/>
+              </w:rPr>
+              <w:t>~1.5 hours completing class diagrams (03/20)</w:t>
+            </w:r>
+          </w:p>
+          <w:p>
+            <w:pPr>
+              <w:pStyle w:val="ListParagraph"/>
+              <w:numPr>
+                <w:ilvl w:val="0"/>
+                <w:numId w:val="1"/>
+              </w:numPr>
+              <w:spacing w:line="360" w:lineRule="auto"/>
               <w:rPr>
                 <w:rFonts w:ascii="Times New Roman" w:hAnsi="Times New Roman" w:cs="Times New Roman"/>
               </w:rPr>
@@ -1991,457 +2834,20 @@
                 <w:rFonts w:ascii="Times New Roman" w:hAnsi="Times New Roman" w:cs="Times New Roman"/>
               </w:rPr>
               <w:lastRenderedPageBreak/>
-              <w:t>02/08 – 02/14</w:t>
-            </w:r>
-          </w:p>
-        </w:tc>
-        <w:tc>
-          <w:tcPr>
-            <w:tcW w:w="7375" w:type="dxa"/>
-          </w:tcPr>
-          <w:p>
-            <w:pPr>
-              <w:pStyle w:val="Prrafodelista"/>
-              <w:numPr>
-                <w:ilvl w:val="0"/>
-                <w:numId w:val="1"/>
-              </w:numPr>
-              <w:spacing w:line="360" w:lineRule="auto"/>
-              <w:rPr>
-                <w:rFonts w:ascii="Times New Roman" w:hAnsi="Times New Roman" w:cs="Times New Roman"/>
-              </w:rPr>
-            </w:pPr>
-            <w:r>
-              <w:rPr>
-                <w:rFonts w:ascii="Times New Roman" w:hAnsi="Times New Roman" w:cs="Times New Roman"/>
-              </w:rPr>
-              <w:t>2.2 hours working on the testing section of the Project Plan, updating my resume, and updating meeting notes (02/10)</w:t>
-            </w:r>
-          </w:p>
-          <w:p>
-            <w:pPr>
-              <w:pStyle w:val="Prrafodelista"/>
-              <w:numPr>
-                <w:ilvl w:val="0"/>
-                <w:numId w:val="1"/>
-              </w:numPr>
-              <w:spacing w:line="360" w:lineRule="auto"/>
-              <w:rPr>
-                <w:rFonts w:ascii="Times New Roman" w:hAnsi="Times New Roman" w:cs="Times New Roman"/>
-              </w:rPr>
-            </w:pPr>
-            <w:r>
-              <w:rPr>
-                <w:rFonts w:ascii="Times New Roman" w:hAnsi="Times New Roman" w:cs="Times New Roman"/>
-              </w:rPr>
-              <w:t>1.8 hours completing the testing section, continuing work on WBS (02/12)</w:t>
-            </w:r>
-          </w:p>
-        </w:tc>
-      </w:tr>
-      <w:tr>
-        <w:tc>
-          <w:tcPr>
-            <w:tcW w:w="1975" w:type="dxa"/>
-          </w:tcPr>
-          <w:p>
-            <w:pPr>
-              <w:spacing w:line="360" w:lineRule="auto"/>
-              <w:jc w:val="center"/>
-              <w:rPr>
-                <w:rFonts w:ascii="Times New Roman" w:hAnsi="Times New Roman" w:cs="Times New Roman"/>
-              </w:rPr>
-            </w:pPr>
-            <w:r>
-              <w:rPr>
-                <w:rFonts w:ascii="Times New Roman" w:hAnsi="Times New Roman" w:cs="Times New Roman"/>
-              </w:rPr>
-              <w:t>02/16 – 02/21</w:t>
-            </w:r>
-          </w:p>
-        </w:tc>
-        <w:tc>
-          <w:tcPr>
-            <w:tcW w:w="7375" w:type="dxa"/>
-          </w:tcPr>
-          <w:p>
-            <w:pPr>
-              <w:pStyle w:val="Prrafodelista"/>
-              <w:numPr>
-                <w:ilvl w:val="0"/>
-                <w:numId w:val="1"/>
-              </w:numPr>
-              <w:spacing w:line="360" w:lineRule="auto"/>
-              <w:rPr>
-                <w:rFonts w:ascii="Times New Roman" w:hAnsi="Times New Roman" w:cs="Times New Roman"/>
-              </w:rPr>
-            </w:pPr>
-            <w:r>
-              <w:rPr>
-                <w:rFonts w:ascii="Times New Roman" w:hAnsi="Times New Roman" w:cs="Times New Roman"/>
-              </w:rPr>
-              <w:t>57 mins organizing GitHub repo and message team about upcoming schedule and others (02/16)</w:t>
-            </w:r>
-          </w:p>
-          <w:p>
-            <w:pPr>
-              <w:pStyle w:val="Prrafodelista"/>
-              <w:numPr>
-                <w:ilvl w:val="0"/>
-                <w:numId w:val="1"/>
-              </w:numPr>
-              <w:spacing w:line="360" w:lineRule="auto"/>
-              <w:rPr>
-                <w:rFonts w:ascii="Times New Roman" w:hAnsi="Times New Roman" w:cs="Times New Roman"/>
-              </w:rPr>
-            </w:pPr>
-            <w:r>
-              <w:rPr>
-                <w:rFonts w:ascii="Times New Roman" w:hAnsi="Times New Roman" w:cs="Times New Roman"/>
-              </w:rPr>
-              <w:t>5.2 hours designing architecture of login/sign up module, drafting GUI, assigning staff usernames (02/16)</w:t>
-            </w:r>
-          </w:p>
-          <w:p>
-            <w:pPr>
-              <w:pStyle w:val="Prrafodelista"/>
-              <w:numPr>
-                <w:ilvl w:val="0"/>
-                <w:numId w:val="1"/>
-              </w:numPr>
-              <w:spacing w:line="360" w:lineRule="auto"/>
-              <w:rPr>
-                <w:rFonts w:ascii="Times New Roman" w:hAnsi="Times New Roman" w:cs="Times New Roman"/>
-              </w:rPr>
-            </w:pPr>
-            <w:r>
-              <w:rPr>
-                <w:rFonts w:ascii="Times New Roman" w:hAnsi="Times New Roman" w:cs="Times New Roman"/>
-              </w:rPr>
-              <w:t>40 mins designing initial schema for database (02/17)</w:t>
-            </w:r>
-          </w:p>
-          <w:p>
-            <w:pPr>
-              <w:pStyle w:val="Prrafodelista"/>
-              <w:numPr>
-                <w:ilvl w:val="0"/>
-                <w:numId w:val="1"/>
-              </w:numPr>
-              <w:spacing w:line="360" w:lineRule="auto"/>
-              <w:rPr>
-                <w:rFonts w:ascii="Times New Roman" w:hAnsi="Times New Roman" w:cs="Times New Roman"/>
-              </w:rPr>
-            </w:pPr>
-            <w:r>
-              <w:rPr>
-                <w:rFonts w:ascii="Times New Roman" w:hAnsi="Times New Roman" w:cs="Times New Roman"/>
-              </w:rPr>
-              <w:t>30 mins creating database ERD (02/17)</w:t>
-            </w:r>
-          </w:p>
-          <w:p>
-            <w:pPr>
-              <w:pStyle w:val="Prrafodelista"/>
-              <w:numPr>
-                <w:ilvl w:val="0"/>
-                <w:numId w:val="1"/>
-              </w:numPr>
-              <w:spacing w:line="360" w:lineRule="auto"/>
-              <w:rPr>
-                <w:rFonts w:ascii="Times New Roman" w:hAnsi="Times New Roman" w:cs="Times New Roman"/>
-              </w:rPr>
-            </w:pPr>
-            <w:r>
-              <w:rPr>
-                <w:rFonts w:ascii="Times New Roman" w:hAnsi="Times New Roman" w:cs="Times New Roman"/>
-              </w:rPr>
-              <w:t>1.2 hour in-class, team meeting (02/17)</w:t>
-            </w:r>
-          </w:p>
-          <w:p>
-            <w:pPr>
-              <w:pStyle w:val="Prrafodelista"/>
-              <w:numPr>
-                <w:ilvl w:val="0"/>
-                <w:numId w:val="1"/>
-              </w:numPr>
-              <w:spacing w:line="360" w:lineRule="auto"/>
-              <w:rPr>
-                <w:rFonts w:ascii="Times New Roman" w:hAnsi="Times New Roman" w:cs="Times New Roman"/>
-              </w:rPr>
-            </w:pPr>
-            <w:r>
-              <w:rPr>
-                <w:rFonts w:ascii="Times New Roman" w:hAnsi="Times New Roman" w:cs="Times New Roman"/>
-              </w:rPr>
-              <w:t>1.17 hours making use case diagrams</w:t>
-            </w:r>
-          </w:p>
-        </w:tc>
-      </w:tr>
-      <w:tr>
-        <w:tc>
-          <w:tcPr>
-            <w:tcW w:w="1975" w:type="dxa"/>
-          </w:tcPr>
-          <w:p>
-            <w:pPr>
-              <w:spacing w:line="360" w:lineRule="auto"/>
-              <w:jc w:val="center"/>
-              <w:rPr>
-                <w:rFonts w:ascii="Times New Roman" w:hAnsi="Times New Roman" w:cs="Times New Roman"/>
-              </w:rPr>
-            </w:pPr>
-            <w:r>
-              <w:rPr>
-                <w:rFonts w:ascii="Times New Roman" w:hAnsi="Times New Roman" w:cs="Times New Roman"/>
-              </w:rPr>
-              <w:t>02/23 – 02/28</w:t>
-            </w:r>
-          </w:p>
-        </w:tc>
-        <w:tc>
-          <w:tcPr>
-            <w:tcW w:w="7375" w:type="dxa"/>
-          </w:tcPr>
-          <w:p>
-            <w:pPr>
-              <w:pStyle w:val="Prrafodelista"/>
-              <w:numPr>
-                <w:ilvl w:val="0"/>
-                <w:numId w:val="1"/>
-              </w:numPr>
-              <w:spacing w:line="360" w:lineRule="auto"/>
-              <w:rPr>
-                <w:rFonts w:ascii="Times New Roman" w:hAnsi="Times New Roman" w:cs="Times New Roman"/>
-              </w:rPr>
-            </w:pPr>
-            <w:r>
-              <w:rPr>
-                <w:rFonts w:ascii="Times New Roman" w:hAnsi="Times New Roman" w:cs="Times New Roman"/>
-              </w:rPr>
-              <w:t>1 hour completing status report for week 02/16 to 02/20 (02/26)</w:t>
-            </w:r>
-          </w:p>
-          <w:p>
-            <w:pPr>
-              <w:pStyle w:val="Prrafodelista"/>
-              <w:numPr>
-                <w:ilvl w:val="0"/>
-                <w:numId w:val="1"/>
-              </w:numPr>
-              <w:spacing w:line="360" w:lineRule="auto"/>
-              <w:rPr>
-                <w:rFonts w:ascii="Times New Roman" w:hAnsi="Times New Roman" w:cs="Times New Roman"/>
-              </w:rPr>
-            </w:pPr>
-            <w:r>
-              <w:rPr>
-                <w:rFonts w:ascii="Times New Roman" w:hAnsi="Times New Roman" w:cs="Times New Roman"/>
-              </w:rPr>
-              <w:t>1 hour team meeting (02/26)</w:t>
-            </w:r>
-          </w:p>
-          <w:p>
-            <w:pPr>
-              <w:pStyle w:val="Prrafodelista"/>
-              <w:numPr>
-                <w:ilvl w:val="0"/>
-                <w:numId w:val="1"/>
-              </w:numPr>
-              <w:spacing w:line="360" w:lineRule="auto"/>
-              <w:rPr>
-                <w:rFonts w:ascii="Times New Roman" w:hAnsi="Times New Roman" w:cs="Times New Roman"/>
-              </w:rPr>
-            </w:pPr>
-            <w:r>
-              <w:rPr>
-                <w:rFonts w:ascii="Times New Roman" w:hAnsi="Times New Roman" w:cs="Times New Roman"/>
-              </w:rPr>
-              <w:t>3 hours updating architecture design doc for clock-in/out, drafting GUI for clock-in/out module (02/27, 02/28)</w:t>
-            </w:r>
-          </w:p>
-          <w:p>
-            <w:pPr>
-              <w:pStyle w:val="Prrafodelista"/>
-              <w:numPr>
-                <w:ilvl w:val="0"/>
-                <w:numId w:val="1"/>
-              </w:numPr>
-              <w:spacing w:line="360" w:lineRule="auto"/>
-              <w:rPr>
-                <w:rFonts w:ascii="Times New Roman" w:hAnsi="Times New Roman" w:cs="Times New Roman"/>
-              </w:rPr>
-            </w:pPr>
-            <w:r>
-              <w:rPr>
-                <w:rFonts w:ascii="Times New Roman" w:hAnsi="Times New Roman" w:cs="Times New Roman"/>
-              </w:rPr>
-              <w:t>1.67</w:t>
-            </w:r>
-            <w:r>
-              <w:rPr>
-                <w:rFonts w:ascii="Times New Roman" w:hAnsi="Times New Roman" w:cs="Times New Roman"/>
-              </w:rPr>
-              <w:t xml:space="preserve"> hours updating Login GUI drafts, updating Login architecture, updating architecture standards (02/28)</w:t>
-            </w:r>
-          </w:p>
-        </w:tc>
-      </w:tr>
-      <w:tr>
-        <w:tc>
-          <w:tcPr>
-            <w:tcW w:w="1975" w:type="dxa"/>
-          </w:tcPr>
-          <w:p>
-            <w:pPr>
-              <w:spacing w:line="360" w:lineRule="auto"/>
-              <w:jc w:val="center"/>
-              <w:rPr>
-                <w:rFonts w:ascii="Times New Roman" w:hAnsi="Times New Roman" w:cs="Times New Roman"/>
-              </w:rPr>
-            </w:pPr>
-            <w:r>
-              <w:rPr>
-                <w:rFonts w:ascii="Times New Roman" w:hAnsi="Times New Roman" w:cs="Times New Roman"/>
-              </w:rPr>
-              <w:t>03/02 – 03/07</w:t>
-            </w:r>
-          </w:p>
-        </w:tc>
-        <w:tc>
-          <w:tcPr>
-            <w:tcW w:w="7375" w:type="dxa"/>
-          </w:tcPr>
-          <w:p>
-            <w:pPr>
-              <w:pStyle w:val="Prrafodelista"/>
-              <w:numPr>
-                <w:ilvl w:val="0"/>
-                <w:numId w:val="1"/>
-              </w:numPr>
-              <w:spacing w:line="360" w:lineRule="auto"/>
-              <w:rPr>
-                <w:rFonts w:ascii="Times New Roman" w:hAnsi="Times New Roman" w:cs="Times New Roman"/>
-              </w:rPr>
-            </w:pPr>
-            <w:r>
-              <w:rPr>
-                <w:rFonts w:ascii="Times New Roman" w:hAnsi="Times New Roman" w:cs="Times New Roman"/>
-              </w:rPr>
-              <w:t>1.7 hours updating schema (03/02)</w:t>
-            </w:r>
-          </w:p>
-          <w:p>
-            <w:pPr>
-              <w:pStyle w:val="Prrafodelista"/>
-              <w:numPr>
-                <w:ilvl w:val="0"/>
-                <w:numId w:val="1"/>
-              </w:numPr>
-              <w:spacing w:line="360" w:lineRule="auto"/>
-              <w:rPr>
-                <w:rFonts w:ascii="Times New Roman" w:hAnsi="Times New Roman" w:cs="Times New Roman"/>
-              </w:rPr>
-            </w:pPr>
-            <w:r>
-              <w:rPr>
-                <w:rFonts w:ascii="Times New Roman" w:hAnsi="Times New Roman" w:cs="Times New Roman"/>
-              </w:rPr>
-              <w:t>30 minutes updating status report (03/02)</w:t>
-            </w:r>
-          </w:p>
-        </w:tc>
-      </w:tr>
-      <w:tr>
-        <w:tc>
-          <w:tcPr>
-            <w:tcW w:w="1975" w:type="dxa"/>
-          </w:tcPr>
-          <w:p>
-            <w:pPr>
-              <w:spacing w:line="360" w:lineRule="auto"/>
-              <w:jc w:val="center"/>
-              <w:rPr>
-                <w:rFonts w:ascii="Times New Roman" w:hAnsi="Times New Roman" w:cs="Times New Roman"/>
-              </w:rPr>
-            </w:pPr>
-            <w:r>
-              <w:rPr>
-                <w:rFonts w:ascii="Times New Roman" w:hAnsi="Times New Roman" w:cs="Times New Roman"/>
-              </w:rPr>
-              <w:t>03/09 – 03/14</w:t>
-            </w:r>
-          </w:p>
-        </w:tc>
-        <w:tc>
-          <w:tcPr>
-            <w:tcW w:w="7375" w:type="dxa"/>
-          </w:tcPr>
-          <w:p>
-            <w:pPr>
-              <w:pStyle w:val="Prrafodelista"/>
-              <w:numPr>
-                <w:ilvl w:val="0"/>
-                <w:numId w:val="1"/>
-              </w:numPr>
-              <w:spacing w:line="360" w:lineRule="auto"/>
-              <w:rPr>
-                <w:rFonts w:ascii="Times New Roman" w:hAnsi="Times New Roman" w:cs="Times New Roman"/>
-              </w:rPr>
-            </w:pPr>
-            <w:r>
-              <w:rPr>
-                <w:rFonts w:ascii="Times New Roman" w:hAnsi="Times New Roman" w:cs="Times New Roman"/>
-              </w:rPr>
-              <w:t>~</w:t>
-            </w:r>
-            <w:r>
-              <w:rPr>
-                <w:rFonts w:ascii="Times New Roman" w:hAnsi="Times New Roman" w:cs="Times New Roman"/>
-              </w:rPr>
-              <w:t xml:space="preserve">1-1.5 hours </w:t>
-            </w:r>
-            <w:r>
-              <w:rPr>
-                <w:rFonts w:ascii="Times New Roman" w:hAnsi="Times New Roman" w:cs="Times New Roman"/>
-              </w:rPr>
-              <w:t>gathering/clarifying</w:t>
-            </w:r>
-            <w:r>
-              <w:rPr>
-                <w:rFonts w:ascii="Times New Roman" w:hAnsi="Times New Roman" w:cs="Times New Roman"/>
-              </w:rPr>
-              <w:t xml:space="preserve"> requirements </w:t>
-            </w:r>
-            <w:r>
-              <w:rPr>
-                <w:rFonts w:ascii="Times New Roman" w:hAnsi="Times New Roman" w:cs="Times New Roman"/>
-              </w:rPr>
-              <w:t>using</w:t>
-            </w:r>
-            <w:r>
-              <w:rPr>
-                <w:rFonts w:ascii="Times New Roman" w:hAnsi="Times New Roman" w:cs="Times New Roman"/>
-              </w:rPr>
-              <w:t xml:space="preserve"> Project </w:t>
-            </w:r>
-            <w:r>
-              <w:rPr>
-                <w:rFonts w:ascii="Times New Roman" w:hAnsi="Times New Roman" w:cs="Times New Roman"/>
-              </w:rPr>
-              <w:t>details and restaurant details documents (03/09)</w:t>
-            </w:r>
-          </w:p>
-          <w:p>
-            <w:pPr>
-              <w:pStyle w:val="Prrafodelista"/>
-              <w:numPr>
-                <w:ilvl w:val="0"/>
-                <w:numId w:val="1"/>
-              </w:numPr>
-              <w:spacing w:line="360" w:lineRule="auto"/>
+              <w:t>~4 completing flow of events diagram and decision tables (03/21)</w:t>
+            </w:r>
+          </w:p>
+        </w:tc>
+      </w:tr>
+      <w:tr>
+        <w:tc>
+          <w:tcPr>
+            <w:tcW w:w="1975" w:type="dxa"/>
+          </w:tcPr>
+          <w:p>
+            <w:pPr>
+              <w:spacing w:line="360" w:lineRule="auto"/>
+              <w:jc w:val="center"/>
               <w:rPr>
                 <w:rFonts w:ascii="Times New Roman" w:hAnsi="Times New Roman" w:cs="Times New Roman"/>
               </w:rPr>
@@ -2451,384 +2857,6 @@
                 <w:rFonts w:ascii="Times New Roman" w:hAnsi="Times New Roman" w:cs="Times New Roman"/>
               </w:rPr>
               <w:lastRenderedPageBreak/>
-              <w:t>2 hours updating use case diagrams, creating business flow diagram (03/10)</w:t>
-            </w:r>
-          </w:p>
-          <w:p>
-            <w:pPr>
-              <w:pStyle w:val="Prrafodelista"/>
-              <w:numPr>
-                <w:ilvl w:val="0"/>
-                <w:numId w:val="1"/>
-              </w:numPr>
-              <w:spacing w:line="360" w:lineRule="auto"/>
-              <w:rPr>
-                <w:rFonts w:ascii="Times New Roman" w:hAnsi="Times New Roman" w:cs="Times New Roman"/>
-              </w:rPr>
-            </w:pPr>
-            <w:r>
-              <w:rPr>
-                <w:rFonts w:ascii="Times New Roman" w:hAnsi="Times New Roman" w:cs="Times New Roman"/>
-              </w:rPr>
-              <w:t>~</w:t>
-            </w:r>
-            <w:r>
-              <w:rPr>
-                <w:rFonts w:ascii="Times New Roman" w:hAnsi="Times New Roman" w:cs="Times New Roman"/>
-              </w:rPr>
-              <w:t>1 hour categorizing requirements for R</w:t>
-            </w:r>
-            <w:r>
-              <w:rPr>
-                <w:rFonts w:ascii="Times New Roman" w:hAnsi="Times New Roman" w:cs="Times New Roman"/>
-              </w:rPr>
-              <w:t>equirements Document assignment (03/10)</w:t>
-            </w:r>
-          </w:p>
-          <w:p>
-            <w:pPr>
-              <w:pStyle w:val="Prrafodelista"/>
-              <w:numPr>
-                <w:ilvl w:val="0"/>
-                <w:numId w:val="1"/>
-              </w:numPr>
-              <w:spacing w:line="360" w:lineRule="auto"/>
-              <w:rPr>
-                <w:rFonts w:ascii="Times New Roman" w:hAnsi="Times New Roman" w:cs="Times New Roman"/>
-              </w:rPr>
-            </w:pPr>
-            <w:r>
-              <w:rPr>
-                <w:rFonts w:ascii="Times New Roman" w:hAnsi="Times New Roman" w:cs="Times New Roman"/>
-              </w:rPr>
-              <w:t>1.5 hours reviewing and editing requirements categorization, assigning requirement IDs</w:t>
-            </w:r>
-            <w:r>
-              <w:rPr>
-                <w:rFonts w:ascii="Times New Roman" w:hAnsi="Times New Roman" w:cs="Times New Roman"/>
-              </w:rPr>
-              <w:t xml:space="preserve"> (03/10)</w:t>
-            </w:r>
-          </w:p>
-          <w:p>
-            <w:pPr>
-              <w:pStyle w:val="Prrafodelista"/>
-              <w:numPr>
-                <w:ilvl w:val="0"/>
-                <w:numId w:val="1"/>
-              </w:numPr>
-              <w:spacing w:line="360" w:lineRule="auto"/>
-              <w:rPr>
-                <w:rFonts w:ascii="Times New Roman" w:hAnsi="Times New Roman" w:cs="Times New Roman"/>
-              </w:rPr>
-            </w:pPr>
-            <w:r>
-              <w:rPr>
-                <w:rFonts w:ascii="Times New Roman" w:hAnsi="Times New Roman" w:cs="Times New Roman"/>
-              </w:rPr>
-              <w:t>2.17 hours adding confirmed requirements to Requirement Document, constructing and updating architecture designs, writing code for creating staff profiles (03/11)</w:t>
-            </w:r>
-          </w:p>
-          <w:p>
-            <w:pPr>
-              <w:pStyle w:val="Prrafodelista"/>
-              <w:numPr>
-                <w:ilvl w:val="0"/>
-                <w:numId w:val="1"/>
-              </w:numPr>
-              <w:spacing w:line="360" w:lineRule="auto"/>
-              <w:rPr>
-                <w:rFonts w:ascii="Times New Roman" w:hAnsi="Times New Roman" w:cs="Times New Roman"/>
-              </w:rPr>
-            </w:pPr>
-            <w:r>
-              <w:rPr>
-                <w:rFonts w:ascii="Times New Roman" w:hAnsi="Times New Roman" w:cs="Times New Roman"/>
-              </w:rPr>
-              <w:t>1.33 hours updating architecture standards, architecture designs, GUI designs for manager’s ability create/edit/delete staff profiles (03/11)</w:t>
-            </w:r>
-          </w:p>
-          <w:p>
-            <w:pPr>
-              <w:pStyle w:val="Prrafodelista"/>
-              <w:numPr>
-                <w:ilvl w:val="0"/>
-                <w:numId w:val="1"/>
-              </w:numPr>
-              <w:spacing w:line="360" w:lineRule="auto"/>
-              <w:rPr>
-                <w:rFonts w:ascii="Times New Roman" w:hAnsi="Times New Roman" w:cs="Times New Roman"/>
-              </w:rPr>
-            </w:pPr>
-            <w:r>
-              <w:rPr>
-                <w:rFonts w:ascii="Times New Roman" w:hAnsi="Times New Roman" w:cs="Times New Roman"/>
-              </w:rPr>
-              <w:t>2.5 hours designing GUI draft for manager function to create/edit/delete staff profiles (03/12)</w:t>
-            </w:r>
-          </w:p>
-          <w:p>
-            <w:pPr>
-              <w:pStyle w:val="Prrafodelista"/>
-              <w:numPr>
-                <w:ilvl w:val="0"/>
-                <w:numId w:val="1"/>
-              </w:numPr>
-              <w:spacing w:line="360" w:lineRule="auto"/>
-              <w:rPr>
-                <w:rFonts w:ascii="Times New Roman" w:hAnsi="Times New Roman" w:cs="Times New Roman"/>
-              </w:rPr>
-            </w:pPr>
-            <w:r>
-              <w:rPr>
-                <w:rFonts w:ascii="Times New Roman" w:hAnsi="Times New Roman" w:cs="Times New Roman"/>
-              </w:rPr>
-              <w:t>2 hours in team meeting (03/12)</w:t>
-            </w:r>
-          </w:p>
-          <w:p>
-            <w:pPr>
-              <w:pStyle w:val="Prrafodelista"/>
-              <w:numPr>
-                <w:ilvl w:val="0"/>
-                <w:numId w:val="1"/>
-              </w:numPr>
-              <w:spacing w:line="360" w:lineRule="auto"/>
-              <w:rPr>
-                <w:rFonts w:ascii="Times New Roman" w:hAnsi="Times New Roman" w:cs="Times New Roman"/>
-              </w:rPr>
-            </w:pPr>
-            <w:r>
-              <w:rPr>
-                <w:rFonts w:ascii="Times New Roman" w:hAnsi="Times New Roman" w:cs="Times New Roman"/>
-              </w:rPr>
-              <w:t>2 hours updating architecture designs (03/14)</w:t>
-            </w:r>
-          </w:p>
-          <w:p>
-            <w:pPr>
-              <w:pStyle w:val="Prrafodelista"/>
-              <w:numPr>
-                <w:ilvl w:val="0"/>
-                <w:numId w:val="1"/>
-              </w:numPr>
-              <w:spacing w:line="360" w:lineRule="auto"/>
-              <w:rPr>
-                <w:rFonts w:ascii="Times New Roman" w:hAnsi="Times New Roman" w:cs="Times New Roman"/>
-              </w:rPr>
-            </w:pPr>
-            <w:r>
-              <w:rPr>
-                <w:rFonts w:ascii="Times New Roman" w:hAnsi="Times New Roman" w:cs="Times New Roman"/>
-              </w:rPr>
-              <w:t>~40 minutes updating Requirements Document by specifying implementation plans for each requirement (03/14)</w:t>
-            </w:r>
-          </w:p>
-        </w:tc>
-      </w:tr>
-      <w:tr>
-        <w:tc>
-          <w:tcPr>
-            <w:tcW w:w="1975" w:type="dxa"/>
-          </w:tcPr>
-          <w:p>
-            <w:pPr>
-              <w:spacing w:line="360" w:lineRule="auto"/>
-              <w:jc w:val="center"/>
-              <w:rPr>
-                <w:rFonts w:ascii="Times New Roman" w:hAnsi="Times New Roman" w:cs="Times New Roman"/>
-              </w:rPr>
-            </w:pPr>
-            <w:r>
-              <w:rPr>
-                <w:rFonts w:ascii="Times New Roman" w:hAnsi="Times New Roman" w:cs="Times New Roman"/>
-              </w:rPr>
-              <w:lastRenderedPageBreak/>
-              <w:t>03/16 – 03/2</w:t>
-            </w:r>
-            <w:r>
-              <w:rPr>
-                <w:rFonts w:ascii="Times New Roman" w:hAnsi="Times New Roman" w:cs="Times New Roman"/>
-              </w:rPr>
-              <w:t>1</w:t>
-            </w:r>
-          </w:p>
-        </w:tc>
-        <w:tc>
-          <w:tcPr>
-            <w:tcW w:w="7375" w:type="dxa"/>
-          </w:tcPr>
-          <w:p>
-            <w:pPr>
-              <w:pStyle w:val="Prrafodelista"/>
-              <w:numPr>
-                <w:ilvl w:val="0"/>
-                <w:numId w:val="1"/>
-              </w:numPr>
-              <w:spacing w:line="360" w:lineRule="auto"/>
-              <w:rPr>
-                <w:rFonts w:ascii="Times New Roman" w:hAnsi="Times New Roman" w:cs="Times New Roman"/>
-              </w:rPr>
-            </w:pPr>
-            <w:r>
-              <w:rPr>
-                <w:rFonts w:ascii="Times New Roman" w:hAnsi="Times New Roman" w:cs="Times New Roman"/>
-              </w:rPr>
-              <w:t>1.67 hours completing the functional and nonfunctional sections of the Requirements Doc (03/16)</w:t>
-            </w:r>
-          </w:p>
-          <w:p>
-            <w:pPr>
-              <w:pStyle w:val="Prrafodelista"/>
-              <w:numPr>
-                <w:ilvl w:val="0"/>
-                <w:numId w:val="1"/>
-              </w:numPr>
-              <w:spacing w:line="360" w:lineRule="auto"/>
-              <w:rPr>
-                <w:rFonts w:ascii="Times New Roman" w:hAnsi="Times New Roman" w:cs="Times New Roman"/>
-              </w:rPr>
-            </w:pPr>
-            <w:r>
-              <w:rPr>
-                <w:rFonts w:ascii="Times New Roman" w:hAnsi="Times New Roman" w:cs="Times New Roman"/>
-              </w:rPr>
-              <w:t>~2 hours correcting Requirements Document (03/18)</w:t>
-            </w:r>
-          </w:p>
-          <w:p>
-            <w:pPr>
-              <w:pStyle w:val="Prrafodelista"/>
-              <w:numPr>
-                <w:ilvl w:val="0"/>
-                <w:numId w:val="1"/>
-              </w:numPr>
-              <w:spacing w:line="360" w:lineRule="auto"/>
-              <w:rPr>
-                <w:rFonts w:ascii="Times New Roman" w:hAnsi="Times New Roman" w:cs="Times New Roman"/>
-              </w:rPr>
-            </w:pPr>
-            <w:r>
-              <w:rPr>
-                <w:rFonts w:ascii="Times New Roman" w:hAnsi="Times New Roman" w:cs="Times New Roman"/>
-              </w:rPr>
-              <w:t>45 mins creating calendar for remainder of project assignments (03/18)</w:t>
-            </w:r>
-          </w:p>
-          <w:p>
-            <w:pPr>
-              <w:pStyle w:val="Prrafodelista"/>
-              <w:numPr>
-                <w:ilvl w:val="0"/>
-                <w:numId w:val="1"/>
-              </w:numPr>
-              <w:spacing w:line="360" w:lineRule="auto"/>
-              <w:rPr>
-                <w:rFonts w:ascii="Times New Roman" w:hAnsi="Times New Roman" w:cs="Times New Roman"/>
-              </w:rPr>
-            </w:pPr>
-            <w:r>
-              <w:rPr>
-                <w:rFonts w:ascii="Times New Roman" w:hAnsi="Times New Roman" w:cs="Times New Roman"/>
-              </w:rPr>
-              <w:t>~1 hour team meeting (03/19)</w:t>
-            </w:r>
-          </w:p>
-          <w:p>
-            <w:pPr>
-              <w:pStyle w:val="Prrafodelista"/>
-              <w:numPr>
-                <w:ilvl w:val="0"/>
-                <w:numId w:val="1"/>
-              </w:numPr>
-              <w:spacing w:line="360" w:lineRule="auto"/>
-              <w:rPr>
-                <w:rFonts w:ascii="Times New Roman" w:hAnsi="Times New Roman" w:cs="Times New Roman"/>
-              </w:rPr>
-            </w:pPr>
-            <w:r>
-              <w:rPr>
-                <w:rFonts w:ascii="Times New Roman" w:hAnsi="Times New Roman" w:cs="Times New Roman"/>
-              </w:rPr>
-              <w:t>~1.5 hours completing class documentation section of Requirements Document (03/20)</w:t>
-            </w:r>
-          </w:p>
-          <w:p>
-            <w:pPr>
-              <w:pStyle w:val="Prrafodelista"/>
-              <w:numPr>
-                <w:ilvl w:val="0"/>
-                <w:numId w:val="1"/>
-              </w:numPr>
-              <w:spacing w:line="360" w:lineRule="auto"/>
-              <w:rPr>
-                <w:rFonts w:ascii="Times New Roman" w:hAnsi="Times New Roman" w:cs="Times New Roman"/>
-              </w:rPr>
-            </w:pPr>
-            <w:r>
-              <w:rPr>
-                <w:rFonts w:ascii="Times New Roman" w:hAnsi="Times New Roman" w:cs="Times New Roman"/>
-              </w:rPr>
-              <w:t>1.5 hours working on class diagrams (03/20)</w:t>
-            </w:r>
-          </w:p>
-          <w:p>
-            <w:pPr>
-              <w:pStyle w:val="Prrafodelista"/>
-              <w:numPr>
-                <w:ilvl w:val="0"/>
-                <w:numId w:val="1"/>
-              </w:numPr>
-              <w:spacing w:line="360" w:lineRule="auto"/>
-              <w:rPr>
-                <w:rFonts w:ascii="Times New Roman" w:hAnsi="Times New Roman" w:cs="Times New Roman"/>
-              </w:rPr>
-            </w:pPr>
-            <w:r>
-              <w:rPr>
-                <w:rFonts w:ascii="Times New Roman" w:hAnsi="Times New Roman" w:cs="Times New Roman"/>
-              </w:rPr>
-              <w:t>~1.5 hours completing class diagrams (03/20)</w:t>
-            </w:r>
-          </w:p>
-          <w:p>
-            <w:pPr>
-              <w:pStyle w:val="Prrafodelista"/>
-              <w:numPr>
-                <w:ilvl w:val="0"/>
-                <w:numId w:val="1"/>
-              </w:numPr>
-              <w:spacing w:line="360" w:lineRule="auto"/>
-              <w:rPr>
-                <w:rFonts w:ascii="Times New Roman" w:hAnsi="Times New Roman" w:cs="Times New Roman"/>
-              </w:rPr>
-            </w:pPr>
-            <w:r>
-              <w:rPr>
-                <w:rFonts w:ascii="Times New Roman" w:hAnsi="Times New Roman" w:cs="Times New Roman"/>
-              </w:rPr>
-              <w:t>~4 completing flow of events diagram and decision tables (03/21)</w:t>
-            </w:r>
-          </w:p>
-        </w:tc>
-      </w:tr>
-      <w:tr>
-        <w:tc>
-          <w:tcPr>
-            <w:tcW w:w="1975" w:type="dxa"/>
-          </w:tcPr>
-          <w:p>
-            <w:pPr>
-              <w:spacing w:line="360" w:lineRule="auto"/>
-              <w:jc w:val="center"/>
-              <w:rPr>
-                <w:rFonts w:ascii="Times New Roman" w:hAnsi="Times New Roman" w:cs="Times New Roman"/>
-              </w:rPr>
-            </w:pPr>
-            <w:r>
-              <w:rPr>
-                <w:rFonts w:ascii="Times New Roman" w:hAnsi="Times New Roman" w:cs="Times New Roman"/>
-              </w:rPr>
               <w:t>03/23 – 03/28</w:t>
             </w:r>
           </w:p>
@@ -2839,7 +2867,7 @@
           </w:tcPr>
           <w:p>
             <w:pPr>
-              <w:pStyle w:val="Prrafodelista"/>
+              <w:pStyle w:val="ListParagraph"/>
               <w:numPr>
                 <w:ilvl w:val="0"/>
                 <w:numId w:val="1"/>
@@ -2858,7 +2886,7 @@
           </w:p>
           <w:p>
             <w:pPr>
-              <w:pStyle w:val="Prrafodelista"/>
+              <w:pStyle w:val="ListParagraph"/>
               <w:numPr>
                 <w:ilvl w:val="0"/>
                 <w:numId w:val="1"/>
@@ -2874,13 +2902,12 @@
                 <w:kern w:val="0"/>
                 <w14:ligatures w14:val="none"/>
               </w:rPr>
-              <w:lastRenderedPageBreak/>
               <w:t>2.83 hours Creating GUI draft pages (03/25)</w:t>
             </w:r>
           </w:p>
           <w:p>
             <w:pPr>
-              <w:pStyle w:val="Prrafodelista"/>
+              <w:pStyle w:val="ListParagraph"/>
               <w:numPr>
                 <w:ilvl w:val="0"/>
                 <w:numId w:val="1"/>
@@ -2923,7 +2950,6 @@
               <w:rPr>
                 <w:rFonts w:ascii="Times New Roman" w:hAnsi="Times New Roman" w:cs="Times New Roman"/>
               </w:rPr>
-              <w:lastRenderedPageBreak/>
               <w:t>03/30 – 04/04</w:t>
             </w:r>
           </w:p>
@@ -2934,11 +2960,22 @@
           </w:tcPr>
           <w:p>
             <w:pPr>
-              <w:spacing w:line="360" w:lineRule="auto"/>
-              <w:rPr>
-                <w:rFonts w:ascii="Times New Roman" w:hAnsi="Times New Roman" w:cs="Times New Roman"/>
-              </w:rPr>
-            </w:pPr>
+              <w:pStyle w:val="ListParagraph"/>
+              <w:numPr>
+                <w:ilvl w:val="0"/>
+                <w:numId w:val="1"/>
+              </w:numPr>
+              <w:spacing w:line="360" w:lineRule="auto"/>
+              <w:rPr>
+                <w:rFonts w:ascii="Times New Roman" w:hAnsi="Times New Roman" w:cs="Times New Roman"/>
+              </w:rPr>
+            </w:pPr>
+            <w:r>
+              <w:rPr>
+                <w:rFonts w:ascii="Times New Roman" w:hAnsi="Times New Roman" w:cs="Times New Roman"/>
+              </w:rPr>
+              <w:t>1.5 hours on virtual meeting and coding for remaining modules (04/01)</w:t>
+            </w:r>
           </w:p>
         </w:tc>
       </w:tr>
@@ -3100,7 +3137,7 @@
     <w:sdtContent>
       <w:p>
         <w:pPr>
-          <w:pStyle w:val="Encabezado"/>
+          <w:pStyle w:val="Header"/>
           <w:jc w:val="right"/>
         </w:pPr>
         <w:r>
@@ -3114,7 +3151,7 @@
   </w:sdt>
   <w:p>
     <w:pPr>
-      <w:pStyle w:val="Encabezado"/>
+      <w:pStyle w:val="Header"/>
     </w:pPr>
   </w:p>
 </w:hdr>
@@ -3240,15 +3277,6 @@
   </w:num>
   <w:num w:numId="2" w16cid:durableId="445195328">
     <w:abstractNumId w:val="0"/>
-    <w:lvlOverride w:ilvl="0"/>
-    <w:lvlOverride w:ilvl="1"/>
-    <w:lvlOverride w:ilvl="2"/>
-    <w:lvlOverride w:ilvl="3"/>
-    <w:lvlOverride w:ilvl="4"/>
-    <w:lvlOverride w:ilvl="5"/>
-    <w:lvlOverride w:ilvl="6"/>
-    <w:lvlOverride w:ilvl="7"/>
-    <w:lvlOverride w:ilvl="8"/>
   </w:num>
 </w:numbering>
 </file>
@@ -3654,11 +3682,11 @@
     <w:name w:val="Normal"/>
     <w:qFormat/>
   </w:style>
-  <w:style w:type="paragraph" w:styleId="Ttulo1">
+  <w:style w:type="paragraph" w:styleId="Heading1">
     <w:name w:val="heading 1"/>
     <w:basedOn w:val="Normal"/>
     <w:next w:val="Normal"/>
-    <w:link w:val="Ttulo1Car"/>
+    <w:link w:val="Heading1Char"/>
     <w:uiPriority w:val="9"/>
     <w:qFormat/>
     <w:rsid w:val="001A62EF"/>
@@ -3675,11 +3703,11 @@
       <w:szCs w:val="40"/>
     </w:rPr>
   </w:style>
-  <w:style w:type="paragraph" w:styleId="Ttulo2">
+  <w:style w:type="paragraph" w:styleId="Heading2">
     <w:name w:val="heading 2"/>
     <w:basedOn w:val="Normal"/>
     <w:next w:val="Normal"/>
-    <w:link w:val="Ttulo2Car"/>
+    <w:link w:val="Heading2Char"/>
     <w:uiPriority w:val="9"/>
     <w:semiHidden/>
     <w:unhideWhenUsed/>
@@ -3698,11 +3726,11 @@
       <w:szCs w:val="32"/>
     </w:rPr>
   </w:style>
-  <w:style w:type="paragraph" w:styleId="Ttulo3">
+  <w:style w:type="paragraph" w:styleId="Heading3">
     <w:name w:val="heading 3"/>
     <w:basedOn w:val="Normal"/>
     <w:next w:val="Normal"/>
-    <w:link w:val="Ttulo3Car"/>
+    <w:link w:val="Heading3Char"/>
     <w:uiPriority w:val="9"/>
     <w:semiHidden/>
     <w:unhideWhenUsed/>
@@ -3721,11 +3749,11 @@
       <w:szCs w:val="28"/>
     </w:rPr>
   </w:style>
-  <w:style w:type="paragraph" w:styleId="Ttulo4">
+  <w:style w:type="paragraph" w:styleId="Heading4">
     <w:name w:val="heading 4"/>
     <w:basedOn w:val="Normal"/>
     <w:next w:val="Normal"/>
-    <w:link w:val="Ttulo4Car"/>
+    <w:link w:val="Heading4Char"/>
     <w:uiPriority w:val="9"/>
     <w:semiHidden/>
     <w:unhideWhenUsed/>
@@ -3744,11 +3772,11 @@
       <w:color w:val="0F4761" w:themeColor="accent1" w:themeShade="BF"/>
     </w:rPr>
   </w:style>
-  <w:style w:type="paragraph" w:styleId="Ttulo5">
+  <w:style w:type="paragraph" w:styleId="Heading5">
     <w:name w:val="heading 5"/>
     <w:basedOn w:val="Normal"/>
     <w:next w:val="Normal"/>
-    <w:link w:val="Ttulo5Car"/>
+    <w:link w:val="Heading5Char"/>
     <w:uiPriority w:val="9"/>
     <w:semiHidden/>
     <w:unhideWhenUsed/>
@@ -3765,11 +3793,11 @@
       <w:color w:val="0F4761" w:themeColor="accent1" w:themeShade="BF"/>
     </w:rPr>
   </w:style>
-  <w:style w:type="paragraph" w:styleId="Ttulo6">
+  <w:style w:type="paragraph" w:styleId="Heading6">
     <w:name w:val="heading 6"/>
     <w:basedOn w:val="Normal"/>
     <w:next w:val="Normal"/>
-    <w:link w:val="Ttulo6Car"/>
+    <w:link w:val="Heading6Char"/>
     <w:uiPriority w:val="9"/>
     <w:semiHidden/>
     <w:unhideWhenUsed/>
@@ -3788,11 +3816,11 @@
       <w:color w:val="595959" w:themeColor="text1" w:themeTint="A6"/>
     </w:rPr>
   </w:style>
-  <w:style w:type="paragraph" w:styleId="Ttulo7">
+  <w:style w:type="paragraph" w:styleId="Heading7">
     <w:name w:val="heading 7"/>
     <w:basedOn w:val="Normal"/>
     <w:next w:val="Normal"/>
-    <w:link w:val="Ttulo7Car"/>
+    <w:link w:val="Heading7Char"/>
     <w:uiPriority w:val="9"/>
     <w:semiHidden/>
     <w:unhideWhenUsed/>
@@ -3809,11 +3837,11 @@
       <w:color w:val="595959" w:themeColor="text1" w:themeTint="A6"/>
     </w:rPr>
   </w:style>
-  <w:style w:type="paragraph" w:styleId="Ttulo8">
+  <w:style w:type="paragraph" w:styleId="Heading8">
     <w:name w:val="heading 8"/>
     <w:basedOn w:val="Normal"/>
     <w:next w:val="Normal"/>
-    <w:link w:val="Ttulo8Car"/>
+    <w:link w:val="Heading8Char"/>
     <w:uiPriority w:val="9"/>
     <w:semiHidden/>
     <w:unhideWhenUsed/>
@@ -3832,11 +3860,11 @@
       <w:color w:val="272727" w:themeColor="text1" w:themeTint="D8"/>
     </w:rPr>
   </w:style>
-  <w:style w:type="paragraph" w:styleId="Ttulo9">
+  <w:style w:type="paragraph" w:styleId="Heading9">
     <w:name w:val="heading 9"/>
     <w:basedOn w:val="Normal"/>
     <w:next w:val="Normal"/>
-    <w:link w:val="Ttulo9Car"/>
+    <w:link w:val="Heading9Char"/>
     <w:uiPriority w:val="9"/>
     <w:semiHidden/>
     <w:unhideWhenUsed/>
@@ -3853,13 +3881,13 @@
       <w:color w:val="272727" w:themeColor="text1" w:themeTint="D8"/>
     </w:rPr>
   </w:style>
-  <w:style w:type="character" w:default="1" w:styleId="Fuentedeprrafopredeter">
+  <w:style w:type="character" w:default="1" w:styleId="DefaultParagraphFont">
     <w:name w:val="Default Paragraph Font"/>
     <w:uiPriority w:val="1"/>
     <w:semiHidden/>
     <w:unhideWhenUsed/>
   </w:style>
-  <w:style w:type="table" w:default="1" w:styleId="Tablanormal">
+  <w:style w:type="table" w:default="1" w:styleId="TableNormal">
     <w:name w:val="Normal Table"/>
     <w:uiPriority w:val="99"/>
     <w:semiHidden/>
@@ -3874,16 +3902,16 @@
       </w:tblCellMar>
     </w:tblPr>
   </w:style>
-  <w:style w:type="numbering" w:default="1" w:styleId="Sinlista">
+  <w:style w:type="numbering" w:default="1" w:styleId="NoList">
     <w:name w:val="No List"/>
     <w:uiPriority w:val="99"/>
     <w:semiHidden/>
     <w:unhideWhenUsed/>
   </w:style>
-  <w:style w:type="character" w:customStyle="1" w:styleId="Ttulo1Car">
-    <w:name w:val="Título 1 Car"/>
-    <w:basedOn w:val="Fuentedeprrafopredeter"/>
-    <w:link w:val="Ttulo1"/>
+  <w:style w:type="character" w:customStyle="1" w:styleId="Heading1Char">
+    <w:name w:val="Heading 1 Char"/>
+    <w:basedOn w:val="DefaultParagraphFont"/>
+    <w:link w:val="Heading1"/>
     <w:uiPriority w:val="9"/>
     <w:rsid w:val="001A62EF"/>
     <w:rPr>
@@ -3893,10 +3921,10 @@
       <w:szCs w:val="40"/>
     </w:rPr>
   </w:style>
-  <w:style w:type="character" w:customStyle="1" w:styleId="Ttulo2Car">
-    <w:name w:val="Título 2 Car"/>
-    <w:basedOn w:val="Fuentedeprrafopredeter"/>
-    <w:link w:val="Ttulo2"/>
+  <w:style w:type="character" w:customStyle="1" w:styleId="Heading2Char">
+    <w:name w:val="Heading 2 Char"/>
+    <w:basedOn w:val="DefaultParagraphFont"/>
+    <w:link w:val="Heading2"/>
     <w:uiPriority w:val="9"/>
     <w:semiHidden/>
     <w:rsid w:val="001A62EF"/>
@@ -3907,10 +3935,10 @@
       <w:szCs w:val="32"/>
     </w:rPr>
   </w:style>
-  <w:style w:type="character" w:customStyle="1" w:styleId="Ttulo3Car">
-    <w:name w:val="Título 3 Car"/>
-    <w:basedOn w:val="Fuentedeprrafopredeter"/>
-    <w:link w:val="Ttulo3"/>
+  <w:style w:type="character" w:customStyle="1" w:styleId="Heading3Char">
+    <w:name w:val="Heading 3 Char"/>
+    <w:basedOn w:val="DefaultParagraphFont"/>
+    <w:link w:val="Heading3"/>
     <w:uiPriority w:val="9"/>
     <w:semiHidden/>
     <w:rsid w:val="001A62EF"/>
@@ -3921,10 +3949,10 @@
       <w:szCs w:val="28"/>
     </w:rPr>
   </w:style>
-  <w:style w:type="character" w:customStyle="1" w:styleId="Ttulo4Car">
-    <w:name w:val="Título 4 Car"/>
-    <w:basedOn w:val="Fuentedeprrafopredeter"/>
-    <w:link w:val="Ttulo4"/>
+  <w:style w:type="character" w:customStyle="1" w:styleId="Heading4Char">
+    <w:name w:val="Heading 4 Char"/>
+    <w:basedOn w:val="DefaultParagraphFont"/>
+    <w:link w:val="Heading4"/>
     <w:uiPriority w:val="9"/>
     <w:semiHidden/>
     <w:rsid w:val="001A62EF"/>
@@ -3935,10 +3963,10 @@
       <w:color w:val="0F4761" w:themeColor="accent1" w:themeShade="BF"/>
     </w:rPr>
   </w:style>
-  <w:style w:type="character" w:customStyle="1" w:styleId="Ttulo5Car">
-    <w:name w:val="Título 5 Car"/>
-    <w:basedOn w:val="Fuentedeprrafopredeter"/>
-    <w:link w:val="Ttulo5"/>
+  <w:style w:type="character" w:customStyle="1" w:styleId="Heading5Char">
+    <w:name w:val="Heading 5 Char"/>
+    <w:basedOn w:val="DefaultParagraphFont"/>
+    <w:link w:val="Heading5"/>
     <w:uiPriority w:val="9"/>
     <w:semiHidden/>
     <w:rsid w:val="001A62EF"/>
@@ -3947,10 +3975,10 @@
       <w:color w:val="0F4761" w:themeColor="accent1" w:themeShade="BF"/>
     </w:rPr>
   </w:style>
-  <w:style w:type="character" w:customStyle="1" w:styleId="Ttulo6Car">
-    <w:name w:val="Título 6 Car"/>
-    <w:basedOn w:val="Fuentedeprrafopredeter"/>
-    <w:link w:val="Ttulo6"/>
+  <w:style w:type="character" w:customStyle="1" w:styleId="Heading6Char">
+    <w:name w:val="Heading 6 Char"/>
+    <w:basedOn w:val="DefaultParagraphFont"/>
+    <w:link w:val="Heading6"/>
     <w:uiPriority w:val="9"/>
     <w:semiHidden/>
     <w:rsid w:val="001A62EF"/>
@@ -3961,10 +3989,10 @@
       <w:color w:val="595959" w:themeColor="text1" w:themeTint="A6"/>
     </w:rPr>
   </w:style>
-  <w:style w:type="character" w:customStyle="1" w:styleId="Ttulo7Car">
-    <w:name w:val="Título 7 Car"/>
-    <w:basedOn w:val="Fuentedeprrafopredeter"/>
-    <w:link w:val="Ttulo7"/>
+  <w:style w:type="character" w:customStyle="1" w:styleId="Heading7Char">
+    <w:name w:val="Heading 7 Char"/>
+    <w:basedOn w:val="DefaultParagraphFont"/>
+    <w:link w:val="Heading7"/>
     <w:uiPriority w:val="9"/>
     <w:semiHidden/>
     <w:rsid w:val="001A62EF"/>
@@ -3973,10 +4001,10 @@
       <w:color w:val="595959" w:themeColor="text1" w:themeTint="A6"/>
     </w:rPr>
   </w:style>
-  <w:style w:type="character" w:customStyle="1" w:styleId="Ttulo8Car">
-    <w:name w:val="Título 8 Car"/>
-    <w:basedOn w:val="Fuentedeprrafopredeter"/>
-    <w:link w:val="Ttulo8"/>
+  <w:style w:type="character" w:customStyle="1" w:styleId="Heading8Char">
+    <w:name w:val="Heading 8 Char"/>
+    <w:basedOn w:val="DefaultParagraphFont"/>
+    <w:link w:val="Heading8"/>
     <w:uiPriority w:val="9"/>
     <w:semiHidden/>
     <w:rsid w:val="001A62EF"/>
@@ -3987,10 +4015,10 @@
       <w:color w:val="272727" w:themeColor="text1" w:themeTint="D8"/>
     </w:rPr>
   </w:style>
-  <w:style w:type="character" w:customStyle="1" w:styleId="Ttulo9Car">
-    <w:name w:val="Título 9 Car"/>
-    <w:basedOn w:val="Fuentedeprrafopredeter"/>
-    <w:link w:val="Ttulo9"/>
+  <w:style w:type="character" w:customStyle="1" w:styleId="Heading9Char">
+    <w:name w:val="Heading 9 Char"/>
+    <w:basedOn w:val="DefaultParagraphFont"/>
+    <w:link w:val="Heading9"/>
     <w:uiPriority w:val="9"/>
     <w:semiHidden/>
     <w:rsid w:val="001A62EF"/>
@@ -3999,11 +4027,11 @@
       <w:color w:val="272727" w:themeColor="text1" w:themeTint="D8"/>
     </w:rPr>
   </w:style>
-  <w:style w:type="paragraph" w:styleId="Ttulo">
+  <w:style w:type="paragraph" w:styleId="Title">
     <w:name w:val="Title"/>
     <w:basedOn w:val="Normal"/>
     <w:next w:val="Normal"/>
-    <w:link w:val="TtuloCar"/>
+    <w:link w:val="TitleChar"/>
     <w:uiPriority w:val="10"/>
     <w:qFormat/>
     <w:rsid w:val="001A62EF"/>
@@ -4019,10 +4047,10 @@
       <w:szCs w:val="56"/>
     </w:rPr>
   </w:style>
-  <w:style w:type="character" w:customStyle="1" w:styleId="TtuloCar">
-    <w:name w:val="Título Car"/>
-    <w:basedOn w:val="Fuentedeprrafopredeter"/>
-    <w:link w:val="Ttulo"/>
+  <w:style w:type="character" w:customStyle="1" w:styleId="TitleChar">
+    <w:name w:val="Title Char"/>
+    <w:basedOn w:val="DefaultParagraphFont"/>
+    <w:link w:val="Title"/>
     <w:uiPriority w:val="10"/>
     <w:rsid w:val="001A62EF"/>
     <w:rPr>
@@ -4033,11 +4061,11 @@
       <w:szCs w:val="56"/>
     </w:rPr>
   </w:style>
-  <w:style w:type="paragraph" w:styleId="Subttulo">
+  <w:style w:type="paragraph" w:styleId="Subtitle">
     <w:name w:val="Subtitle"/>
     <w:basedOn w:val="Normal"/>
     <w:next w:val="Normal"/>
-    <w:link w:val="SubttuloCar"/>
+    <w:link w:val="SubtitleChar"/>
     <w:uiPriority w:val="11"/>
     <w:qFormat/>
     <w:rsid w:val="001A62EF"/>
@@ -4054,10 +4082,10 @@
       <w:szCs w:val="28"/>
     </w:rPr>
   </w:style>
-  <w:style w:type="character" w:customStyle="1" w:styleId="SubttuloCar">
-    <w:name w:val="Subtítulo Car"/>
-    <w:basedOn w:val="Fuentedeprrafopredeter"/>
-    <w:link w:val="Subttulo"/>
+  <w:style w:type="character" w:customStyle="1" w:styleId="SubtitleChar">
+    <w:name w:val="Subtitle Char"/>
+    <w:basedOn w:val="DefaultParagraphFont"/>
+    <w:link w:val="Subtitle"/>
     <w:uiPriority w:val="11"/>
     <w:rsid w:val="001A62EF"/>
     <w:rPr>
@@ -4068,11 +4096,11 @@
       <w:szCs w:val="28"/>
     </w:rPr>
   </w:style>
-  <w:style w:type="paragraph" w:styleId="Cita">
+  <w:style w:type="paragraph" w:styleId="Quote">
     <w:name w:val="Quote"/>
     <w:basedOn w:val="Normal"/>
     <w:next w:val="Normal"/>
-    <w:link w:val="CitaCar"/>
+    <w:link w:val="QuoteChar"/>
     <w:uiPriority w:val="29"/>
     <w:qFormat/>
     <w:rsid w:val="001A62EF"/>
@@ -4086,10 +4114,10 @@
       <w:color w:val="404040" w:themeColor="text1" w:themeTint="BF"/>
     </w:rPr>
   </w:style>
-  <w:style w:type="character" w:customStyle="1" w:styleId="CitaCar">
-    <w:name w:val="Cita Car"/>
-    <w:basedOn w:val="Fuentedeprrafopredeter"/>
-    <w:link w:val="Cita"/>
+  <w:style w:type="character" w:customStyle="1" w:styleId="QuoteChar">
+    <w:name w:val="Quote Char"/>
+    <w:basedOn w:val="DefaultParagraphFont"/>
+    <w:link w:val="Quote"/>
     <w:uiPriority w:val="29"/>
     <w:rsid w:val="001A62EF"/>
     <w:rPr>
@@ -4098,7 +4126,7 @@
       <w:color w:val="404040" w:themeColor="text1" w:themeTint="BF"/>
     </w:rPr>
   </w:style>
-  <w:style w:type="paragraph" w:styleId="Prrafodelista">
+  <w:style w:type="paragraph" w:styleId="ListParagraph">
     <w:name w:val="List Paragraph"/>
     <w:basedOn w:val="Normal"/>
     <w:uiPriority w:val="34"/>
@@ -4109,9 +4137,9 @@
       <w:contextualSpacing/>
     </w:pPr>
   </w:style>
-  <w:style w:type="character" w:styleId="nfasisintenso">
+  <w:style w:type="character" w:styleId="IntenseEmphasis">
     <w:name w:val="Intense Emphasis"/>
-    <w:basedOn w:val="Fuentedeprrafopredeter"/>
+    <w:basedOn w:val="DefaultParagraphFont"/>
     <w:uiPriority w:val="21"/>
     <w:qFormat/>
     <w:rsid w:val="001A62EF"/>
@@ -4121,11 +4149,11 @@
       <w:color w:val="0F4761" w:themeColor="accent1" w:themeShade="BF"/>
     </w:rPr>
   </w:style>
-  <w:style w:type="paragraph" w:styleId="Citadestacada">
+  <w:style w:type="paragraph" w:styleId="IntenseQuote">
     <w:name w:val="Intense Quote"/>
     <w:basedOn w:val="Normal"/>
     <w:next w:val="Normal"/>
-    <w:link w:val="CitadestacadaCar"/>
+    <w:link w:val="IntenseQuoteChar"/>
     <w:uiPriority w:val="30"/>
     <w:qFormat/>
     <w:rsid w:val="001A62EF"/>
@@ -4144,10 +4172,10 @@
       <w:color w:val="0F4761" w:themeColor="accent1" w:themeShade="BF"/>
     </w:rPr>
   </w:style>
-  <w:style w:type="character" w:customStyle="1" w:styleId="CitadestacadaCar">
-    <w:name w:val="Cita destacada Car"/>
-    <w:basedOn w:val="Fuentedeprrafopredeter"/>
-    <w:link w:val="Citadestacada"/>
+  <w:style w:type="character" w:customStyle="1" w:styleId="IntenseQuoteChar">
+    <w:name w:val="Intense Quote Char"/>
+    <w:basedOn w:val="DefaultParagraphFont"/>
+    <w:link w:val="IntenseQuote"/>
     <w:uiPriority w:val="30"/>
     <w:rsid w:val="001A62EF"/>
     <w:rPr>
@@ -4156,9 +4184,9 @@
       <w:color w:val="0F4761" w:themeColor="accent1" w:themeShade="BF"/>
     </w:rPr>
   </w:style>
-  <w:style w:type="character" w:styleId="Referenciaintensa">
+  <w:style w:type="character" w:styleId="IntenseReference">
     <w:name w:val="Intense Reference"/>
-    <w:basedOn w:val="Fuentedeprrafopredeter"/>
+    <w:basedOn w:val="DefaultParagraphFont"/>
     <w:uiPriority w:val="32"/>
     <w:qFormat/>
     <w:rsid w:val="001A62EF"/>
@@ -4170,9 +4198,9 @@
       <w:spacing w:val="5"/>
     </w:rPr>
   </w:style>
-  <w:style w:type="table" w:styleId="Tablaconcuadrcula">
+  <w:style w:type="table" w:styleId="TableGrid">
     <w:name w:val="Table Grid"/>
-    <w:basedOn w:val="Tablanormal"/>
+    <w:basedOn w:val="TableNormal"/>
     <w:uiPriority w:val="39"/>
     <w:rsid w:val="0045417D"/>
     <w:pPr>
@@ -4189,7 +4217,7 @@
       </w:tblBorders>
     </w:tblPr>
   </w:style>
-  <w:style w:type="paragraph" w:styleId="Revisin">
+  <w:style w:type="paragraph" w:styleId="Revision">
     <w:name w:val="Revision"/>
     <w:hidden/>
     <w:uiPriority w:val="99"/>
@@ -4199,10 +4227,10 @@
       <w:spacing w:after="0" w:line="240" w:lineRule="auto"/>
     </w:pPr>
   </w:style>
-  <w:style w:type="paragraph" w:styleId="Encabezado">
+  <w:style w:type="paragraph" w:styleId="Header">
     <w:name w:val="header"/>
     <w:basedOn w:val="Normal"/>
-    <w:link w:val="EncabezadoCar"/>
+    <w:link w:val="HeaderChar"/>
     <w:uiPriority w:val="99"/>
     <w:unhideWhenUsed/>
     <w:rsid w:val="002818BE"/>
@@ -4214,17 +4242,17 @@
       <w:spacing w:after="0" w:line="240" w:lineRule="auto"/>
     </w:pPr>
   </w:style>
-  <w:style w:type="character" w:customStyle="1" w:styleId="EncabezadoCar">
-    <w:name w:val="Encabezado Car"/>
-    <w:basedOn w:val="Fuentedeprrafopredeter"/>
-    <w:link w:val="Encabezado"/>
+  <w:style w:type="character" w:customStyle="1" w:styleId="HeaderChar">
+    <w:name w:val="Header Char"/>
+    <w:basedOn w:val="DefaultParagraphFont"/>
+    <w:link w:val="Header"/>
     <w:uiPriority w:val="99"/>
     <w:rsid w:val="002818BE"/>
   </w:style>
-  <w:style w:type="paragraph" w:styleId="Piedepgina">
+  <w:style w:type="paragraph" w:styleId="Footer">
     <w:name w:val="footer"/>
     <w:basedOn w:val="Normal"/>
-    <w:link w:val="PiedepginaCar"/>
+    <w:link w:val="FooterChar"/>
     <w:uiPriority w:val="99"/>
     <w:unhideWhenUsed/>
     <w:rsid w:val="002818BE"/>
@@ -4236,10 +4264,10 @@
       <w:spacing w:after="0" w:line="240" w:lineRule="auto"/>
     </w:pPr>
   </w:style>
-  <w:style w:type="character" w:customStyle="1" w:styleId="PiedepginaCar">
-    <w:name w:val="Pie de página Car"/>
-    <w:basedOn w:val="Fuentedeprrafopredeter"/>
-    <w:link w:val="Piedepgina"/>
+  <w:style w:type="character" w:customStyle="1" w:styleId="FooterChar">
+    <w:name w:val="Footer Char"/>
+    <w:basedOn w:val="DefaultParagraphFont"/>
+    <w:link w:val="Footer"/>
     <w:uiPriority w:val="99"/>
     <w:rsid w:val="002818BE"/>
   </w:style>

</xml_diff>